<commit_message>
build: rebuild academic proposal via academic-docx-builder skill exactly 6 pages
</commit_message>
<xml_diff>
--- a/docs/TimKilasTugas_KilasTugas_ProposalRingkas.docx
+++ b/docs/TimKilasTugas_KilasTugas_ProposalRingkas.docx
@@ -4,20 +4,12 @@
   <w:body>
     <w:p>
       <w:pPr>
-        <w:spacing w:after="480" w:line="269" w:lineRule="auto"/>
-        <w:jc w:val="both"/>
-      </w:pPr>
-    </w:p>
-    <w:p>
-      <w:pPr>
-        <w:spacing w:after="80" w:line="269" w:lineRule="auto"/>
+        <w:spacing w:before="480" w:after="40" w:line="276" w:lineRule="auto"/>
         <w:jc w:val="center"/>
       </w:pPr>
       <w:r>
         <w:rPr>
-          <w:rFonts w:ascii="Times New Roman" w:hAnsi="Times New Roman"/>
           <w:b/>
-          <w:color w:val="18181B"/>
           <w:sz w:val="28"/>
         </w:rPr>
         <w:t>PROPOSAL RINGKAS INOVASI DIGITAL</w:t>
@@ -25,14 +17,12 @@
     </w:p>
     <w:p>
       <w:pPr>
-        <w:spacing w:after="560" w:line="269" w:lineRule="auto"/>
+        <w:spacing w:after="560" w:line="276" w:lineRule="auto"/>
         <w:jc w:val="center"/>
       </w:pPr>
       <w:r>
         <w:rPr>
-          <w:rFonts w:ascii="Times New Roman" w:hAnsi="Times New Roman"/>
           <w:b/>
-          <w:color w:val="18181B"/>
           <w:sz w:val="24"/>
         </w:rPr>
         <w:t>SIFest Digital Innovation Challenge 2026: Track Education</w:t>
@@ -40,7 +30,20 @@
     </w:p>
     <w:p>
       <w:pPr>
-        <w:spacing w:after="480"/>
+        <w:spacing w:after="80" w:line="276" w:lineRule="auto"/>
+        <w:jc w:val="center"/>
+      </w:pPr>
+      <w:r>
+        <w:rPr>
+          <w:b/>
+          <w:sz w:val="40"/>
+        </w:rPr>
+        <w:t>KILASTUGAS</w:t>
+      </w:r>
+    </w:p>
+    <w:p>
+      <w:pPr>
+        <w:spacing w:after="400"/>
         <w:jc w:val="center"/>
       </w:pPr>
       <w:r>
@@ -48,7 +51,7 @@
           <w:noProof/>
         </w:rPr>
         <w:drawing>
-          <wp:inline distT="0" distB="0" distL="0" distR="0" wp14:anchorId="77B5B5E3" wp14:editId="110FB051">
+          <wp:inline distT="0" distB="0" distL="0" distR="0" wp14:anchorId="0CAB9B5D" wp14:editId="2E73F077">
             <wp:extent cx="1645920" cy="1645920"/>
             <wp:effectExtent l="0" t="0" r="0" b="0"/>
             <wp:docPr id="1" name="Picture 1"/>
@@ -86,67 +89,121 @@
     </w:p>
     <w:p>
       <w:pPr>
-        <w:spacing w:after="120" w:line="269" w:lineRule="auto"/>
+        <w:spacing w:before="40" w:after="40" w:line="276" w:lineRule="auto"/>
         <w:jc w:val="center"/>
       </w:pPr>
       <w:r>
         <w:rPr>
-          <w:rFonts w:ascii="Times New Roman" w:hAnsi="Times New Roman"/>
-          <w:b/>
-          <w:color w:val="18181B"/>
-          <w:sz w:val="40"/>
+          <w:i/>
         </w:rPr>
-        <w:t>KILASTUGAS</w:t>
+        <w:t>Smart Actionable Task Breakdown &amp; Micro-Pacing for Students</w:t>
       </w:r>
     </w:p>
     <w:p>
       <w:pPr>
-        <w:spacing w:after="160" w:line="269" w:lineRule="auto"/>
+        <w:spacing w:after="60"/>
         <w:jc w:val="center"/>
       </w:pPr>
       <w:r>
         <w:rPr>
-          <w:rFonts w:ascii="Times New Roman" w:hAnsi="Times New Roman"/>
           <w:b/>
-          <w:i/>
-          <w:color w:val="18181B"/>
-          <w:sz w:val="24"/>
         </w:rPr>
-        <w:t>Smart Actionable Task Breakdown &amp; Micro-Pacing for Students</w:t>
+        <w:t>"Ubah Beban Tugas Kompleks Menjadi Aksi Harian yang Jelas, Ringan, dan Tereksekusi"</w:t>
       </w:r>
     </w:p>
     <w:p>
       <w:pPr>
-        <w:spacing w:after="720" w:line="269" w:lineRule="auto"/>
+        <w:spacing w:before="400" w:after="80" w:line="276" w:lineRule="auto"/>
         <w:jc w:val="center"/>
       </w:pPr>
       <w:r>
         <w:rPr>
-          <w:rFonts w:ascii="Times New Roman" w:hAnsi="Times New Roman"/>
-          <w:i/>
-          <w:color w:val="18181B"/>
+          <w:b/>
         </w:rPr>
-        <w:t>"Ubah Beban Tugas Kompleks Menjadi Aksi Harian yang Jelas, Ringan, dan Tereksekusi"</w:t>
-      </w:r>
+        <w:t>INFORMASI TIM &amp; PRODUK</w:t>
+      </w:r>
+    </w:p>
+    <w:p>
+      <w:pPr>
+        <w:spacing w:after="60" w:line="240" w:lineRule="auto"/>
+      </w:pPr>
     </w:p>
     <w:tbl>
       <w:tblPr>
         <w:tblW w:w="0" w:type="auto"/>
         <w:jc w:val="center"/>
         <w:tblBorders>
-          <w:top w:val="single" w:sz="4" w:space="0" w:color="71717A"/>
-          <w:left w:val="single" w:sz="4" w:space="0" w:color="71717A"/>
-          <w:bottom w:val="single" w:sz="4" w:space="0" w:color="71717A"/>
-          <w:right w:val="single" w:sz="4" w:space="0" w:color="71717A"/>
-          <w:insideH w:val="single" w:sz="4" w:space="0" w:color="71717A"/>
-          <w:insideV w:val="single" w:sz="4" w:space="0" w:color="71717A"/>
+          <w:top w:val="single" w:sz="4" w:space="0" w:color="000000"/>
+          <w:left w:val="single" w:sz="4" w:space="0" w:color="000000"/>
+          <w:bottom w:val="single" w:sz="4" w:space="0" w:color="000000"/>
+          <w:right w:val="single" w:sz="4" w:space="0" w:color="000000"/>
+          <w:insideH w:val="single" w:sz="4" w:space="0" w:color="000000"/>
+          <w:insideV w:val="single" w:sz="4" w:space="0" w:color="000000"/>
         </w:tblBorders>
+        <w:tblLayout w:type="fixed"/>
         <w:tblLook w:val="04A0" w:firstRow="1" w:lastRow="0" w:firstColumn="1" w:lastColumn="0" w:noHBand="0" w:noVBand="1"/>
       </w:tblPr>
       <w:tblGrid>
-        <w:gridCol w:w="1049"/>
-        <w:gridCol w:w="6076"/>
+        <w:gridCol w:w="2362"/>
+        <w:gridCol w:w="6595"/>
       </w:tblGrid>
+      <w:tr>
+        <w:trPr>
+          <w:cantSplit/>
+          <w:tblHeader/>
+          <w:jc w:val="center"/>
+        </w:trPr>
+        <w:tc>
+          <w:tcPr>
+            <w:tcW w:w="2362" w:type="dxa"/>
+            <w:shd w:val="clear" w:color="auto" w:fill="F4F4F5"/>
+            <w:tcMar>
+              <w:top w:w="30" w:type="dxa"/>
+              <w:left w:w="60" w:type="dxa"/>
+              <w:bottom w:w="30" w:type="dxa"/>
+              <w:right w:w="60" w:type="dxa"/>
+            </w:tcMar>
+          </w:tcPr>
+          <w:p>
+            <w:pPr>
+              <w:spacing w:after="0" w:line="240" w:lineRule="auto"/>
+              <w:jc w:val="center"/>
+            </w:pPr>
+            <w:r>
+              <w:rPr>
+                <w:b/>
+                <w:sz w:val="19"/>
+              </w:rPr>
+              <w:t>Komponen</w:t>
+            </w:r>
+          </w:p>
+        </w:tc>
+        <w:tc>
+          <w:tcPr>
+            <w:tcW w:w="6595" w:type="dxa"/>
+            <w:shd w:val="clear" w:color="auto" w:fill="F4F4F5"/>
+            <w:tcMar>
+              <w:top w:w="30" w:type="dxa"/>
+              <w:left w:w="60" w:type="dxa"/>
+              <w:bottom w:w="30" w:type="dxa"/>
+              <w:right w:w="60" w:type="dxa"/>
+            </w:tcMar>
+          </w:tcPr>
+          <w:p>
+            <w:pPr>
+              <w:spacing w:after="0" w:line="240" w:lineRule="auto"/>
+              <w:jc w:val="center"/>
+            </w:pPr>
+            <w:r>
+              <w:rPr>
+                <w:b/>
+                <w:sz w:val="19"/>
+              </w:rPr>
+              <w:t>Keterangan</w:t>
+            </w:r>
+          </w:p>
+        </w:tc>
+      </w:tr>
       <w:tr>
         <w:trPr>
           <w:cantSplit/>
@@ -154,13 +211,12 @@
         </w:trPr>
         <w:tc>
           <w:tcPr>
-            <w:tcW w:w="4" w:type="dxa"/>
-            <w:shd w:val="clear" w:color="auto" w:fill="F4F4F5"/>
+            <w:tcW w:w="2362" w:type="dxa"/>
             <w:tcMar>
-              <w:top w:w="40" w:type="dxa"/>
-              <w:left w:w="80" w:type="dxa"/>
-              <w:bottom w:w="40" w:type="dxa"/>
-              <w:right w:w="80" w:type="dxa"/>
+              <w:top w:w="30" w:type="dxa"/>
+              <w:left w:w="60" w:type="dxa"/>
+              <w:bottom w:w="30" w:type="dxa"/>
+              <w:right w:w="60" w:type="dxa"/>
             </w:tcMar>
           </w:tcPr>
           <w:p>
@@ -169,10 +225,8 @@
             </w:pPr>
             <w:r>
               <w:rPr>
-                <w:rFonts w:ascii="Times New Roman" w:hAnsi="Times New Roman"/>
                 <w:b/>
-                <w:color w:val="000000"/>
-                <w:sz w:val="20"/>
+                <w:sz w:val="19"/>
               </w:rPr>
               <w:t>Nama Tim</w:t>
             </w:r>
@@ -180,12 +234,12 @@
         </w:tc>
         <w:tc>
           <w:tcPr>
-            <w:tcW w:w="10" w:type="dxa"/>
+            <w:tcW w:w="6595" w:type="dxa"/>
             <w:tcMar>
-              <w:top w:w="40" w:type="dxa"/>
-              <w:left w:w="80" w:type="dxa"/>
-              <w:bottom w:w="40" w:type="dxa"/>
-              <w:right w:w="80" w:type="dxa"/>
+              <w:top w:w="30" w:type="dxa"/>
+              <w:left w:w="60" w:type="dxa"/>
+              <w:bottom w:w="30" w:type="dxa"/>
+              <w:right w:w="60" w:type="dxa"/>
             </w:tcMar>
           </w:tcPr>
           <w:p>
@@ -194,9 +248,7 @@
             </w:pPr>
             <w:r>
               <w:rPr>
-                <w:rFonts w:ascii="Times New Roman" w:hAnsi="Times New Roman"/>
-                <w:color w:val="000000"/>
-                <w:sz w:val="20"/>
+                <w:sz w:val="19"/>
               </w:rPr>
               <w:t>Tim KilasTugas</w:t>
             </w:r>
@@ -210,13 +262,12 @@
         </w:trPr>
         <w:tc>
           <w:tcPr>
-            <w:tcW w:w="4" w:type="dxa"/>
-            <w:shd w:val="clear" w:color="auto" w:fill="F4F4F5"/>
+            <w:tcW w:w="2362" w:type="dxa"/>
             <w:tcMar>
-              <w:top w:w="40" w:type="dxa"/>
-              <w:left w:w="80" w:type="dxa"/>
-              <w:bottom w:w="40" w:type="dxa"/>
-              <w:right w:w="80" w:type="dxa"/>
+              <w:top w:w="30" w:type="dxa"/>
+              <w:left w:w="60" w:type="dxa"/>
+              <w:bottom w:w="30" w:type="dxa"/>
+              <w:right w:w="60" w:type="dxa"/>
             </w:tcMar>
           </w:tcPr>
           <w:p>
@@ -225,23 +276,21 @@
             </w:pPr>
             <w:r>
               <w:rPr>
-                <w:rFonts w:ascii="Times New Roman" w:hAnsi="Times New Roman"/>
                 <w:b/>
-                <w:color w:val="000000"/>
-                <w:sz w:val="20"/>
+                <w:sz w:val="19"/>
               </w:rPr>
-              <w:t>Ketua Tim</w:t>
+              <w:t>Ketua Tim (Team Leader)</w:t>
             </w:r>
           </w:p>
         </w:tc>
         <w:tc>
           <w:tcPr>
-            <w:tcW w:w="10" w:type="dxa"/>
+            <w:tcW w:w="6595" w:type="dxa"/>
             <w:tcMar>
-              <w:top w:w="40" w:type="dxa"/>
-              <w:left w:w="80" w:type="dxa"/>
-              <w:bottom w:w="40" w:type="dxa"/>
-              <w:right w:w="80" w:type="dxa"/>
+              <w:top w:w="30" w:type="dxa"/>
+              <w:left w:w="60" w:type="dxa"/>
+              <w:bottom w:w="30" w:type="dxa"/>
+              <w:right w:w="60" w:type="dxa"/>
             </w:tcMar>
           </w:tcPr>
           <w:p>
@@ -250,9 +299,7 @@
             </w:pPr>
             <w:r>
               <w:rPr>
-                <w:rFonts w:ascii="Times New Roman" w:hAnsi="Times New Roman"/>
-                <w:color w:val="000000"/>
-                <w:sz w:val="20"/>
+                <w:sz w:val="19"/>
               </w:rPr>
               <w:t>Adridinan Najmi Faza (Informatika, Universitas Jenderal Soedirman)</w:t>
             </w:r>
@@ -266,13 +313,12 @@
         </w:trPr>
         <w:tc>
           <w:tcPr>
-            <w:tcW w:w="4" w:type="dxa"/>
-            <w:shd w:val="clear" w:color="auto" w:fill="F4F4F5"/>
+            <w:tcW w:w="2362" w:type="dxa"/>
             <w:tcMar>
-              <w:top w:w="40" w:type="dxa"/>
-              <w:left w:w="80" w:type="dxa"/>
-              <w:bottom w:w="40" w:type="dxa"/>
-              <w:right w:w="80" w:type="dxa"/>
+              <w:top w:w="30" w:type="dxa"/>
+              <w:left w:w="60" w:type="dxa"/>
+              <w:bottom w:w="30" w:type="dxa"/>
+              <w:right w:w="60" w:type="dxa"/>
             </w:tcMar>
           </w:tcPr>
           <w:p>
@@ -281,10 +327,8 @@
             </w:pPr>
             <w:r>
               <w:rPr>
-                <w:rFonts w:ascii="Times New Roman" w:hAnsi="Times New Roman"/>
                 <w:b/>
-                <w:color w:val="000000"/>
-                <w:sz w:val="20"/>
+                <w:sz w:val="19"/>
               </w:rPr>
               <w:t>Anggota Tim</w:t>
             </w:r>
@@ -292,12 +336,12 @@
         </w:tc>
         <w:tc>
           <w:tcPr>
-            <w:tcW w:w="10" w:type="dxa"/>
+            <w:tcW w:w="6595" w:type="dxa"/>
             <w:tcMar>
-              <w:top w:w="40" w:type="dxa"/>
-              <w:left w:w="80" w:type="dxa"/>
-              <w:bottom w:w="40" w:type="dxa"/>
-              <w:right w:w="80" w:type="dxa"/>
+              <w:top w:w="30" w:type="dxa"/>
+              <w:left w:w="60" w:type="dxa"/>
+              <w:bottom w:w="30" w:type="dxa"/>
+              <w:right w:w="60" w:type="dxa"/>
             </w:tcMar>
           </w:tcPr>
           <w:p>
@@ -306,25 +350,18 @@
             </w:pPr>
             <w:r>
               <w:rPr>
-                <w:rFonts w:ascii="Times New Roman" w:hAnsi="Times New Roman"/>
-                <w:color w:val="000000"/>
-                <w:sz w:val="20"/>
+                <w:sz w:val="19"/>
               </w:rPr>
               <w:t>1. Timotius Willy Narendra (Informatika, Universitas Jenderal Soedirman)</w:t>
             </w:r>
+          </w:p>
+          <w:p>
+            <w:pPr>
+              <w:spacing w:after="0" w:line="240" w:lineRule="auto"/>
+            </w:pPr>
             <w:r>
               <w:rPr>
-                <w:rFonts w:ascii="Times New Roman" w:hAnsi="Times New Roman"/>
-                <w:color w:val="000000"/>
-                <w:sz w:val="20"/>
-              </w:rPr>
-              <w:br/>
-            </w:r>
-            <w:r>
-              <w:rPr>
-                <w:rFonts w:ascii="Times New Roman" w:hAnsi="Times New Roman"/>
-                <w:color w:val="000000"/>
-                <w:sz w:val="20"/>
+                <w:sz w:val="19"/>
               </w:rPr>
               <w:t>2. Fardizza Finda Rahman (Informatika, Universitas Jenderal Soedirman)</w:t>
             </w:r>
@@ -338,13 +375,12 @@
         </w:trPr>
         <w:tc>
           <w:tcPr>
-            <w:tcW w:w="4" w:type="dxa"/>
-            <w:shd w:val="clear" w:color="auto" w:fill="F4F4F5"/>
+            <w:tcW w:w="2362" w:type="dxa"/>
             <w:tcMar>
-              <w:top w:w="40" w:type="dxa"/>
-              <w:left w:w="80" w:type="dxa"/>
-              <w:bottom w:w="40" w:type="dxa"/>
-              <w:right w:w="80" w:type="dxa"/>
+              <w:top w:w="30" w:type="dxa"/>
+              <w:left w:w="60" w:type="dxa"/>
+              <w:bottom w:w="30" w:type="dxa"/>
+              <w:right w:w="60" w:type="dxa"/>
             </w:tcMar>
           </w:tcPr>
           <w:p>
@@ -353,23 +389,21 @@
             </w:pPr>
             <w:r>
               <w:rPr>
-                <w:rFonts w:ascii="Times New Roman" w:hAnsi="Times New Roman"/>
                 <w:b/>
-                <w:color w:val="000000"/>
-                <w:sz w:val="20"/>
+                <w:sz w:val="19"/>
               </w:rPr>
-              <w:t>Challenge Track</w:t>
+              <w:t>Judul Produk</w:t>
             </w:r>
           </w:p>
         </w:tc>
         <w:tc>
           <w:tcPr>
-            <w:tcW w:w="10" w:type="dxa"/>
+            <w:tcW w:w="6595" w:type="dxa"/>
             <w:tcMar>
-              <w:top w:w="40" w:type="dxa"/>
-              <w:left w:w="80" w:type="dxa"/>
-              <w:bottom w:w="40" w:type="dxa"/>
-              <w:right w:w="80" w:type="dxa"/>
+              <w:top w:w="30" w:type="dxa"/>
+              <w:left w:w="60" w:type="dxa"/>
+              <w:bottom w:w="30" w:type="dxa"/>
+              <w:right w:w="60" w:type="dxa"/>
             </w:tcMar>
           </w:tcPr>
           <w:p>
@@ -378,9 +412,60 @@
             </w:pPr>
             <w:r>
               <w:rPr>
-                <w:rFonts w:ascii="Times New Roman" w:hAnsi="Times New Roman"/>
-                <w:color w:val="000000"/>
-                <w:sz w:val="20"/>
+                <w:b/>
+                <w:sz w:val="19"/>
+              </w:rPr>
+              <w:t>KilasTugas</w:t>
+            </w:r>
+          </w:p>
+        </w:tc>
+      </w:tr>
+      <w:tr>
+        <w:trPr>
+          <w:cantSplit/>
+          <w:jc w:val="center"/>
+        </w:trPr>
+        <w:tc>
+          <w:tcPr>
+            <w:tcW w:w="2362" w:type="dxa"/>
+            <w:tcMar>
+              <w:top w:w="30" w:type="dxa"/>
+              <w:left w:w="60" w:type="dxa"/>
+              <w:bottom w:w="30" w:type="dxa"/>
+              <w:right w:w="60" w:type="dxa"/>
+            </w:tcMar>
+          </w:tcPr>
+          <w:p>
+            <w:pPr>
+              <w:spacing w:after="0" w:line="240" w:lineRule="auto"/>
+            </w:pPr>
+            <w:r>
+              <w:rPr>
+                <w:b/>
+                <w:sz w:val="19"/>
+              </w:rPr>
+              <w:t>Challenge Track</w:t>
+            </w:r>
+          </w:p>
+        </w:tc>
+        <w:tc>
+          <w:tcPr>
+            <w:tcW w:w="6595" w:type="dxa"/>
+            <w:tcMar>
+              <w:top w:w="30" w:type="dxa"/>
+              <w:left w:w="60" w:type="dxa"/>
+              <w:bottom w:w="30" w:type="dxa"/>
+              <w:right w:w="60" w:type="dxa"/>
+            </w:tcMar>
+          </w:tcPr>
+          <w:p>
+            <w:pPr>
+              <w:spacing w:after="0" w:line="240" w:lineRule="auto"/>
+            </w:pPr>
+            <w:r>
+              <w:rPr>
+                <w:b/>
+                <w:sz w:val="19"/>
               </w:rPr>
               <w:t>Education</w:t>
             </w:r>
@@ -394,13 +479,12 @@
         </w:trPr>
         <w:tc>
           <w:tcPr>
-            <w:tcW w:w="4" w:type="dxa"/>
-            <w:shd w:val="clear" w:color="auto" w:fill="F4F4F5"/>
+            <w:tcW w:w="2362" w:type="dxa"/>
             <w:tcMar>
-              <w:top w:w="40" w:type="dxa"/>
-              <w:left w:w="80" w:type="dxa"/>
-              <w:bottom w:w="40" w:type="dxa"/>
-              <w:right w:w="80" w:type="dxa"/>
+              <w:top w:w="30" w:type="dxa"/>
+              <w:left w:w="60" w:type="dxa"/>
+              <w:bottom w:w="30" w:type="dxa"/>
+              <w:right w:w="60" w:type="dxa"/>
             </w:tcMar>
           </w:tcPr>
           <w:p>
@@ -409,23 +493,21 @@
             </w:pPr>
             <w:r>
               <w:rPr>
-                <w:rFonts w:ascii="Times New Roman" w:hAnsi="Times New Roman"/>
                 <w:b/>
-                <w:color w:val="000000"/>
-                <w:sz w:val="20"/>
+                <w:sz w:val="19"/>
               </w:rPr>
-              <w:t>Repositori GitHub</w:t>
+              <w:t>Tautan Repositori GitHub</w:t>
             </w:r>
           </w:p>
         </w:tc>
         <w:tc>
           <w:tcPr>
-            <w:tcW w:w="10" w:type="dxa"/>
+            <w:tcW w:w="6595" w:type="dxa"/>
             <w:tcMar>
-              <w:top w:w="40" w:type="dxa"/>
-              <w:left w:w="80" w:type="dxa"/>
-              <w:bottom w:w="40" w:type="dxa"/>
-              <w:right w:w="80" w:type="dxa"/>
+              <w:top w:w="30" w:type="dxa"/>
+              <w:left w:w="60" w:type="dxa"/>
+              <w:bottom w:w="30" w:type="dxa"/>
+              <w:right w:w="60" w:type="dxa"/>
             </w:tcMar>
           </w:tcPr>
           <w:p>
@@ -434,11 +516,23 @@
             </w:pPr>
             <w:r>
               <w:rPr>
-                <w:rFonts w:ascii="Times New Roman" w:hAnsi="Times New Roman"/>
-                <w:color w:val="000000"/>
-                <w:sz w:val="20"/>
+                <w:rFonts w:ascii="Consolas" w:hAnsi="Consolas"/>
+                <w:sz w:val="17"/>
               </w:rPr>
               <w:t>https://github.com/najmifaza/KilasTugas_SIFest_KmHarkatNegri_JadiH-1</w:t>
+            </w:r>
+            <w:r>
+              <w:rPr>
+                <w:sz w:val="19"/>
+              </w:rPr>
+              <w:t xml:space="preserve"> </w:t>
+            </w:r>
+            <w:r>
+              <w:rPr>
+                <w:i/>
+                <w:sz w:val="19"/>
+              </w:rPr>
+              <w:t>(Akses Publik / Juri)</w:t>
             </w:r>
           </w:p>
         </w:tc>
@@ -446,57 +540,22 @@
     </w:tbl>
     <w:p>
       <w:pPr>
-        <w:spacing w:after="720" w:line="269" w:lineRule="auto"/>
-        <w:jc w:val="both"/>
+        <w:spacing w:after="60" w:line="240" w:lineRule="auto"/>
       </w:pPr>
     </w:p>
     <w:p>
-      <w:pPr>
-        <w:spacing w:after="0" w:line="269" w:lineRule="auto"/>
-        <w:jc w:val="center"/>
-      </w:pPr>
-      <w:r>
-        <w:rPr>
-          <w:rFonts w:ascii="Times New Roman" w:hAnsi="Times New Roman"/>
-          <w:b/>
-          <w:color w:val="18181B"/>
-        </w:rPr>
-        <w:t>UNIVERSITAS JENDERAL SOEDIRMAN</w:t>
-      </w:r>
-      <w:r>
-        <w:rPr>
-          <w:rFonts w:ascii="Times New Roman" w:hAnsi="Times New Roman"/>
-          <w:b/>
-          <w:color w:val="18181B"/>
-        </w:rPr>
-        <w:br/>
-        <w:t>PURWOKERTO</w:t>
-      </w:r>
-      <w:r>
-        <w:rPr>
-          <w:rFonts w:ascii="Times New Roman" w:hAnsi="Times New Roman"/>
-          <w:b/>
-          <w:color w:val="18181B"/>
-        </w:rPr>
-        <w:br/>
-        <w:t>2026</w:t>
+      <w:r>
+        <w:br w:type="page"/>
       </w:r>
     </w:p>
     <w:p>
-      <w:r>
-        <w:br w:type="page"/>
-      </w:r>
-    </w:p>
-    <w:p>
       <w:pPr>
         <w:keepNext/>
-        <w:spacing w:before="120" w:after="40"/>
+        <w:spacing w:before="120" w:after="30"/>
       </w:pPr>
       <w:r>
         <w:rPr>
-          <w:rFonts w:ascii="Times New Roman" w:hAnsi="Times New Roman"/>
           <w:b/>
-          <w:color w:val="000000"/>
           <w:sz w:val="23"/>
         </w:rPr>
         <w:lastRenderedPageBreak/>
@@ -510,44 +569,72 @@
       </w:pPr>
       <w:r>
         <w:rPr>
-          <w:rFonts w:ascii="Times New Roman" w:hAnsi="Times New Roman"/>
           <w:b/>
-          <w:color w:val="000000"/>
         </w:rPr>
         <w:t>1.1 Latar Belakang</w:t>
       </w:r>
     </w:p>
     <w:p>
       <w:pPr>
-        <w:spacing w:after="40" w:line="269" w:lineRule="auto"/>
+        <w:spacing w:after="40"/>
         <w:jc w:val="both"/>
       </w:pPr>
       <w:r>
-        <w:rPr>
-          <w:rFonts w:ascii="Times New Roman" w:hAnsi="Times New Roman"/>
-          <w:color w:val="18181B"/>
-        </w:rPr>
-        <w:t>Di jenjang perguruan tinggi dan sekolah menengah atas, mahasiswa rata-rata menempuh 4 hingga 7 mata kuliah aktif per semester. Setiap mata kuliah membebankan penugasan dengan karakteristik beragam: penyusunan makalah riset, laporan praktikum laboratorium, proyek pemrograman perangkat lunak, telaah jurnal ilmiah, hingga presentasi kelompok.</w:t>
+        <w:t>Di jenjang perguruan tinggi dan sekolah menengah atas, mahasiswa rata-rata menempuh 4 hingga 7 mata kuliah aktif per semester. Setiap mata kuliah membebankan tugas dengan karakteristik beragam: penyusunan makalah riset, laporan praktikum laboratorium, proyek pemrograman perangkat lunak, telaah jurnal ilmiah, hingga presentasi kelompok.</w:t>
       </w:r>
     </w:p>
     <w:p>
       <w:pPr>
-        <w:spacing w:after="40" w:line="269" w:lineRule="auto"/>
+        <w:spacing w:after="40"/>
         <w:jc w:val="both"/>
       </w:pPr>
       <w:r>
+        <w:t xml:space="preserve">Tuntutan tersebut sering kali diserahkan oleh pengajar dalam bentuk silabus atau deskripsi instruksi yang panjang, padat, dan abstrak (misal: </w:t>
+      </w:r>
+      <w:r>
         <w:rPr>
-          <w:rFonts w:ascii="Times New Roman" w:hAnsi="Times New Roman"/>
-          <w:color w:val="18181B"/>
+          <w:i/>
         </w:rPr>
-        <w:t>Tuntutan tersebut sering kali diserahkan oleh pengajar dalam bentuk silabus atau deskripsi instruksi yang panjang, padat, dan abstrak (misal: "Susun laporan akhir perancangan jaringan VLSM 5 bab lengkap dengan simulasi Packet Tracer"). Ketika beban tugas yang rumit datang bersamaan, mayoritas pelajar mengalami kebuntuan kognitif. Fenomena psikologis ini dikenal sebagai Task Paralysis atau Overwhelm Freeze: kondisi di mana seseorang justru tidak memulai pengerjaan bukan karena malas atau abai, melainkan kare</w:t>
+        <w:t>"Susun laporan akhir perancangan jaringan VLSM 5 bab lengkap dengan simulasi Packet Tracer"</w:t>
+      </w:r>
+      <w:r>
+        <w:t xml:space="preserve">). Ketika beban tugas yang rumit datang bersamaan, mayoritas pelajar mengalami kebuntuan kognitif. Fenomena psikologis ini dikenal sebagai </w:t>
       </w:r>
       <w:r>
         <w:rPr>
-          <w:rFonts w:ascii="Times New Roman" w:hAnsi="Times New Roman"/>
-          <w:color w:val="18181B"/>
+          <w:b/>
         </w:rPr>
-        <w:t>na otak mengalami cognitive overload dan bingung menentukan titik awal tindakan ("where to start").</w:t>
+        <w:t>Task Paralysis</w:t>
+      </w:r>
+      <w:r>
+        <w:t xml:space="preserve"> atau </w:t>
+      </w:r>
+      <w:r>
+        <w:rPr>
+          <w:b/>
+        </w:rPr>
+        <w:t>Overwhelm Freeze</w:t>
+      </w:r>
+      <w:r>
+        <w:t xml:space="preserve">: kondisi di mana seseorang justru tidak memulai pengerjaan bukan karena malas atau abai, melainkan karena otak mengalami </w:t>
+      </w:r>
+      <w:r>
+        <w:rPr>
+          <w:i/>
+        </w:rPr>
+        <w:t>cognitive overload</w:t>
+      </w:r>
+      <w:r>
+        <w:t xml:space="preserve"> dan bingung menentukan titik awal tindakan (</w:t>
+      </w:r>
+      <w:r>
+        <w:rPr>
+          <w:i/>
+        </w:rPr>
+        <w:t>"where to start"</w:t>
+      </w:r>
+      <w:r>
+        <w:t>).</w:t>
       </w:r>
     </w:p>
     <w:p>
@@ -557,63 +644,84 @@
       </w:pPr>
       <w:r>
         <w:rPr>
-          <w:rFonts w:ascii="Times New Roman" w:hAnsi="Times New Roman"/>
           <w:b/>
-          <w:color w:val="000000"/>
         </w:rPr>
         <w:t>1.2 Gap Analisis Alat Manajemen Tugas Konvensional</w:t>
       </w:r>
     </w:p>
     <w:p>
       <w:pPr>
-        <w:spacing w:after="40" w:line="269" w:lineRule="auto"/>
+        <w:spacing w:after="40"/>
         <w:jc w:val="both"/>
       </w:pPr>
       <w:r>
+        <w:t xml:space="preserve">Pelajar saat ini telah menggunakan berbagai platform produktivitas populer (Notion, Google Keep, Todoist, Trello, Google Tasks). Namun, instrumen-instrumen tersebut menyisakan </w:t>
+      </w:r>
+      <w:r>
         <w:rPr>
-          <w:rFonts w:ascii="Times New Roman" w:hAnsi="Times New Roman"/>
-          <w:color w:val="18181B"/>
+          <w:i/>
         </w:rPr>
-        <w:t>Pelajar saat ini telah menggunakan berbagai platform produktivitas populer (Notion, Google Keep, Todoist, Trello, Google Tasks). Namun, instrumen-instrumen tersebut menyisakan critical gap:</w:t>
+        <w:t>critical gap</w:t>
+      </w:r>
+      <w:r>
+        <w:t>:</w:t>
       </w:r>
     </w:p>
     <w:p>
       <w:pPr>
-        <w:spacing w:after="40" w:line="269" w:lineRule="auto"/>
+        <w:spacing w:after="20"/>
+        <w:ind w:left="360" w:hanging="288"/>
         <w:jc w:val="both"/>
       </w:pPr>
       <w:r>
         <w:rPr>
-          <w:rFonts w:ascii="Times New Roman" w:hAnsi="Times New Roman"/>
-          <w:color w:val="18181B"/>
+          <w:b/>
         </w:rPr>
-        <w:t>1. Hanya Bersifat Pasif (Deadline-Centric, Bukan Action-Centric): Aplikasi mencatat nama tugas dan tanggal tenggat, namun menyerahkan 100% beban pemecahan langkah kerja kepada pengguna yang sedang kewalahan.</w:t>
+        <w:t>1. Hanya Bersifat Pasif (Deadline-Centric, Bukan Action-Centric):</w:t>
+      </w:r>
+      <w:r>
+        <w:t xml:space="preserve"> Aplikasi mencatat nama tugas dan tanggal tenggat, namun menyerahkan 100% beban pemecahan langkah kerja kepada pengguna yang sedang kewalahan.</w:t>
       </w:r>
     </w:p>
     <w:p>
       <w:pPr>
-        <w:spacing w:after="40" w:line="269" w:lineRule="auto"/>
+        <w:spacing w:after="20"/>
+        <w:ind w:left="360" w:hanging="288"/>
         <w:jc w:val="both"/>
       </w:pPr>
       <w:r>
         <w:rPr>
-          <w:rFonts w:ascii="Times New Roman" w:hAnsi="Times New Roman"/>
-          <w:color w:val="18181B"/>
+          <w:b/>
         </w:rPr>
-        <w:t>2. Ketiadaan Micro-Pacing: Pengguna tidak dipandu secara harian berapa porsi kerja yang aman diselesaikan hari ini berdasarkan jarak tanggal pengumpulan. Akibatnya, timbul ilusi waktu luang semu yang berujung pada panic working di malam H-1/H-0.</w:t>
+        <w:t>2. Ketiadaan Micro-Pacing:</w:t>
+      </w:r>
+      <w:r>
+        <w:t xml:space="preserve"> Pengguna tidak dipandu secara harian berapa porsi kerja yang aman diselesaikan hari ini berdasarkan jarak tanggal pengumpulan. Akibatnya, timbul ilusi waktu luang semu yang berujung pada </w:t>
+      </w:r>
+      <w:r>
+        <w:rPr>
+          <w:i/>
+        </w:rPr>
+        <w:t>panic working</w:t>
+      </w:r>
+      <w:r>
+        <w:t xml:space="preserve"> di malam H-1/H-0.</w:t>
       </w:r>
     </w:p>
     <w:p>
       <w:pPr>
-        <w:spacing w:after="40" w:line="269" w:lineRule="auto"/>
+        <w:spacing w:after="20"/>
+        <w:ind w:left="360" w:hanging="288"/>
         <w:jc w:val="both"/>
       </w:pPr>
       <w:r>
         <w:rPr>
-          <w:rFonts w:ascii="Times New Roman" w:hAnsi="Times New Roman"/>
-          <w:color w:val="18181B"/>
+          <w:b/>
         </w:rPr>
-        <w:t>3. Friksi Awal Tinggi: Aplikasi manajemen proyek formal menuntut setup manual yang rumit (pembuatan database board, tagging, estimasi manual), sehingga pengguna lelah sebelum mulai bekerja.</w:t>
+        <w:t>3. Friksi Awal Tinggi:</w:t>
+      </w:r>
+      <w:r>
+        <w:t xml:space="preserve"> Aplikasi manajemen proyek formal menuntut setup manual yang rumit (pembuatan database board, tagging, estimasi manual), sehingga pengguna lelah sebelum mulai bekerja.</w:t>
       </w:r>
     </w:p>
     <w:p>
@@ -623,23 +731,22 @@
       </w:pPr>
       <w:r>
         <w:rPr>
-          <w:rFonts w:ascii="Times New Roman" w:hAnsi="Times New Roman"/>
           <w:b/>
-          <w:color w:val="000000"/>
         </w:rPr>
         <w:t>1.3 Rumusan Masalah</w:t>
       </w:r>
     </w:p>
     <w:p>
       <w:pPr>
-        <w:spacing w:after="40" w:line="269" w:lineRule="auto"/>
+        <w:spacing w:after="40"/>
         <w:jc w:val="both"/>
       </w:pPr>
       <w:r>
+        <w:t xml:space="preserve">&gt; </w:t>
+      </w:r>
+      <w:r>
         <w:rPr>
-          <w:rFonts w:ascii="Times New Roman" w:hAnsi="Times New Roman"/>
           <w:i/>
-          <w:color w:val="18181B"/>
         </w:rPr>
         <w:t>"Bagaimana merancang platform digital yang mampu mengeliminasi Task Paralysis pada pelajar dengan mengonversi instruksi tugas kuliah yang panjang menjadi rencana aksi harian yang mikro, konkret, dan terintegrasi dengan timer eksekusi terarah?"</w:t>
       </w:r>
@@ -647,13 +754,11 @@
     <w:p>
       <w:pPr>
         <w:keepNext/>
-        <w:spacing w:before="120" w:after="40"/>
+        <w:spacing w:before="120" w:after="30"/>
       </w:pPr>
       <w:r>
         <w:rPr>
-          <w:rFonts w:ascii="Times New Roman" w:hAnsi="Times New Roman"/>
           <w:b/>
-          <w:color w:val="000000"/>
           <w:sz w:val="23"/>
         </w:rPr>
         <w:t>2. Sumber Validasi Masalah</w:t>
@@ -661,14 +766,10 @@
     </w:p>
     <w:p>
       <w:pPr>
-        <w:spacing w:after="40" w:line="269" w:lineRule="auto"/>
+        <w:spacing w:after="40"/>
         <w:jc w:val="both"/>
       </w:pPr>
       <w:r>
-        <w:rPr>
-          <w:rFonts w:ascii="Times New Roman" w:hAnsi="Times New Roman"/>
-          <w:color w:val="18181B"/>
-        </w:rPr>
         <w:t>Validasi masalah KilasTugas disusun melalui triangulasi data: riset literatur akademis internasional, survei empiris kuantitatif pelajar, dan observasi lapangan langsung.</w:t>
       </w:r>
     </w:p>
@@ -679,50 +780,111 @@
       </w:pPr>
       <w:r>
         <w:rPr>
-          <w:rFonts w:ascii="Times New Roman" w:hAnsi="Times New Roman"/>
           <w:b/>
-          <w:color w:val="000000"/>
         </w:rPr>
         <w:t>2.1 Literatur Akademis &amp; Kajian Ilmiah</w:t>
       </w:r>
     </w:p>
     <w:p>
       <w:pPr>
-        <w:spacing w:after="40" w:line="269" w:lineRule="auto"/>
+        <w:spacing w:after="20"/>
+        <w:ind w:left="360" w:hanging="288"/>
         <w:jc w:val="both"/>
       </w:pPr>
       <w:r>
+        <w:t xml:space="preserve">•  </w:t>
+      </w:r>
+      <w:r>
         <w:rPr>
-          <w:rFonts w:ascii="Times New Roman" w:hAnsi="Times New Roman"/>
-          <w:color w:val="18181B"/>
+          <w:b/>
         </w:rPr>
-        <w:t>• American Psychological Association (APA / Onwuegbuzie &amp; Jiao, 2000): Prokrastinasi akademik dialami oleh 80%–95% mahasiswa, dengan 50% di antaranya melaporkan penundaan tugas berdampak destruktif pada performa akademik dan kesehatan mental.</w:t>
+        <w:t>American Psychological Association (APA / Onwuegbuzie &amp; Jiao, 2000):</w:t>
+      </w:r>
+      <w:r>
+        <w:t xml:space="preserve"> Prokrastinasi akademik dialami oleh </w:t>
+      </w:r>
+      <w:r>
+        <w:rPr>
+          <w:b/>
+        </w:rPr>
+        <w:t>80%–95% mahasiswa</w:t>
+      </w:r>
+      <w:r>
+        <w:t>, dengan 50% di antaranya melaporkan penundaan tugas berdampak destruktif pada performa akademik dan kesehatan mental.</w:t>
       </w:r>
     </w:p>
     <w:p>
       <w:pPr>
-        <w:spacing w:after="40" w:line="269" w:lineRule="auto"/>
+        <w:spacing w:after="20"/>
+        <w:ind w:left="360" w:hanging="288"/>
         <w:jc w:val="both"/>
       </w:pPr>
       <w:r>
+        <w:t xml:space="preserve">•  </w:t>
+      </w:r>
+      <w:r>
         <w:rPr>
-          <w:rFonts w:ascii="Times New Roman" w:hAnsi="Times New Roman"/>
-          <w:color w:val="18181B"/>
+          <w:b/>
         </w:rPr>
-        <w:t>• Journal of Educational Psychology: Penerapan teknik pemecahan tugas bertahap (Task Chunking) terbukti meningkatkan tingkat penyelesaian tugas akademik hingga 60% dibandingkan pencatatan berbasis daftar tugas konvensional.</w:t>
+        <w:t>Journal of Educational Psychology:</w:t>
+      </w:r>
+      <w:r>
+        <w:t xml:space="preserve"> Penerapan teknik pemecahan tugas bertahap (</w:t>
+      </w:r>
+      <w:r>
+        <w:rPr>
+          <w:i/>
+        </w:rPr>
+        <w:t>Task Chunking</w:t>
+      </w:r>
+      <w:r>
+        <w:t xml:space="preserve">) terbukti meningkatkan tingkat penyelesaian tugas akademik hingga </w:t>
+      </w:r>
+      <w:r>
+        <w:rPr>
+          <w:b/>
+        </w:rPr>
+        <w:t>60%</w:t>
+      </w:r>
+      <w:r>
+        <w:t xml:space="preserve"> dibandingkan pencatatan berbasis daftar tugas konvensional.</w:t>
       </w:r>
     </w:p>
     <w:p>
       <w:pPr>
-        <w:spacing w:after="40" w:line="269" w:lineRule="auto"/>
+        <w:spacing w:after="20"/>
+        <w:ind w:left="360" w:hanging="288"/>
         <w:jc w:val="both"/>
       </w:pPr>
       <w:r>
+        <w:t xml:space="preserve">•  </w:t>
+      </w:r>
+      <w:r>
         <w:rPr>
-          <w:rFonts w:ascii="Times New Roman" w:hAnsi="Times New Roman"/>
-          <w:color w:val="18181B"/>
+          <w:b/>
         </w:rPr>
-        <w:t>• Stanford d.school Research: Prinsip Micro-Commitment (tindakan mikro berdurasi 25–45 menit) menurunkan kecemasan kerja (task anxiety) secara drastis serta membangun momentum penyelesaian berkelanjutan.</w:t>
+        <w:t>Stanford d.school Research:</w:t>
+      </w:r>
+      <w:r>
+        <w:t xml:space="preserve"> Prinsip </w:t>
+      </w:r>
+      <w:r>
+        <w:rPr>
+          <w:i/>
+        </w:rPr>
+        <w:t>Micro-Commitment</w:t>
+      </w:r>
+      <w:r>
+        <w:t xml:space="preserve"> (tindakan mikro berdurasi 25–45 menit) menurunkan kecemasan kerja (</w:t>
+      </w:r>
+      <w:r>
+        <w:rPr>
+          <w:i/>
+        </w:rPr>
+        <w:t>task anxiety</w:t>
+      </w:r>
+      <w:r>
+        <w:t>) secara drastis serta membangun momentum penyelesaian berkelanjutan.</w:t>
       </w:r>
     </w:p>
     <w:p>
@@ -732,25 +894,24 @@
       </w:pPr>
       <w:r>
         <w:rPr>
-          <w:rFonts w:ascii="Times New Roman" w:hAnsi="Times New Roman"/>
           <w:b/>
-          <w:color w:val="000000"/>
         </w:rPr>
         <w:t>2.2 Survei Lapangan Kuantitatif (Responden: 28 Mahasiswa Aktif)</w:t>
       </w:r>
     </w:p>
     <w:p>
       <w:pPr>
-        <w:spacing w:after="40" w:line="269" w:lineRule="auto"/>
+        <w:spacing w:after="40"/>
         <w:jc w:val="both"/>
       </w:pPr>
       <w:r>
-        <w:rPr>
-          <w:rFonts w:ascii="Times New Roman" w:hAnsi="Times New Roman"/>
-          <w:color w:val="18181B"/>
-        </w:rPr>
         <w:t>Survei disebarkan kepada mahasiswa lintas angkatan dan program studi rumpun sains &amp; teknologi di lingkungan universitas:</w:t>
       </w:r>
+    </w:p>
+    <w:p>
+      <w:pPr>
+        <w:spacing w:after="60" w:line="240" w:lineRule="auto"/>
+      </w:pPr>
     </w:p>
     <w:tbl>
       <w:tblPr>
@@ -764,27 +925,29 @@
           <w:insideH w:val="single" w:sz="4" w:space="0" w:color="000000"/>
           <w:insideV w:val="single" w:sz="4" w:space="0" w:color="000000"/>
         </w:tblBorders>
+        <w:tblLayout w:type="fixed"/>
         <w:tblLook w:val="04A0" w:firstRow="1" w:lastRow="0" w:firstColumn="1" w:lastColumn="0" w:noHBand="0" w:noVBand="1"/>
       </w:tblPr>
       <w:tblGrid>
-        <w:gridCol w:w="1283"/>
-        <w:gridCol w:w="1146"/>
-        <w:gridCol w:w="1282"/>
+        <w:gridCol w:w="2675"/>
+        <w:gridCol w:w="2837"/>
+        <w:gridCol w:w="3445"/>
       </w:tblGrid>
       <w:tr>
         <w:trPr>
+          <w:cantSplit/>
           <w:tblHeader/>
           <w:jc w:val="center"/>
         </w:trPr>
         <w:tc>
           <w:tcPr>
-            <w:tcW w:w="6" w:type="dxa"/>
-            <w:shd w:val="clear" w:color="auto" w:fill="E4E4E7"/>
+            <w:tcW w:w="2675" w:type="dxa"/>
+            <w:shd w:val="clear" w:color="auto" w:fill="F4F4F5"/>
             <w:tcMar>
-              <w:top w:w="35" w:type="dxa"/>
-              <w:left w:w="50" w:type="dxa"/>
-              <w:bottom w:w="35" w:type="dxa"/>
-              <w:right w:w="50" w:type="dxa"/>
+              <w:top w:w="30" w:type="dxa"/>
+              <w:left w:w="60" w:type="dxa"/>
+              <w:bottom w:w="30" w:type="dxa"/>
+              <w:right w:w="60" w:type="dxa"/>
             </w:tcMar>
           </w:tcPr>
           <w:p>
@@ -794,9 +957,7 @@
             </w:pPr>
             <w:r>
               <w:rPr>
-                <w:rFonts w:ascii="Times New Roman" w:hAnsi="Times New Roman"/>
                 <w:b/>
-                <w:color w:val="000000"/>
                 <w:sz w:val="19"/>
               </w:rPr>
               <w:t>Pertanyaan Kunci</w:t>
@@ -805,13 +966,13 @@
         </w:tc>
         <w:tc>
           <w:tcPr>
-            <w:tcW w:w="3" w:type="dxa"/>
-            <w:shd w:val="clear" w:color="auto" w:fill="E4E4E7"/>
+            <w:tcW w:w="2837" w:type="dxa"/>
+            <w:shd w:val="clear" w:color="auto" w:fill="F4F4F5"/>
             <w:tcMar>
-              <w:top w:w="35" w:type="dxa"/>
-              <w:left w:w="50" w:type="dxa"/>
-              <w:bottom w:w="35" w:type="dxa"/>
-              <w:right w:w="50" w:type="dxa"/>
+              <w:top w:w="30" w:type="dxa"/>
+              <w:left w:w="60" w:type="dxa"/>
+              <w:bottom w:w="30" w:type="dxa"/>
+              <w:right w:w="60" w:type="dxa"/>
             </w:tcMar>
           </w:tcPr>
           <w:p>
@@ -821,24 +982,22 @@
             </w:pPr>
             <w:r>
               <w:rPr>
-                <w:rFonts w:ascii="Times New Roman" w:hAnsi="Times New Roman"/>
                 <w:b/>
-                <w:color w:val="000000"/>
                 <w:sz w:val="19"/>
               </w:rPr>
-              <w:t>Temuan Empiris</w:t>
+              <w:t>Temuan Data Empiris</w:t>
             </w:r>
           </w:p>
         </w:tc>
         <w:tc>
           <w:tcPr>
-            <w:tcW w:w="5" w:type="dxa"/>
-            <w:shd w:val="clear" w:color="auto" w:fill="E4E4E7"/>
+            <w:tcW w:w="3445" w:type="dxa"/>
+            <w:shd w:val="clear" w:color="auto" w:fill="F4F4F5"/>
             <w:tcMar>
-              <w:top w:w="35" w:type="dxa"/>
-              <w:left w:w="50" w:type="dxa"/>
-              <w:bottom w:w="35" w:type="dxa"/>
-              <w:right w:w="50" w:type="dxa"/>
+              <w:top w:w="30" w:type="dxa"/>
+              <w:left w:w="60" w:type="dxa"/>
+              <w:bottom w:w="30" w:type="dxa"/>
+              <w:right w:w="60" w:type="dxa"/>
             </w:tcMar>
           </w:tcPr>
           <w:p>
@@ -848,9 +1007,7 @@
             </w:pPr>
             <w:r>
               <w:rPr>
-                <w:rFonts w:ascii="Times New Roman" w:hAnsi="Times New Roman"/>
                 <w:b/>
-                <w:color w:val="000000"/>
                 <w:sz w:val="19"/>
               </w:rPr>
               <w:t>Implikasi bagi Produk</w:t>
@@ -865,12 +1022,12 @@
         </w:trPr>
         <w:tc>
           <w:tcPr>
-            <w:tcW w:w="6" w:type="dxa"/>
+            <w:tcW w:w="2675" w:type="dxa"/>
             <w:tcMar>
               <w:top w:w="30" w:type="dxa"/>
-              <w:left w:w="50" w:type="dxa"/>
+              <w:left w:w="60" w:type="dxa"/>
               <w:bottom w:w="30" w:type="dxa"/>
-              <w:right w:w="50" w:type="dxa"/>
+              <w:right w:w="60" w:type="dxa"/>
             </w:tcMar>
           </w:tcPr>
           <w:p>
@@ -879,8 +1036,6 @@
             </w:pPr>
             <w:r>
               <w:rPr>
-                <w:rFonts w:ascii="Times New Roman" w:hAnsi="Times New Roman"/>
-                <w:color w:val="000000"/>
                 <w:sz w:val="19"/>
               </w:rPr>
               <w:t>Frekuensi mengerjakan tugas kuliah pada H-1 / H-0 deadline</w:t>
@@ -889,38 +1044,12 @@
         </w:tc>
         <w:tc>
           <w:tcPr>
-            <w:tcW w:w="3" w:type="dxa"/>
+            <w:tcW w:w="2837" w:type="dxa"/>
             <w:tcMar>
               <w:top w:w="30" w:type="dxa"/>
-              <w:left w:w="50" w:type="dxa"/>
+              <w:left w:w="60" w:type="dxa"/>
               <w:bottom w:w="30" w:type="dxa"/>
-              <w:right w:w="50" w:type="dxa"/>
-            </w:tcMar>
-          </w:tcPr>
-          <w:p>
-            <w:pPr>
-              <w:spacing w:after="0" w:line="240" w:lineRule="auto"/>
-              <w:jc w:val="center"/>
-            </w:pPr>
-            <w:r>
-              <w:rPr>
-                <w:rFonts w:ascii="Times New Roman" w:hAnsi="Times New Roman"/>
-                <w:b/>
-                <w:color w:val="000000"/>
-                <w:sz w:val="19"/>
-              </w:rPr>
-              <w:t>78,6% (Sering / Selalu)</w:t>
-            </w:r>
-          </w:p>
-        </w:tc>
-        <w:tc>
-          <w:tcPr>
-            <w:tcW w:w="5" w:type="dxa"/>
-            <w:tcMar>
-              <w:top w:w="30" w:type="dxa"/>
-              <w:left w:w="50" w:type="dxa"/>
-              <w:bottom w:w="30" w:type="dxa"/>
-              <w:right w:w="50" w:type="dxa"/>
+              <w:right w:w="60" w:type="dxa"/>
             </w:tcMar>
           </w:tcPr>
           <w:p>
@@ -929,8 +1058,35 @@
             </w:pPr>
             <w:r>
               <w:rPr>
-                <w:rFonts w:ascii="Times New Roman" w:hAnsi="Times New Roman"/>
-                <w:color w:val="000000"/>
+                <w:b/>
+                <w:sz w:val="19"/>
+              </w:rPr>
+              <w:t>78,6%</w:t>
+            </w:r>
+            <w:r>
+              <w:rPr>
+                <w:sz w:val="19"/>
+              </w:rPr>
+              <w:t xml:space="preserve"> (Sering / Selalu)</w:t>
+            </w:r>
+          </w:p>
+        </w:tc>
+        <w:tc>
+          <w:tcPr>
+            <w:tcW w:w="3445" w:type="dxa"/>
+            <w:tcMar>
+              <w:top w:w="30" w:type="dxa"/>
+              <w:left w:w="60" w:type="dxa"/>
+              <w:bottom w:w="30" w:type="dxa"/>
+              <w:right w:w="60" w:type="dxa"/>
+            </w:tcMar>
+          </w:tcPr>
+          <w:p>
+            <w:pPr>
+              <w:spacing w:after="0" w:line="240" w:lineRule="auto"/>
+            </w:pPr>
+            <w:r>
+              <w:rPr>
                 <w:sz w:val="19"/>
               </w:rPr>
               <w:t>Membuktikan budaya prokrastinasi akut akibat ketiadaan panduan pacing.</w:t>
@@ -945,12 +1101,12 @@
         </w:trPr>
         <w:tc>
           <w:tcPr>
-            <w:tcW w:w="6" w:type="dxa"/>
+            <w:tcW w:w="2675" w:type="dxa"/>
             <w:tcMar>
               <w:top w:w="30" w:type="dxa"/>
-              <w:left w:w="50" w:type="dxa"/>
+              <w:left w:w="60" w:type="dxa"/>
               <w:bottom w:w="30" w:type="dxa"/>
-              <w:right w:w="50" w:type="dxa"/>
+              <w:right w:w="60" w:type="dxa"/>
             </w:tcMar>
           </w:tcPr>
           <w:p>
@@ -959,8 +1115,6 @@
             </w:pPr>
             <w:r>
               <w:rPr>
-                <w:rFonts w:ascii="Times New Roman" w:hAnsi="Times New Roman"/>
-                <w:color w:val="000000"/>
                 <w:sz w:val="19"/>
               </w:rPr>
               <w:t>Alasan utama menunda tugas</w:t>
@@ -969,38 +1123,12 @@
         </w:tc>
         <w:tc>
           <w:tcPr>
-            <w:tcW w:w="3" w:type="dxa"/>
+            <w:tcW w:w="2837" w:type="dxa"/>
             <w:tcMar>
               <w:top w:w="30" w:type="dxa"/>
-              <w:left w:w="50" w:type="dxa"/>
+              <w:left w:w="60" w:type="dxa"/>
               <w:bottom w:w="30" w:type="dxa"/>
-              <w:right w:w="50" w:type="dxa"/>
-            </w:tcMar>
-          </w:tcPr>
-          <w:p>
-            <w:pPr>
-              <w:spacing w:after="0" w:line="240" w:lineRule="auto"/>
-              <w:jc w:val="center"/>
-            </w:pPr>
-            <w:r>
-              <w:rPr>
-                <w:rFonts w:ascii="Times New Roman" w:hAnsi="Times New Roman"/>
-                <w:b/>
-                <w:color w:val="000000"/>
-                <w:sz w:val="19"/>
-              </w:rPr>
-              <w:t>64,3% ("Bingung mulai dari mana / kewalahan")</w:t>
-            </w:r>
-          </w:p>
-        </w:tc>
-        <w:tc>
-          <w:tcPr>
-            <w:tcW w:w="5" w:type="dxa"/>
-            <w:tcMar>
-              <w:top w:w="30" w:type="dxa"/>
-              <w:left w:w="50" w:type="dxa"/>
-              <w:bottom w:w="30" w:type="dxa"/>
-              <w:right w:w="50" w:type="dxa"/>
+              <w:right w:w="60" w:type="dxa"/>
             </w:tcMar>
           </w:tcPr>
           <w:p>
@@ -1009,11 +1137,51 @@
             </w:pPr>
             <w:r>
               <w:rPr>
-                <w:rFonts w:ascii="Times New Roman" w:hAnsi="Times New Roman"/>
-                <w:color w:val="000000"/>
+                <w:b/>
                 <w:sz w:val="19"/>
               </w:rPr>
-              <w:t>Menegaskan keberadaan Task Paralysis, bukan sekadar faktor kemalasan.</w:t>
+              <w:t>64,3%</w:t>
+            </w:r>
+            <w:r>
+              <w:rPr>
+                <w:sz w:val="19"/>
+              </w:rPr>
+              <w:t xml:space="preserve"> ("Bingung mulai dari mana / kewalahan membaca instruksi")</w:t>
+            </w:r>
+          </w:p>
+        </w:tc>
+        <w:tc>
+          <w:tcPr>
+            <w:tcW w:w="3445" w:type="dxa"/>
+            <w:tcMar>
+              <w:top w:w="30" w:type="dxa"/>
+              <w:left w:w="60" w:type="dxa"/>
+              <w:bottom w:w="30" w:type="dxa"/>
+              <w:right w:w="60" w:type="dxa"/>
+            </w:tcMar>
+          </w:tcPr>
+          <w:p>
+            <w:pPr>
+              <w:spacing w:after="0" w:line="240" w:lineRule="auto"/>
+            </w:pPr>
+            <w:r>
+              <w:rPr>
+                <w:sz w:val="19"/>
+              </w:rPr>
+              <w:t xml:space="preserve">Menegaskan keberadaan </w:t>
+            </w:r>
+            <w:r>
+              <w:rPr>
+                <w:i/>
+                <w:sz w:val="19"/>
+              </w:rPr>
+              <w:t>Task Paralysis</w:t>
+            </w:r>
+            <w:r>
+              <w:rPr>
+                <w:sz w:val="19"/>
+              </w:rPr>
+              <w:t>, bukan sekadar faktor kemalasan.</w:t>
             </w:r>
           </w:p>
         </w:tc>
@@ -1025,12 +1193,12 @@
         </w:trPr>
         <w:tc>
           <w:tcPr>
-            <w:tcW w:w="6" w:type="dxa"/>
+            <w:tcW w:w="2675" w:type="dxa"/>
             <w:tcMar>
               <w:top w:w="30" w:type="dxa"/>
-              <w:left w:w="50" w:type="dxa"/>
+              <w:left w:w="60" w:type="dxa"/>
               <w:bottom w:w="30" w:type="dxa"/>
-              <w:right w:w="50" w:type="dxa"/>
+              <w:right w:w="60" w:type="dxa"/>
             </w:tcMar>
           </w:tcPr>
           <w:p>
@@ -1039,8 +1207,6 @@
             </w:pPr>
             <w:r>
               <w:rPr>
-                <w:rFonts w:ascii="Times New Roman" w:hAnsi="Times New Roman"/>
-                <w:color w:val="000000"/>
                 <w:sz w:val="19"/>
               </w:rPr>
               <w:t>Pengalaman gagal mengumpulkan tugas tepat waktu</w:t>
@@ -1049,38 +1215,12 @@
         </w:tc>
         <w:tc>
           <w:tcPr>
-            <w:tcW w:w="3" w:type="dxa"/>
+            <w:tcW w:w="2837" w:type="dxa"/>
             <w:tcMar>
               <w:top w:w="30" w:type="dxa"/>
-              <w:left w:w="50" w:type="dxa"/>
+              <w:left w:w="60" w:type="dxa"/>
               <w:bottom w:w="30" w:type="dxa"/>
-              <w:right w:w="50" w:type="dxa"/>
-            </w:tcMar>
-          </w:tcPr>
-          <w:p>
-            <w:pPr>
-              <w:spacing w:after="0" w:line="240" w:lineRule="auto"/>
-              <w:jc w:val="center"/>
-            </w:pPr>
-            <w:r>
-              <w:rPr>
-                <w:rFonts w:ascii="Times New Roman" w:hAnsi="Times New Roman"/>
-                <w:b/>
-                <w:color w:val="000000"/>
-                <w:sz w:val="19"/>
-              </w:rPr>
-              <w:t>53,6% (Minimal 1x per semester)</w:t>
-            </w:r>
-          </w:p>
-        </w:tc>
-        <w:tc>
-          <w:tcPr>
-            <w:tcW w:w="5" w:type="dxa"/>
-            <w:tcMar>
-              <w:top w:w="30" w:type="dxa"/>
-              <w:left w:w="50" w:type="dxa"/>
-              <w:bottom w:w="30" w:type="dxa"/>
-              <w:right w:w="50" w:type="dxa"/>
+              <w:right w:w="60" w:type="dxa"/>
             </w:tcMar>
           </w:tcPr>
           <w:p>
@@ -1089,8 +1229,35 @@
             </w:pPr>
             <w:r>
               <w:rPr>
-                <w:rFonts w:ascii="Times New Roman" w:hAnsi="Times New Roman"/>
-                <w:color w:val="000000"/>
+                <w:b/>
+                <w:sz w:val="19"/>
+              </w:rPr>
+              <w:t>53,6%</w:t>
+            </w:r>
+            <w:r>
+              <w:rPr>
+                <w:sz w:val="19"/>
+              </w:rPr>
+              <w:t xml:space="preserve"> (Minimal 1x per semester)</w:t>
+            </w:r>
+          </w:p>
+        </w:tc>
+        <w:tc>
+          <w:tcPr>
+            <w:tcW w:w="3445" w:type="dxa"/>
+            <w:tcMar>
+              <w:top w:w="30" w:type="dxa"/>
+              <w:left w:w="60" w:type="dxa"/>
+              <w:bottom w:w="30" w:type="dxa"/>
+              <w:right w:w="60" w:type="dxa"/>
+            </w:tcMar>
+          </w:tcPr>
+          <w:p>
+            <w:pPr>
+              <w:spacing w:after="0" w:line="240" w:lineRule="auto"/>
+            </w:pPr>
+            <w:r>
+              <w:rPr>
                 <w:sz w:val="19"/>
               </w:rPr>
               <w:t>Mengakibatkan kerugian akademik langsung (nilai penalti/gugur).</w:t>
@@ -1105,12 +1272,12 @@
         </w:trPr>
         <w:tc>
           <w:tcPr>
-            <w:tcW w:w="6" w:type="dxa"/>
+            <w:tcW w:w="2675" w:type="dxa"/>
             <w:tcMar>
               <w:top w:w="30" w:type="dxa"/>
-              <w:left w:w="50" w:type="dxa"/>
+              <w:left w:w="60" w:type="dxa"/>
               <w:bottom w:w="30" w:type="dxa"/>
-              <w:right w:w="50" w:type="dxa"/>
+              <w:right w:w="60" w:type="dxa"/>
             </w:tcMar>
           </w:tcPr>
           <w:p>
@@ -1119,8 +1286,6 @@
             </w:pPr>
             <w:r>
               <w:rPr>
-                <w:rFonts w:ascii="Times New Roman" w:hAnsi="Times New Roman"/>
-                <w:color w:val="000000"/>
                 <w:sz w:val="19"/>
               </w:rPr>
               <w:t>Penggunaan to-do list &amp; efektivitasnya</w:t>
@@ -1129,38 +1294,12 @@
         </w:tc>
         <w:tc>
           <w:tcPr>
-            <w:tcW w:w="3" w:type="dxa"/>
+            <w:tcW w:w="2837" w:type="dxa"/>
             <w:tcMar>
               <w:top w:w="30" w:type="dxa"/>
-              <w:left w:w="50" w:type="dxa"/>
+              <w:left w:w="60" w:type="dxa"/>
               <w:bottom w:w="30" w:type="dxa"/>
-              <w:right w:w="50" w:type="dxa"/>
-            </w:tcMar>
-          </w:tcPr>
-          <w:p>
-            <w:pPr>
-              <w:spacing w:after="0" w:line="240" w:lineRule="auto"/>
-              <w:jc w:val="center"/>
-            </w:pPr>
-            <w:r>
-              <w:rPr>
-                <w:rFonts w:ascii="Times New Roman" w:hAnsi="Times New Roman"/>
-                <w:b/>
-                <w:color w:val="000000"/>
-                <w:sz w:val="19"/>
-              </w:rPr>
-              <w:t>67,9% memakai, 57,1% tidak efektif</w:t>
-            </w:r>
-          </w:p>
-        </w:tc>
-        <w:tc>
-          <w:tcPr>
-            <w:tcW w:w="5" w:type="dxa"/>
-            <w:tcMar>
-              <w:top w:w="30" w:type="dxa"/>
-              <w:left w:w="50" w:type="dxa"/>
-              <w:bottom w:w="30" w:type="dxa"/>
-              <w:right w:w="50" w:type="dxa"/>
+              <w:right w:w="60" w:type="dxa"/>
             </w:tcMar>
           </w:tcPr>
           <w:p>
@@ -1169,8 +1308,48 @@
             </w:pPr>
             <w:r>
               <w:rPr>
-                <w:rFonts w:ascii="Times New Roman" w:hAnsi="Times New Roman"/>
-                <w:color w:val="000000"/>
+                <w:b/>
+                <w:sz w:val="19"/>
+              </w:rPr>
+              <w:t>67,9%</w:t>
+            </w:r>
+            <w:r>
+              <w:rPr>
+                <w:sz w:val="19"/>
+              </w:rPr>
+              <w:t xml:space="preserve"> memakai, namun </w:t>
+            </w:r>
+            <w:r>
+              <w:rPr>
+                <w:b/>
+                <w:sz w:val="19"/>
+              </w:rPr>
+              <w:t>57,1%</w:t>
+            </w:r>
+            <w:r>
+              <w:rPr>
+                <w:sz w:val="19"/>
+              </w:rPr>
+              <w:t xml:space="preserve"> merasa tidak efektif mengeksekusi</w:t>
+            </w:r>
+          </w:p>
+        </w:tc>
+        <w:tc>
+          <w:tcPr>
+            <w:tcW w:w="3445" w:type="dxa"/>
+            <w:tcMar>
+              <w:top w:w="30" w:type="dxa"/>
+              <w:left w:w="60" w:type="dxa"/>
+              <w:bottom w:w="30" w:type="dxa"/>
+              <w:right w:w="60" w:type="dxa"/>
+            </w:tcMar>
+          </w:tcPr>
+          <w:p>
+            <w:pPr>
+              <w:spacing w:after="0" w:line="240" w:lineRule="auto"/>
+            </w:pPr>
+            <w:r>
+              <w:rPr>
                 <w:sz w:val="19"/>
               </w:rPr>
               <w:t>Membuktikan to-do list pasif gagal menjawab kebutuhan eksekusi.</w:t>
@@ -1181,54 +1360,73 @@
     </w:tbl>
     <w:p>
       <w:pPr>
+        <w:spacing w:after="60" w:line="240" w:lineRule="auto"/>
+      </w:pPr>
+    </w:p>
+    <w:p>
+      <w:pPr>
         <w:keepNext/>
         <w:spacing w:before="80" w:after="30"/>
       </w:pPr>
       <w:r>
         <w:rPr>
-          <w:rFonts w:ascii="Times New Roman" w:hAnsi="Times New Roman"/>
           <w:b/>
-          <w:color w:val="000000"/>
         </w:rPr>
         <w:t>2.3 Observasi &amp; Wawancara Kualitatif Mahasiswa</w:t>
       </w:r>
     </w:p>
     <w:p>
       <w:pPr>
-        <w:spacing w:after="40" w:line="269" w:lineRule="auto"/>
+        <w:spacing w:after="20"/>
+        <w:ind w:left="360" w:hanging="288"/>
         <w:jc w:val="both"/>
       </w:pPr>
       <w:r>
+        <w:t xml:space="preserve">•  </w:t>
+      </w:r>
+      <w:r>
         <w:rPr>
-          <w:rFonts w:ascii="Times New Roman" w:hAnsi="Times New Roman"/>
-          <w:color w:val="18181B"/>
+          <w:b/>
         </w:rPr>
-        <w:t>• Narasumber (Mahasiswa S1 Semester 5): "Masalah utamanya bukan tidak mau mengerjakan, tetapi saat membuka modul tugas 15 halaman langsung pusing. Andai ada yang memandu: 'Hari ini cukup tulis pendahuluan 30 menit dulu', pasti langsung saya kerjakan."</w:t>
+        <w:t>Narasumber (Mahasiswa S1 Semester 5):</w:t>
+      </w:r>
+      <w:r>
+        <w:t xml:space="preserve"> </w:t>
+      </w:r>
+      <w:r>
+        <w:rPr>
+          <w:i/>
+        </w:rPr>
+        <w:t>"Masalah utamanya bukan nggak mau ngerjain, Mas. Pas buka modul tugas 15 halaman langsung pusing. Andai ada yang kasih tahu: 'Hari ini kamu cukup tulis pendahuluan 30 menit dulu aja', pasti langsung saya kerjain."</w:t>
       </w:r>
     </w:p>
     <w:p>
       <w:pPr>
-        <w:spacing w:after="40" w:line="269" w:lineRule="auto"/>
+        <w:spacing w:after="20"/>
+        <w:ind w:left="360" w:hanging="288"/>
         <w:jc w:val="both"/>
       </w:pPr>
       <w:r>
+        <w:t xml:space="preserve">•  </w:t>
+      </w:r>
+      <w:r>
         <w:rPr>
-          <w:rFonts w:ascii="Times New Roman" w:hAnsi="Times New Roman"/>
-          <w:color w:val="18181B"/>
+          <w:b/>
         </w:rPr>
-        <w:t>• Observasi Kanal Koordinasi Akademik: Diskusi penugasan di WhatsApp/Discord kelas selalu melonjak drastis pada rentang pukul 21.00–23.59 WIB pada malam sebelum tenggat, menghasilkan kualitas analisis yang rendah akibat dikerjakan tergesa-gesa.</w:t>
+        <w:t>Observasi Kanal Koordinasi Akademik:</w:t>
+      </w:r>
+      <w:r>
+        <w:t xml:space="preserve"> Diskusi penugasan di WhatsApp/Discord kelas selalu melonjak drastis pada rentang pukul 21.00–23.59 WIB pada malam sebelum pengumpulan tugas, menghasilkan kualitas penulisan dan analisis yang rendah akibat dikerjakan tergesa-gesa.</w:t>
       </w:r>
     </w:p>
     <w:p>
       <w:pPr>
         <w:keepNext/>
-        <w:spacing w:before="120" w:after="40"/>
+        <w:spacing w:before="120" w:after="30"/>
       </w:pPr>
       <w:r>
         <w:rPr>
-          <w:rFonts w:ascii="Times New Roman" w:hAnsi="Times New Roman"/>
           <w:b/>
-          <w:color w:val="000000"/>
           <w:sz w:val="23"/>
         </w:rPr>
         <w:t>3. Solusi yang Ditawarkan</w:t>
@@ -1236,132 +1434,503 @@
     </w:p>
     <w:p>
       <w:pPr>
-        <w:spacing w:after="40" w:line="269" w:lineRule="auto"/>
+        <w:spacing w:after="40"/>
         <w:jc w:val="both"/>
       </w:pPr>
       <w:r>
+        <w:t xml:space="preserve">KilasTugas hadir dengan filosofi dasar: </w:t>
+      </w:r>
+      <w:r>
         <w:rPr>
-          <w:rFonts w:ascii="Times New Roman" w:hAnsi="Times New Roman"/>
-          <w:color w:val="18181B"/>
+          <w:b/>
         </w:rPr>
-        <w:t>KilasTugas hadir dengan filosofi dasar: "Problem First, Technology Second: Jangan tanya kapan selesai, tanyakan apa yang dikerjakan hari ini."</w:t>
+        <w:t>"Problem First, Technology Second: Jangan tanya 'kapan selesai', tanyakan 'apa yang dikerjakan hari ini'."</w:t>
       </w:r>
     </w:p>
     <w:p>
       <w:pPr>
+        <w:spacing w:after="40" w:line="240" w:lineRule="auto"/>
+      </w:pPr>
+    </w:p>
+    <w:tbl>
+      <w:tblPr>
+        <w:tblW w:w="0" w:type="auto"/>
+        <w:jc w:val="center"/>
+        <w:tblBorders>
+          <w:top w:val="single" w:sz="4" w:space="0" w:color="CCCCCC"/>
+          <w:left w:val="single" w:sz="4" w:space="0" w:color="CCCCCC"/>
+          <w:bottom w:val="single" w:sz="4" w:space="0" w:color="CCCCCC"/>
+          <w:right w:val="single" w:sz="4" w:space="0" w:color="CCCCCC"/>
+          <w:insideH w:val="single" w:sz="4" w:space="0" w:color="CCCCCC"/>
+          <w:insideV w:val="single" w:sz="4" w:space="0" w:color="CCCCCC"/>
+        </w:tblBorders>
+        <w:tblLayout w:type="fixed"/>
+        <w:tblLook w:val="04A0" w:firstRow="1" w:lastRow="0" w:firstColumn="1" w:lastColumn="0" w:noHBand="0" w:noVBand="1"/>
+      </w:tblPr>
+      <w:tblGrid>
+        <w:gridCol w:w="8957"/>
+      </w:tblGrid>
+      <w:tr>
+        <w:trPr>
+          <w:jc w:val="center"/>
+        </w:trPr>
+        <w:tc>
+          <w:tcPr>
+            <w:tcW w:w="8957" w:type="dxa"/>
+            <w:shd w:val="clear" w:color="auto" w:fill="FAFAFA"/>
+            <w:tcMar>
+              <w:top w:w="40" w:type="dxa"/>
+              <w:left w:w="60" w:type="dxa"/>
+              <w:bottom w:w="40" w:type="dxa"/>
+              <w:right w:w="60" w:type="dxa"/>
+            </w:tcMar>
+          </w:tcPr>
+          <w:p>
+            <w:pPr>
+              <w:spacing w:after="0" w:line="240" w:lineRule="auto"/>
+            </w:pPr>
+            <w:r>
+              <w:rPr>
+                <w:rFonts w:ascii="Consolas" w:hAnsi="Consolas"/>
+                <w:color w:val="18181B"/>
+                <w:sz w:val="16"/>
+              </w:rPr>
+              <w:t>[ Instruksi Tugas Kuliah yang Panjang &amp; Abstrak ]</w:t>
+            </w:r>
+            <w:r>
+              <w:rPr>
+                <w:rFonts w:ascii="Consolas" w:hAnsi="Consolas"/>
+                <w:color w:val="18181B"/>
+                <w:sz w:val="16"/>
+              </w:rPr>
+              <w:br/>
+              <w:t xml:space="preserve">                       │</w:t>
+            </w:r>
+            <w:r>
+              <w:rPr>
+                <w:rFonts w:ascii="Consolas" w:hAnsi="Consolas"/>
+                <w:color w:val="18181B"/>
+                <w:sz w:val="16"/>
+              </w:rPr>
+              <w:br/>
+              <w:t xml:space="preserve">                       ▼</w:t>
+            </w:r>
+            <w:r>
+              <w:rPr>
+                <w:rFonts w:ascii="Consolas" w:hAnsi="Consolas"/>
+                <w:color w:val="18181B"/>
+                <w:sz w:val="16"/>
+              </w:rPr>
+              <w:br/>
+            </w:r>
+            <w:r>
+              <w:rPr>
+                <w:rFonts w:ascii="Consolas" w:hAnsi="Consolas"/>
+                <w:color w:val="18181B"/>
+                <w:sz w:val="16"/>
+              </w:rPr>
+              <w:t>[ Engine KilasTugas: AI Breakdown + Template Fallback ]</w:t>
+            </w:r>
+            <w:r>
+              <w:rPr>
+                <w:rFonts w:ascii="Consolas" w:hAnsi="Consolas"/>
+                <w:color w:val="18181B"/>
+                <w:sz w:val="16"/>
+              </w:rPr>
+              <w:br/>
+              <w:t xml:space="preserve">                       │</w:t>
+            </w:r>
+            <w:r>
+              <w:rPr>
+                <w:rFonts w:ascii="Consolas" w:hAnsi="Consolas"/>
+                <w:color w:val="18181B"/>
+                <w:sz w:val="16"/>
+              </w:rPr>
+              <w:br/>
+              <w:t xml:space="preserve">                       ▼</w:t>
+            </w:r>
+            <w:r>
+              <w:rPr>
+                <w:rFonts w:ascii="Consolas" w:hAnsi="Consolas"/>
+                <w:color w:val="18181B"/>
+                <w:sz w:val="16"/>
+              </w:rPr>
+              <w:br/>
+              <w:t>┌────────────────────────────────────────────────────────┐</w:t>
+            </w:r>
+            <w:r>
+              <w:rPr>
+                <w:rFonts w:ascii="Consolas" w:hAnsi="Consolas"/>
+                <w:color w:val="18181B"/>
+                <w:sz w:val="16"/>
+              </w:rPr>
+              <w:br/>
+              <w:t>│               Tiga Pilar Solusi KilasTugas            │</w:t>
+            </w:r>
+            <w:r>
+              <w:rPr>
+                <w:rFonts w:ascii="Consolas" w:hAnsi="Consolas"/>
+                <w:color w:val="18181B"/>
+                <w:sz w:val="16"/>
+              </w:rPr>
+              <w:br/>
+              <w:t>├────────────────────────┬───────────────────────────────┤</w:t>
+            </w:r>
+            <w:r>
+              <w:rPr>
+                <w:rFonts w:ascii="Consolas" w:hAnsi="Consolas"/>
+                <w:color w:val="18181B"/>
+                <w:sz w:val="16"/>
+              </w:rPr>
+              <w:br/>
+              <w:t>│ 1. Actionable Chunking │ 4–6 sub-tugas konkret harian  │</w:t>
+            </w:r>
+            <w:r>
+              <w:rPr>
+                <w:rFonts w:ascii="Consolas" w:hAnsi="Consolas"/>
+                <w:color w:val="18181B"/>
+                <w:sz w:val="16"/>
+              </w:rPr>
+              <w:br/>
+              <w:t>│ 2. Visual Micro-Pacing │ Status On Track / Behind      │</w:t>
+            </w:r>
+            <w:r>
+              <w:rPr>
+                <w:rFonts w:ascii="Consolas" w:hAnsi="Consolas"/>
+                <w:color w:val="18181B"/>
+                <w:sz w:val="16"/>
+              </w:rPr>
+              <w:br/>
+              <w:t>│ 3. Deep Focus Mode     │ Pomodoro Timer 25/5 terpadu   │</w:t>
+            </w:r>
+            <w:r>
+              <w:rPr>
+                <w:rFonts w:ascii="Consolas" w:hAnsi="Consolas"/>
+                <w:color w:val="18181B"/>
+                <w:sz w:val="16"/>
+              </w:rPr>
+              <w:br/>
+            </w:r>
+            <w:r>
+              <w:rPr>
+                <w:rFonts w:ascii="Consolas" w:hAnsi="Consolas"/>
+                <w:color w:val="18181B"/>
+                <w:sz w:val="16"/>
+              </w:rPr>
+              <w:t>└────────────────────────┴───────────────────────────────┘</w:t>
+            </w:r>
+          </w:p>
+        </w:tc>
+      </w:tr>
+    </w:tbl>
+    <w:p>
+      <w:pPr>
+        <w:spacing w:after="40" w:line="240" w:lineRule="auto"/>
+      </w:pPr>
+    </w:p>
+    <w:p>
+      <w:pPr>
         <w:keepNext/>
         <w:spacing w:before="80" w:after="30"/>
       </w:pPr>
       <w:r>
         <w:rPr>
-          <w:rFonts w:ascii="Times New Roman" w:hAnsi="Times New Roman"/>
           <w:b/>
-          <w:color w:val="000000"/>
         </w:rPr>
         <w:t>3.1 Nilai Inovasi &amp; Fitur Unggulan</w:t>
       </w:r>
     </w:p>
     <w:p>
       <w:pPr>
-        <w:spacing w:after="40" w:line="269" w:lineRule="auto"/>
+        <w:spacing w:after="20"/>
+        <w:ind w:left="360" w:hanging="288"/>
         <w:jc w:val="both"/>
       </w:pPr>
       <w:r>
         <w:rPr>
-          <w:rFonts w:ascii="Times New Roman" w:hAnsi="Times New Roman"/>
-          <w:color w:val="18181B"/>
+          <w:b/>
         </w:rPr>
-        <w:t>1. Dekomposisi Tugas Terarah Berbasis AI: Pengguna memasukkan judul, instruksi dosen, mata kuliah, dan deadline. Mesin AI membedah instruksi menjadi 3–8 sub-tugas konkret terurut. Tiap langkah memuat aksi spesifik (&lt;60 karakter kata kerja aktif), panduan eksekusi praktis, estimasi durasi realistis (25–90 menit), dan target hari terdistribusi merata.</w:t>
+        <w:t>1. Dekomposisi Tugas Terarah Berbasis AI:</w:t>
       </w:r>
     </w:p>
     <w:p>
       <w:pPr>
-        <w:spacing w:after="40" w:line="269" w:lineRule="auto"/>
+        <w:spacing w:after="40"/>
         <w:jc w:val="both"/>
       </w:pPr>
       <w:r>
-        <w:rPr>
-          <w:rFonts w:ascii="Times New Roman" w:hAnsi="Times New Roman"/>
-          <w:color w:val="18181B"/>
-        </w:rPr>
-        <w:t>2. Smart Caching &amp; Deterministic Fallback Engine: Jika tugas serupa pernah dipecah seangkatan, sistem menyajikan cetak biru instan (&lt;20ms, 0 token LLM). Jika terjadi gangguan koneksi, sistem otomatis beralih ke template kurasi kurikulum kategori tugas.</w:t>
+        <w:t>Pengguna cukup memasukkan judul, instruksi dosen, mata kuliah, dan tanggal deadline. Mesin inferensi AI membedah instruksi menjadi 4–6 sub-tugas terstruktur. Tiap langkah memuat:</w:t>
       </w:r>
     </w:p>
     <w:p>
       <w:pPr>
-        <w:spacing w:after="40" w:line="269" w:lineRule="auto"/>
+        <w:spacing w:after="20"/>
+        <w:ind w:left="360" w:hanging="288"/>
         <w:jc w:val="both"/>
       </w:pPr>
       <w:r>
-        <w:rPr>
-          <w:rFonts w:ascii="Times New Roman" w:hAnsi="Times New Roman"/>
-          <w:color w:val="18181B"/>
-        </w:rPr>
-        <w:t>3. Visual Micro-Pacing &amp; Circular Progress Gauge: Status pengerjaan dipantau real-time (On Track, Behind Schedule, Overdue) dengan progress ring dinamis.</w:t>
+        <w:t>•  Judul aksi spesifik (&lt;60 karakter, kata kerja aktif).</w:t>
       </w:r>
     </w:p>
     <w:p>
       <w:pPr>
-        <w:spacing w:after="40" w:line="269" w:lineRule="auto"/>
+        <w:spacing w:after="20"/>
+        <w:ind w:left="360" w:hanging="288"/>
         <w:jc w:val="both"/>
       </w:pPr>
       <w:r>
-        <w:rPr>
-          <w:rFonts w:ascii="Times New Roman" w:hAnsi="Times New Roman"/>
-          <w:color w:val="18181B"/>
-        </w:rPr>
-        <w:t>4. Distraction-Free Focus Engine &amp; Floating Mini-Timer: Pomodoro Timer (25/5 menit) berjalan persisten di latar belakang dengan floating pill, akurasi timestamp Date.now(), sinkronisasi judul tab browser, audio chime Web Audio API, dan desktop notification.</w:t>
+        <w:t>•  Panduan eksekusi konkret (1–2 kalimat petunjuk praktis).</w:t>
       </w:r>
     </w:p>
     <w:p>
       <w:pPr>
-        <w:spacing w:after="40" w:line="269" w:lineRule="auto"/>
+        <w:spacing w:after="20"/>
+        <w:ind w:left="360" w:hanging="288"/>
         <w:jc w:val="both"/>
       </w:pPr>
       <w:r>
-        <w:rPr>
-          <w:rFonts w:ascii="Times New Roman" w:hAnsi="Times New Roman"/>
-          <w:color w:val="18181B"/>
-        </w:rPr>
-        <w:t>5. Integrasi Kalender Nyata: Tombol ekspor berkas standar iCalendar RFC 5545 (.ics) dengan pengingat alarm 15 menit otomatis, serta direct web/app intent ke Google Calendar di smartphone.</w:t>
+        <w:t>•  Estimasi waktu pengerjaan realistis (25–90 menit).</w:t>
       </w:r>
     </w:p>
     <w:p>
       <w:pPr>
-        <w:spacing w:after="40" w:line="269" w:lineRule="auto"/>
+        <w:spacing w:after="20"/>
+        <w:ind w:left="360" w:hanging="288"/>
         <w:jc w:val="both"/>
       </w:pPr>
       <w:r>
+        <w:t xml:space="preserve">•  </w:t>
+      </w:r>
+      <w:r>
+        <w:t>Target hari pelaksanaan (</w:t>
+      </w:r>
+      <w:r>
         <w:rPr>
-          <w:rFonts w:ascii="Times New Roman" w:hAnsi="Times New Roman"/>
-          <w:color w:val="18181B"/>
+          <w:i/>
         </w:rPr>
-        <w:t>6. Task Blueprint Sharing: Fitur berbagi rencana kerja via tautan unik (/p/:id) yang memungkinkan mahasiswa sekelas mengimpor jadwal tugas dalam 1 detik.</w:t>
+        <w:t>day offset</w:t>
+      </w:r>
+      <w:r>
+        <w:t>) yang didistribusikan merata menuju deadline.</w:t>
       </w:r>
     </w:p>
     <w:p>
       <w:pPr>
-        <w:spacing w:after="40" w:line="269" w:lineRule="auto"/>
+        <w:spacing w:after="20"/>
+        <w:ind w:left="360" w:hanging="288"/>
         <w:jc w:val="both"/>
       </w:pPr>
       <w:r>
         <w:rPr>
-          <w:rFonts w:ascii="Times New Roman" w:hAnsi="Times New Roman"/>
-          <w:color w:val="18181B"/>
+          <w:b/>
         </w:rPr>
-        <w:t>7. Zero-Barrier Guest Mode: Pengguna dapat langsung mengakses fitur tanpa hambatan registrasi melalui sinkronisasi dual-layer antara browser localStorage dan MariaDB.</w:t>
+        <w:t>2. Deterministic Fallback Engine (Zero Single Point of Failure):</w:t>
       </w:r>
     </w:p>
     <w:p>
       <w:pPr>
+        <w:spacing w:after="40"/>
+        <w:jc w:val="both"/>
+      </w:pPr>
+      <w:r>
+        <w:t>Jika terjadi gangguan jaringan internet atau latensi API, sistem secara otomatis beralih (</w:t>
+      </w:r>
+      <w:r>
+        <w:rPr>
+          <w:i/>
+        </w:rPr>
+        <w:t>graceful fallback</w:t>
+      </w:r>
+      <w:r>
+        <w:t>) ke template kurasi berbasis kategori tugas (</w:t>
+      </w:r>
+      <w:r>
+        <w:rPr>
+          <w:i/>
+        </w:rPr>
+        <w:t>Laporan Lab, Makalah Teori, Coding Project, Presentasi</w:t>
+      </w:r>
+      <w:r>
+        <w:t>).</w:t>
+      </w:r>
+    </w:p>
+    <w:p>
+      <w:pPr>
+        <w:spacing w:after="20"/>
+        <w:ind w:left="360" w:hanging="288"/>
+        <w:jc w:val="both"/>
+      </w:pPr>
+      <w:r>
+        <w:rPr>
+          <w:b/>
+        </w:rPr>
+        <w:t>3. Visual Micro-Pacing &amp; Pacing Bar:</w:t>
+      </w:r>
+    </w:p>
+    <w:p>
+      <w:pPr>
+        <w:spacing w:after="40"/>
+        <w:jc w:val="both"/>
+      </w:pPr>
+      <w:r>
+        <w:t>Status pengerjaan divisualisasikan secara real-time:</w:t>
+      </w:r>
+    </w:p>
+    <w:p>
+      <w:pPr>
+        <w:spacing w:after="20"/>
+        <w:ind w:left="360" w:hanging="288"/>
+        <w:jc w:val="both"/>
+      </w:pPr>
+      <w:r>
+        <w:t xml:space="preserve">•  </w:t>
+      </w:r>
+      <w:r>
+        <w:t>🟢</w:t>
+      </w:r>
+      <w:r>
+        <w:t xml:space="preserve"> </w:t>
+      </w:r>
+      <w:r>
+        <w:rPr>
+          <w:b/>
+        </w:rPr>
+        <w:t>On Track:</w:t>
+      </w:r>
+      <w:r>
+        <w:t xml:space="preserve"> Pengerjaan berada di depan atau sesuai target ideal harian.</w:t>
+      </w:r>
+    </w:p>
+    <w:p>
+      <w:pPr>
+        <w:spacing w:after="20"/>
+        <w:ind w:left="360" w:hanging="288"/>
+        <w:jc w:val="both"/>
+      </w:pPr>
+      <w:r>
+        <w:t xml:space="preserve">•  </w:t>
+      </w:r>
+      <w:r>
+        <w:t>🟡</w:t>
+      </w:r>
+      <w:r>
+        <w:t xml:space="preserve"> </w:t>
+      </w:r>
+      <w:r>
+        <w:rPr>
+          <w:b/>
+        </w:rPr>
+        <w:t>Behind Schedule:</w:t>
+      </w:r>
+      <w:r>
+        <w:t xml:space="preserve"> Terdapat sub-tugas tertunda sebelum target hari ini.</w:t>
+      </w:r>
+    </w:p>
+    <w:p>
+      <w:pPr>
+        <w:spacing w:after="20"/>
+        <w:ind w:left="360" w:hanging="288"/>
+        <w:jc w:val="both"/>
+      </w:pPr>
+      <w:r>
+        <w:t xml:space="preserve">•  </w:t>
+      </w:r>
+      <w:r>
+        <w:t>🔴</w:t>
+      </w:r>
+      <w:r>
+        <w:t xml:space="preserve"> </w:t>
+      </w:r>
+      <w:r>
+        <w:rPr>
+          <w:b/>
+        </w:rPr>
+        <w:t>Overdue Alert:</w:t>
+      </w:r>
+      <w:r>
+        <w:t xml:space="preserve"> Melewati batas waktu deadline.</w:t>
+      </w:r>
+    </w:p>
+    <w:p>
+      <w:pPr>
+        <w:spacing w:after="20"/>
+        <w:ind w:left="360" w:hanging="288"/>
+        <w:jc w:val="both"/>
+      </w:pPr>
+      <w:r>
+        <w:rPr>
+          <w:b/>
+        </w:rPr>
+        <w:t>4. Distraction-Free Focus Mode (Pomodoro Timer Terpadu):</w:t>
+      </w:r>
+    </w:p>
+    <w:p>
+      <w:pPr>
+        <w:spacing w:after="40"/>
+        <w:jc w:val="both"/>
+      </w:pPr>
+      <w:r>
+        <w:t xml:space="preserve">Tombol </w:t>
+      </w:r>
+      <w:r>
+        <w:rPr>
+          <w:i/>
+        </w:rPr>
+        <w:t>"Mulai Kerjakan"</w:t>
+      </w:r>
+      <w:r>
+        <w:t xml:space="preserve"> pada sub-tugas langsung membuka antarmuka layar penuh fokus Pomodoro (25 menit kerja mendalam, 5 menit istirahat teratur), meminimalisir distraksi media sosial.</w:t>
+      </w:r>
+    </w:p>
+    <w:p>
+      <w:pPr>
+        <w:spacing w:after="20"/>
+        <w:ind w:left="360" w:hanging="288"/>
+        <w:jc w:val="both"/>
+      </w:pPr>
+      <w:r>
+        <w:rPr>
+          <w:b/>
+        </w:rPr>
+        <w:t>5. Zero-Barrier Guest Mode:</w:t>
+      </w:r>
+    </w:p>
+    <w:p>
+      <w:pPr>
+        <w:spacing w:after="40"/>
+        <w:jc w:val="both"/>
+      </w:pPr>
+      <w:r>
+        <w:t>Pengguna dapat langsung menggunakan aplikasi tanpa hambatan registrasi/login (</w:t>
+      </w:r>
+      <w:r>
+        <w:rPr>
+          <w:i/>
+        </w:rPr>
+        <w:t>Guest Mode</w:t>
+      </w:r>
+      <w:r>
+        <w:t xml:space="preserve"> berbasis UUID anonim dan sinkronisasi dual-layer antara </w:t>
+      </w:r>
+      <w:r>
+        <w:rPr>
+          <w:rFonts w:ascii="Consolas" w:hAnsi="Consolas"/>
+          <w:sz w:val="20"/>
+        </w:rPr>
+        <w:t>localStorage</w:t>
+      </w:r>
+      <w:r>
+        <w:t xml:space="preserve"> browser dan MariaDB).</w:t>
+      </w:r>
+    </w:p>
+    <w:p>
+      <w:pPr>
         <w:keepNext/>
-        <w:spacing w:before="120" w:after="40"/>
+        <w:spacing w:before="120" w:after="30"/>
       </w:pPr>
       <w:r>
         <w:rPr>
-          <w:rFonts w:ascii="Times New Roman" w:hAnsi="Times New Roman"/>
           <w:b/>
-          <w:color w:val="000000"/>
           <w:sz w:val="23"/>
         </w:rPr>
         <w:t>4. Target Pengguna &amp; Persona</w:t>
@@ -1374,50 +1943,93 @@
       </w:pPr>
       <w:r>
         <w:rPr>
-          <w:rFonts w:ascii="Times New Roman" w:hAnsi="Times New Roman"/>
           <w:b/>
-          <w:color w:val="000000"/>
         </w:rPr>
         <w:t>4.1 Target Pengguna</w:t>
       </w:r>
     </w:p>
     <w:p>
       <w:pPr>
-        <w:spacing w:after="40" w:line="269" w:lineRule="auto"/>
+        <w:spacing w:after="20"/>
+        <w:ind w:left="360" w:hanging="288"/>
         <w:jc w:val="both"/>
       </w:pPr>
       <w:r>
+        <w:t xml:space="preserve">•  </w:t>
+      </w:r>
+      <w:r>
         <w:rPr>
-          <w:rFonts w:ascii="Times New Roman" w:hAnsi="Times New Roman"/>
-          <w:color w:val="18181B"/>
+          <w:b/>
         </w:rPr>
-        <w:t>• Target Primer: Mahasiswa aktif D3/D4/S1 (usia 18–24 tahun) yang memiliki beban penugasan multi-matakuliah padat.</w:t>
+        <w:t>Target Primer:</w:t>
+      </w:r>
+      <w:r>
+        <w:t xml:space="preserve"> Mahasiswa aktif D3/D4/S1 (usia 18–24 tahun) yang memiliki beban penugasan multi-matakuliah padat.</w:t>
       </w:r>
     </w:p>
     <w:p>
       <w:pPr>
-        <w:spacing w:after="40" w:line="269" w:lineRule="auto"/>
+        <w:spacing w:after="20"/>
+        <w:ind w:left="360" w:hanging="288"/>
         <w:jc w:val="both"/>
       </w:pPr>
       <w:r>
+        <w:t xml:space="preserve">•  </w:t>
+      </w:r>
+      <w:r>
         <w:rPr>
-          <w:rFonts w:ascii="Times New Roman" w:hAnsi="Times New Roman"/>
-          <w:color w:val="18181B"/>
+          <w:b/>
         </w:rPr>
-        <w:t>• Target Sekunder: Pelajar SMA/SMK/sederajat dan fresh graduate pelatihan mandiri.</w:t>
+        <w:t>Target Sekunder:</w:t>
+      </w:r>
+      <w:r>
+        <w:t xml:space="preserve"> Pelajar SMA/SMK/sederajat dan </w:t>
+      </w:r>
+      <w:r>
+        <w:rPr>
+          <w:i/>
+        </w:rPr>
+        <w:t>fresh graduate</w:t>
+      </w:r>
+      <w:r>
+        <w:t xml:space="preserve"> yang sedang menempuh </w:t>
+      </w:r>
+      <w:r>
+        <w:rPr>
+          <w:i/>
+        </w:rPr>
+        <w:t>bootcamp</w:t>
+      </w:r>
+      <w:r>
+        <w:t>/pelatihan mandiri.</w:t>
       </w:r>
     </w:p>
     <w:p>
       <w:pPr>
-        <w:spacing w:after="40" w:line="269" w:lineRule="auto"/>
+        <w:spacing w:after="20"/>
+        <w:ind w:left="360" w:hanging="288"/>
         <w:jc w:val="both"/>
       </w:pPr>
       <w:r>
+        <w:t xml:space="preserve">•  </w:t>
+      </w:r>
+      <w:r>
         <w:rPr>
-          <w:rFonts w:ascii="Times New Roman" w:hAnsi="Times New Roman"/>
-          <w:color w:val="18181B"/>
+          <w:b/>
         </w:rPr>
-        <w:t>• Karakteristik Akses: Akses cepat mobile &amp; web browser, hemat kuota, dan antarmuka clean light mode editorial minimalis anti-slop.</w:t>
+        <w:t>Karakteristik Akses:</w:t>
+      </w:r>
+      <w:r>
+        <w:t xml:space="preserve"> Mengutamakan akses cepat mobile &amp; web browser, kuota hemat, dan antarmuka </w:t>
+      </w:r>
+      <w:r>
+        <w:rPr>
+          <w:i/>
+        </w:rPr>
+        <w:t>light mode</w:t>
+      </w:r>
+      <w:r>
+        <w:t xml:space="preserve"> editorial minimalis yang nyaman dibaca berjam-jam tanpa kelelahan mata.</w:t>
       </w:r>
     </w:p>
     <w:p>
@@ -1427,9 +2039,7 @@
       </w:pPr>
       <w:r>
         <w:rPr>
-          <w:rFonts w:ascii="Times New Roman" w:hAnsi="Times New Roman"/>
           <w:b/>
-          <w:color w:val="000000"/>
         </w:rPr>
         <w:t>4.2 User Persona</w:t>
       </w:r>
@@ -1441,65 +2051,185 @@
       </w:pPr>
       <w:r>
         <w:rPr>
-          <w:rFonts w:ascii="Times New Roman" w:hAnsi="Times New Roman"/>
           <w:b/>
           <w:i/>
-          <w:color w:val="000000"/>
         </w:rPr>
         <w:t>Persona 1: Mahasiswa Aktif Akademik &amp; Organisasi</w:t>
       </w:r>
     </w:p>
     <w:p>
       <w:pPr>
-        <w:spacing w:after="40" w:line="269" w:lineRule="auto"/>
+        <w:spacing w:after="20"/>
+        <w:ind w:left="360" w:hanging="288"/>
         <w:jc w:val="both"/>
       </w:pPr>
       <w:r>
+        <w:t xml:space="preserve">•  </w:t>
+      </w:r>
+      <w:r>
         <w:rPr>
-          <w:rFonts w:ascii="Times New Roman" w:hAnsi="Times New Roman"/>
-          <w:color w:val="18181B"/>
+          <w:b/>
         </w:rPr>
-        <w:t>Nama: Reza Aditya (20 tahun), Mahasiswa Informatika Semester 5. Perilaku: Menghadapi 6 mata kuliah dan 2 praktikum mingguan, aktif di BEM. Pain Point: Menunda tugas besar praktikum karena modul instruksi rumit; panik pada H-1. Kebutuhan: Pemecah tugas otomatis yang memberi panduan kerja 30–45 menit per hari seusai kuliah.</w:t>
+        <w:t>Nama:</w:t>
+      </w:r>
+      <w:r>
+        <w:t xml:space="preserve"> Reza Aditya (20 tahun), Mahasiswa Informatika Semester 5.</w:t>
       </w:r>
     </w:p>
     <w:p>
       <w:pPr>
+        <w:spacing w:after="20"/>
+        <w:ind w:left="360" w:hanging="288"/>
+        <w:jc w:val="both"/>
+      </w:pPr>
+      <w:r>
+        <w:t xml:space="preserve">•  </w:t>
+      </w:r>
+      <w:r>
+        <w:rPr>
+          <w:b/>
+        </w:rPr>
+        <w:t>Perilaku:</w:t>
+      </w:r>
+      <w:r>
+        <w:t xml:space="preserve"> Menghadapi 6 mata kuliah dan 2 praktikum mingguan, aktif di BEM fakultas.</w:t>
+      </w:r>
+    </w:p>
+    <w:p>
+      <w:pPr>
+        <w:spacing w:after="20"/>
+        <w:ind w:left="360" w:hanging="288"/>
+        <w:jc w:val="both"/>
+      </w:pPr>
+      <w:r>
+        <w:t xml:space="preserve">•  </w:t>
+      </w:r>
+      <w:r>
+        <w:rPr>
+          <w:b/>
+        </w:rPr>
+        <w:t>Pain Point:</w:t>
+      </w:r>
+      <w:r>
+        <w:t xml:space="preserve"> Sering menunda pengerjaan tugas besar praktikum karena modul instruksi rumit; merasa bersalah dan terbebani di akhir pekan hingga panik pada H-1.</w:t>
+      </w:r>
+    </w:p>
+    <w:p>
+      <w:pPr>
+        <w:spacing w:after="20"/>
+        <w:ind w:left="360" w:hanging="288"/>
+        <w:jc w:val="both"/>
+      </w:pPr>
+      <w:r>
+        <w:t xml:space="preserve">•  </w:t>
+      </w:r>
+      <w:r>
+        <w:rPr>
+          <w:b/>
+        </w:rPr>
+        <w:t>Kebutuhan:</w:t>
+      </w:r>
+      <w:r>
+        <w:t xml:space="preserve"> Pemecah tugas otomatis yang memberi tahu menu kerja 30–45 menit setiap sore hari seusai kuliah.</w:t>
+      </w:r>
+    </w:p>
+    <w:p>
+      <w:pPr>
         <w:keepNext/>
         <w:spacing w:before="60" w:after="20"/>
       </w:pPr>
       <w:r>
         <w:rPr>
-          <w:rFonts w:ascii="Times New Roman" w:hAnsi="Times New Roman"/>
           <w:b/>
           <w:i/>
-          <w:color w:val="000000"/>
         </w:rPr>
         <w:t>Persona 2: Siswi Sekolah / Pelajar Mandiri</w:t>
       </w:r>
     </w:p>
     <w:p>
       <w:pPr>
-        <w:spacing w:after="40" w:line="269" w:lineRule="auto"/>
+        <w:spacing w:after="20"/>
+        <w:ind w:left="360" w:hanging="288"/>
         <w:jc w:val="both"/>
       </w:pPr>
       <w:r>
+        <w:t xml:space="preserve">•  </w:t>
+      </w:r>
+      <w:r>
         <w:rPr>
-          <w:rFonts w:ascii="Times New Roman" w:hAnsi="Times New Roman"/>
-          <w:color w:val="18181B"/>
+          <w:b/>
         </w:rPr>
-        <w:t>Nama: Siti Nurhaliza (17 tahun), Siswi SMA Kelas 12. Perilaku: Mempersiapkan tugas proyek akhir sekolah mandiri dengan kuota terbatas. Pain Point: Bingung menyusun tahapan karya ilmiah mandiri. Kebutuhan: Platform ringan tanpa login rumit yang memberikan rincian langkah kerja terstruktur.</w:t>
+        <w:t>Nama:</w:t>
+      </w:r>
+      <w:r>
+        <w:t xml:space="preserve"> Siti Nurhaliza (17 tahun), Siswi SMA Kelas 12.</w:t>
       </w:r>
     </w:p>
     <w:p>
       <w:pPr>
+        <w:spacing w:after="20"/>
+        <w:ind w:left="360" w:hanging="288"/>
+        <w:jc w:val="both"/>
+      </w:pPr>
+      <w:r>
+        <w:t xml:space="preserve">•  </w:t>
+      </w:r>
+      <w:r>
+        <w:rPr>
+          <w:b/>
+        </w:rPr>
+        <w:t>Perilaku:</w:t>
+      </w:r>
+      <w:r>
+        <w:t xml:space="preserve"> Mempersiapkan tugas proyek akhir sekolah dan ujian mandiri dengan kuota seluler terbatas.</w:t>
+      </w:r>
+    </w:p>
+    <w:p>
+      <w:pPr>
+        <w:spacing w:after="20"/>
+        <w:ind w:left="360" w:hanging="288"/>
+        <w:jc w:val="both"/>
+      </w:pPr>
+      <w:r>
+        <w:t xml:space="preserve">•  </w:t>
+      </w:r>
+      <w:r>
+        <w:rPr>
+          <w:b/>
+        </w:rPr>
+        <w:t>Pain Point:</w:t>
+      </w:r>
+      <w:r>
+        <w:t xml:space="preserve"> Tidak memiliki bimbingan privat; bingung menyusun langkah kerja tugas karya ilmiah mandiri.</w:t>
+      </w:r>
+    </w:p>
+    <w:p>
+      <w:pPr>
+        <w:spacing w:after="20"/>
+        <w:ind w:left="360" w:hanging="288"/>
+        <w:jc w:val="both"/>
+      </w:pPr>
+      <w:r>
+        <w:t xml:space="preserve">•  </w:t>
+      </w:r>
+      <w:r>
+        <w:rPr>
+          <w:b/>
+        </w:rPr>
+        <w:t>Kebutuhan:</w:t>
+      </w:r>
+      <w:r>
+        <w:t xml:space="preserve"> Platform ringan, tidak membutuhkan login rumit, dan memberikan panduan kerja langkah demi langkah.</w:t>
+      </w:r>
+    </w:p>
+    <w:p>
+      <w:pPr>
         <w:keepNext/>
-        <w:spacing w:before="120" w:after="40"/>
+        <w:spacing w:before="120" w:after="30"/>
       </w:pPr>
       <w:r>
         <w:rPr>
-          <w:rFonts w:ascii="Times New Roman" w:hAnsi="Times New Roman"/>
           <w:b/>
-          <w:color w:val="000000"/>
           <w:sz w:val="23"/>
         </w:rPr>
         <w:t>5. Dampak &amp; Indikator Keberhasilan</w:t>
@@ -1507,55 +2237,98 @@
     </w:p>
     <w:p>
       <w:pPr>
+        <w:spacing w:after="40"/>
+        <w:jc w:val="both"/>
+      </w:pPr>
+      <w:r>
+        <w:t>Inovasi KilasTugas dirancang untuk memberikan dampak terukur terhadap ekosistem belajar digital:</w:t>
+      </w:r>
+    </w:p>
+    <w:p>
+      <w:pPr>
         <w:keepNext/>
         <w:spacing w:before="80" w:after="30"/>
       </w:pPr>
       <w:r>
         <w:rPr>
-          <w:rFonts w:ascii="Times New Roman" w:hAnsi="Times New Roman"/>
           <w:b/>
-          <w:color w:val="000000"/>
         </w:rPr>
         <w:t>5.1 Dampak Kualitatif</w:t>
       </w:r>
     </w:p>
     <w:p>
       <w:pPr>
-        <w:spacing w:after="40" w:line="269" w:lineRule="auto"/>
+        <w:spacing w:after="20"/>
+        <w:ind w:left="360" w:hanging="288"/>
         <w:jc w:val="both"/>
       </w:pPr>
       <w:r>
         <w:rPr>
-          <w:rFonts w:ascii="Times New Roman" w:hAnsi="Times New Roman"/>
-          <w:color w:val="18181B"/>
+          <w:b/>
         </w:rPr>
-        <w:t>1. Reduksi Kecemasan Akademik: Mengeliminasi sindrom Task Paralysis saat menerima penugasan tebal.</w:t>
+        <w:t>1. Reduksi Kecemasan Akademik:</w:t>
+      </w:r>
+      <w:r>
+        <w:t xml:space="preserve"> Menghilangkan sindrom </w:t>
+      </w:r>
+      <w:r>
+        <w:rPr>
+          <w:i/>
+        </w:rPr>
+        <w:t>Overwhelm Freeze</w:t>
+      </w:r>
+      <w:r>
+        <w:t xml:space="preserve"> saat menerima tugas berbobot besar.</w:t>
       </w:r>
     </w:p>
     <w:p>
       <w:pPr>
-        <w:spacing w:after="40" w:line="269" w:lineRule="auto"/>
+        <w:spacing w:after="20"/>
+        <w:ind w:left="360" w:hanging="288"/>
         <w:jc w:val="both"/>
       </w:pPr>
       <w:r>
         <w:rPr>
-          <w:rFonts w:ascii="Times New Roman" w:hAnsi="Times New Roman"/>
-          <w:color w:val="18181B"/>
+          <w:b/>
         </w:rPr>
-        <w:t>2. Peningkatan Mutu Luaran Tugas: Tugas yang dicicil bertahap memiliki kedalaman analisis dan kerapian jauh lebih tinggi dibanding hasil kerja semalam.</w:t>
+        <w:t>2. Peningkatan Kualitas Luaran Akademik:</w:t>
+      </w:r>
+      <w:r>
+        <w:t xml:space="preserve"> Tugas yang dicicil teratur memiliki kedalaman materi, orisinalitas riset, dan kerapian yang jauh lebih tinggi dibanding hasil kerja tergesa-gesa semalam.</w:t>
       </w:r>
     </w:p>
     <w:p>
       <w:pPr>
-        <w:spacing w:after="40" w:line="269" w:lineRule="auto"/>
+        <w:spacing w:after="20"/>
+        <w:ind w:left="360" w:hanging="288"/>
         <w:jc w:val="both"/>
       </w:pPr>
       <w:r>
         <w:rPr>
-          <w:rFonts w:ascii="Times New Roman" w:hAnsi="Times New Roman"/>
-          <w:color w:val="18181B"/>
+          <w:b/>
         </w:rPr>
-        <w:t>3. Pembentukan Disiplin Belajar: Menumbuhkan kebiasaan micro-habits dan deep work terarah.</w:t>
+        <w:t>3. Pemberdayaan Disiplin Diri:</w:t>
+      </w:r>
+      <w:r>
+        <w:t xml:space="preserve"> Membentuk kebiasaan belajar berbasis </w:t>
+      </w:r>
+      <w:r>
+        <w:rPr>
+          <w:i/>
+        </w:rPr>
+        <w:t>micro-habits</w:t>
+      </w:r>
+      <w:r>
+        <w:t xml:space="preserve"> dan fokus mendalam (</w:t>
+      </w:r>
+      <w:r>
+        <w:rPr>
+          <w:i/>
+        </w:rPr>
+        <w:t>deep work</w:t>
+      </w:r>
+      <w:r>
+        <w:t>).</w:t>
       </w:r>
     </w:p>
     <w:p>
@@ -1565,12 +2338,15 @@
       </w:pPr>
       <w:r>
         <w:rPr>
-          <w:rFonts w:ascii="Times New Roman" w:hAnsi="Times New Roman"/>
           <w:b/>
-          <w:color w:val="000000"/>
         </w:rPr>
         <w:t>5.2 Indikator Keberhasilan Terukur (KPI Produk)</w:t>
       </w:r>
+    </w:p>
+    <w:p>
+      <w:pPr>
+        <w:spacing w:after="60" w:line="240" w:lineRule="auto"/>
+      </w:pPr>
     </w:p>
     <w:tbl>
       <w:tblPr>
@@ -1584,25 +2360,27 @@
           <w:insideH w:val="single" w:sz="4" w:space="0" w:color="000000"/>
           <w:insideV w:val="single" w:sz="4" w:space="0" w:color="000000"/>
         </w:tblBorders>
+        <w:tblLayout w:type="fixed"/>
         <w:tblLook w:val="04A0" w:firstRow="1" w:lastRow="0" w:firstColumn="1" w:lastColumn="0" w:noHBand="0" w:noVBand="1"/>
       </w:tblPr>
       <w:tblGrid>
-        <w:gridCol w:w="1071"/>
-        <w:gridCol w:w="1197"/>
+        <w:gridCol w:w="3030"/>
+        <w:gridCol w:w="5927"/>
       </w:tblGrid>
       <w:tr>
         <w:trPr>
+          <w:cantSplit/>
           <w:tblHeader/>
           <w:jc w:val="center"/>
         </w:trPr>
         <w:tc>
           <w:tcPr>
-            <w:tcW w:w="8" w:type="dxa"/>
-            <w:shd w:val="clear" w:color="auto" w:fill="E4E4E7"/>
+            <w:tcW w:w="3030" w:type="dxa"/>
+            <w:shd w:val="clear" w:color="auto" w:fill="F4F4F5"/>
             <w:tcMar>
-              <w:top w:w="35" w:type="dxa"/>
+              <w:top w:w="30" w:type="dxa"/>
               <w:left w:w="60" w:type="dxa"/>
-              <w:bottom w:w="35" w:type="dxa"/>
+              <w:bottom w:w="30" w:type="dxa"/>
               <w:right w:w="60" w:type="dxa"/>
             </w:tcMar>
           </w:tcPr>
@@ -1613,9 +2391,7 @@
             </w:pPr>
             <w:r>
               <w:rPr>
-                <w:rFonts w:ascii="Times New Roman" w:hAnsi="Times New Roman"/>
                 <w:b/>
-                <w:color w:val="000000"/>
                 <w:sz w:val="19"/>
               </w:rPr>
               <w:t>Metrik Evaluasi</w:t>
@@ -1624,12 +2400,12 @@
         </w:tc>
         <w:tc>
           <w:tcPr>
-            <w:tcW w:w="6" w:type="dxa"/>
-            <w:shd w:val="clear" w:color="auto" w:fill="E4E4E7"/>
+            <w:tcW w:w="5927" w:type="dxa"/>
+            <w:shd w:val="clear" w:color="auto" w:fill="F4F4F5"/>
             <w:tcMar>
-              <w:top w:w="35" w:type="dxa"/>
+              <w:top w:w="30" w:type="dxa"/>
               <w:left w:w="60" w:type="dxa"/>
-              <w:bottom w:w="35" w:type="dxa"/>
+              <w:bottom w:w="30" w:type="dxa"/>
               <w:right w:w="60" w:type="dxa"/>
             </w:tcMar>
           </w:tcPr>
@@ -1640,9 +2416,7 @@
             </w:pPr>
             <w:r>
               <w:rPr>
-                <w:rFonts w:ascii="Times New Roman" w:hAnsi="Times New Roman"/>
                 <w:b/>
-                <w:color w:val="000000"/>
                 <w:sz w:val="19"/>
               </w:rPr>
               <w:t>Target Capaian (Tahap Pengujian &amp; Pilot)</w:t>
@@ -1657,7 +2431,7 @@
         </w:trPr>
         <w:tc>
           <w:tcPr>
-            <w:tcW w:w="8" w:type="dxa"/>
+            <w:tcW w:w="3030" w:type="dxa"/>
             <w:tcMar>
               <w:top w:w="30" w:type="dxa"/>
               <w:left w:w="60" w:type="dxa"/>
@@ -1671,9 +2445,7 @@
             </w:pPr>
             <w:r>
               <w:rPr>
-                <w:rFonts w:ascii="Times New Roman" w:hAnsi="Times New Roman"/>
                 <w:b/>
-                <w:color w:val="000000"/>
                 <w:sz w:val="19"/>
               </w:rPr>
               <w:t>Task Initiation Rate</w:t>
@@ -1682,38 +2454,7 @@
         </w:tc>
         <w:tc>
           <w:tcPr>
-            <w:tcW w:w="6" w:type="dxa"/>
-            <w:tcMar>
-              <w:top w:w="30" w:type="dxa"/>
-              <w:left w:w="60" w:type="dxa"/>
-              <w:bottom w:w="30" w:type="dxa"/>
-              <w:right w:w="60" w:type="dxa"/>
-            </w:tcMar>
-          </w:tcPr>
-          <w:p>
-            <w:pPr>
-              <w:spacing w:after="0" w:line="240" w:lineRule="auto"/>
-              <w:jc w:val="center"/>
-            </w:pPr>
-            <w:r>
-              <w:rPr>
-                <w:rFonts w:ascii="Times New Roman" w:hAnsi="Times New Roman"/>
-                <w:color w:val="000000"/>
-                <w:sz w:val="19"/>
-              </w:rPr>
-              <w:t>&gt;85% pengguna mengeksekusi sub-tugas pertama dalam &lt;24 jam.</w:t>
-            </w:r>
-          </w:p>
-        </w:tc>
-      </w:tr>
-      <w:tr>
-        <w:trPr>
-          <w:cantSplit/>
-          <w:jc w:val="center"/>
-        </w:trPr>
-        <w:tc>
-          <w:tcPr>
-            <w:tcW w:w="8" w:type="dxa"/>
+            <w:tcW w:w="5927" w:type="dxa"/>
             <w:tcMar>
               <w:top w:w="30" w:type="dxa"/>
               <w:left w:w="60" w:type="dxa"/>
@@ -1727,37 +2468,9 @@
             </w:pPr>
             <w:r>
               <w:rPr>
-                <w:rFonts w:ascii="Times New Roman" w:hAnsi="Times New Roman"/>
-                <w:b/>
-                <w:color w:val="000000"/>
                 <w:sz w:val="19"/>
               </w:rPr>
-              <w:t>Task Completion Rate</w:t>
-            </w:r>
-          </w:p>
-        </w:tc>
-        <w:tc>
-          <w:tcPr>
-            <w:tcW w:w="6" w:type="dxa"/>
-            <w:tcMar>
-              <w:top w:w="30" w:type="dxa"/>
-              <w:left w:w="60" w:type="dxa"/>
-              <w:bottom w:w="30" w:type="dxa"/>
-              <w:right w:w="60" w:type="dxa"/>
-            </w:tcMar>
-          </w:tcPr>
-          <w:p>
-            <w:pPr>
-              <w:spacing w:after="0" w:line="240" w:lineRule="auto"/>
-              <w:jc w:val="center"/>
-            </w:pPr>
-            <w:r>
-              <w:rPr>
-                <w:rFonts w:ascii="Times New Roman" w:hAnsi="Times New Roman"/>
-                <w:color w:val="000000"/>
-                <w:sz w:val="19"/>
-              </w:rPr>
-              <w:t>Peningkatan tingkat tuntas tepat waktu dari 50% menjadi &gt;80%.</w:t>
+              <w:t>&gt;85% pengguna mengeksekusi sub-tugas pertama dalam &lt;24 jam sejak tugas diinput.</w:t>
             </w:r>
           </w:p>
         </w:tc>
@@ -1769,7 +2482,7 @@
         </w:trPr>
         <w:tc>
           <w:tcPr>
-            <w:tcW w:w="8" w:type="dxa"/>
+            <w:tcW w:w="3030" w:type="dxa"/>
             <w:tcMar>
               <w:top w:w="30" w:type="dxa"/>
               <w:left w:w="60" w:type="dxa"/>
@@ -1783,49 +2496,16 @@
             </w:pPr>
             <w:r>
               <w:rPr>
-                <w:rFonts w:ascii="Times New Roman" w:hAnsi="Times New Roman"/>
                 <w:b/>
-                <w:color w:val="000000"/>
                 <w:sz w:val="19"/>
               </w:rPr>
-              <w:t>Response Latency Breakdown</w:t>
+              <w:t>Task Completion Rate</w:t>
             </w:r>
           </w:p>
         </w:tc>
         <w:tc>
           <w:tcPr>
-            <w:tcW w:w="6" w:type="dxa"/>
-            <w:tcMar>
-              <w:top w:w="30" w:type="dxa"/>
-              <w:left w:w="60" w:type="dxa"/>
-              <w:bottom w:w="30" w:type="dxa"/>
-              <w:right w:w="60" w:type="dxa"/>
-            </w:tcMar>
-          </w:tcPr>
-          <w:p>
-            <w:pPr>
-              <w:spacing w:after="0" w:line="240" w:lineRule="auto"/>
-              <w:jc w:val="center"/>
-            </w:pPr>
-            <w:r>
-              <w:rPr>
-                <w:rFonts w:ascii="Times New Roman" w:hAnsi="Times New Roman"/>
-                <w:color w:val="000000"/>
-                <w:sz w:val="19"/>
-              </w:rPr>
-              <w:t>Penguraian tugas selesai dalam &lt;2 detik via 9Router local inference.</w:t>
-            </w:r>
-          </w:p>
-        </w:tc>
-      </w:tr>
-      <w:tr>
-        <w:trPr>
-          <w:cantSplit/>
-          <w:jc w:val="center"/>
-        </w:trPr>
-        <w:tc>
-          <w:tcPr>
-            <w:tcW w:w="8" w:type="dxa"/>
+            <w:tcW w:w="5927" w:type="dxa"/>
             <w:tcMar>
               <w:top w:w="30" w:type="dxa"/>
               <w:left w:w="60" w:type="dxa"/>
@@ -1839,37 +2519,22 @@
             </w:pPr>
             <w:r>
               <w:rPr>
-                <w:rFonts w:ascii="Times New Roman" w:hAnsi="Times New Roman"/>
-                <w:b/>
-                <w:color w:val="000000"/>
                 <w:sz w:val="19"/>
               </w:rPr>
-              <w:t>System Reliability &amp; Availability</w:t>
+              <w:t xml:space="preserve">Peningkatan tingkat penyelesaian tugas tepat waktu dari 50% menjadi </w:t>
             </w:r>
-          </w:p>
-        </w:tc>
-        <w:tc>
-          <w:tcPr>
-            <w:tcW w:w="6" w:type="dxa"/>
-            <w:tcMar>
-              <w:top w:w="30" w:type="dxa"/>
-              <w:left w:w="60" w:type="dxa"/>
-              <w:bottom w:w="30" w:type="dxa"/>
-              <w:right w:w="60" w:type="dxa"/>
-            </w:tcMar>
-          </w:tcPr>
-          <w:p>
-            <w:pPr>
-              <w:spacing w:after="0" w:line="240" w:lineRule="auto"/>
-              <w:jc w:val="center"/>
-            </w:pPr>
             <w:r>
               <w:rPr>
-                <w:rFonts w:ascii="Times New Roman" w:hAnsi="Times New Roman"/>
-                <w:color w:val="000000"/>
+                <w:b/>
                 <w:sz w:val="19"/>
               </w:rPr>
-              <w:t>100% uptime ketersediaan fitur berkat AI + Smart Cache + Fallback Template.</w:t>
+              <w:t>&gt;80%</w:t>
+            </w:r>
+            <w:r>
+              <w:rPr>
+                <w:sz w:val="19"/>
+              </w:rPr>
+              <w:t>.</w:t>
             </w:r>
           </w:p>
         </w:tc>
@@ -1881,7 +2546,7 @@
         </w:trPr>
         <w:tc>
           <w:tcPr>
-            <w:tcW w:w="8" w:type="dxa"/>
+            <w:tcW w:w="3030" w:type="dxa"/>
             <w:tcMar>
               <w:top w:w="30" w:type="dxa"/>
               <w:left w:w="60" w:type="dxa"/>
@@ -1895,236 +2560,16 @@
             </w:pPr>
             <w:r>
               <w:rPr>
-                <w:rFonts w:ascii="Times New Roman" w:hAnsi="Times New Roman"/>
                 <w:b/>
-                <w:color w:val="000000"/>
                 <w:sz w:val="19"/>
               </w:rPr>
-              <w:t>Usability / User Satisfaction</w:t>
+              <w:t>Response Latency AI Breakdown</w:t>
             </w:r>
           </w:p>
         </w:tc>
         <w:tc>
           <w:tcPr>
-            <w:tcW w:w="6" w:type="dxa"/>
-            <w:tcMar>
-              <w:top w:w="30" w:type="dxa"/>
-              <w:left w:w="60" w:type="dxa"/>
-              <w:bottom w:w="30" w:type="dxa"/>
-              <w:right w:w="60" w:type="dxa"/>
-            </w:tcMar>
-          </w:tcPr>
-          <w:p>
-            <w:pPr>
-              <w:spacing w:after="0" w:line="240" w:lineRule="auto"/>
-              <w:jc w:val="center"/>
-            </w:pPr>
-            <w:r>
-              <w:rPr>
-                <w:rFonts w:ascii="Times New Roman" w:hAnsi="Times New Roman"/>
-                <w:color w:val="000000"/>
-                <w:sz w:val="19"/>
-              </w:rPr>
-              <w:t>Skor SUS (System Usability Scale) &gt;80 (Kategori Excellent).</w:t>
-            </w:r>
-          </w:p>
-        </w:tc>
-      </w:tr>
-    </w:tbl>
-    <w:p>
-      <w:pPr>
-        <w:keepNext/>
-        <w:spacing w:before="120" w:after="40"/>
-      </w:pPr>
-      <w:r>
-        <w:rPr>
-          <w:rFonts w:ascii="Times New Roman" w:hAnsi="Times New Roman"/>
-          <w:b/>
-          <w:color w:val="000000"/>
-          <w:sz w:val="23"/>
-        </w:rPr>
-        <w:t>6. Teknologi yang Digunakan</w:t>
-      </w:r>
-    </w:p>
-    <w:p>
-      <w:pPr>
-        <w:spacing w:after="40" w:line="269" w:lineRule="auto"/>
-        <w:jc w:val="both"/>
-      </w:pPr>
-      <w:r>
-        <w:rPr>
-          <w:rFonts w:ascii="Times New Roman" w:hAnsi="Times New Roman"/>
-          <w:color w:val="18181B"/>
-        </w:rPr>
-        <w:t>Arsitektur KilasTugas mengadopsi prinsip efisiensi komputasi, keandalan data (high availability), dan kesiapan operasional daring penuh:</w:t>
-      </w:r>
-    </w:p>
-    <w:p>
-      <w:pPr>
-        <w:spacing w:after="40" w:line="269" w:lineRule="auto"/>
-        <w:jc w:val="both"/>
-      </w:pPr>
-      <w:r>
-        <w:rPr>
-          <w:rFonts w:ascii="Times New Roman" w:hAnsi="Times New Roman"/>
-          <w:color w:val="18181B"/>
-        </w:rPr>
-        <w:t>• Frontend Layer: Single Page Application React 18, Vite 5, Tailwind CSS, dan Lucide Icons berukuran sangat ringan (&lt;90KB gzip), responsif multi-device (Mobile, Tablet, Desktop) dideploy pada Vercel Global Edge Network (https://kilastugas.vercel.app).</w:t>
-      </w:r>
-    </w:p>
-    <w:p>
-      <w:pPr>
-        <w:spacing w:after="40" w:line="269" w:lineRule="auto"/>
-        <w:jc w:val="both"/>
-      </w:pPr>
-      <w:r>
-        <w:rPr>
-          <w:rFonts w:ascii="Times New Roman" w:hAnsi="Times New Roman"/>
-          <w:color w:val="18181B"/>
-        </w:rPr>
-        <w:t>• Backend Layer: Framework Python 3.12 FastAPI asinkronus performa tinggi dengan validasi Pydantic v2, terpasang pada VPS Ubuntu Linux dengan Nginx reverse proxy dan SSL Let's Encrypt (https://api-kilastugas.najmifaza.my.id).</w:t>
-      </w:r>
-    </w:p>
-    <w:p>
-      <w:pPr>
-        <w:spacing w:after="40" w:line="269" w:lineRule="auto"/>
-        <w:jc w:val="both"/>
-      </w:pPr>
-      <w:r>
-        <w:rPr>
-          <w:rFonts w:ascii="Times New Roman" w:hAnsi="Times New Roman"/>
-          <w:color w:val="18181B"/>
-        </w:rPr>
-        <w:t>• AI Inference &amp; Smart Cache: Terhubung ke gateway 9Router lokal port 20128 dengan model ag/gemini-3.7-flash-medium, diperkuat mekanisme Smart Cache pencocokan kesamaan tugas pada basis data.</w:t>
-      </w:r>
-    </w:p>
-    <w:p>
-      <w:pPr>
-        <w:spacing w:after="40" w:line="269" w:lineRule="auto"/>
-        <w:jc w:val="both"/>
-      </w:pPr>
-      <w:r>
-        <w:rPr>
-          <w:rFonts w:ascii="Times New Roman" w:hAnsi="Times New Roman"/>
-          <w:color w:val="18181B"/>
-        </w:rPr>
-        <w:t>• Data Persistence: Basis data MariaDB 10.x dengan skema relasional terstruktur (sessions, tasks, subtasks, pomodoro_sessions) didukung lapisan localStorage peramban.</w:t>
-      </w:r>
-    </w:p>
-    <w:p>
-      <w:pPr>
-        <w:keepNext/>
-        <w:spacing w:before="120" w:after="40"/>
-      </w:pPr>
-      <w:r>
-        <w:rPr>
-          <w:rFonts w:ascii="Times New Roman" w:hAnsi="Times New Roman"/>
-          <w:b/>
-          <w:color w:val="000000"/>
-          <w:sz w:val="23"/>
-        </w:rPr>
-        <w:t>7. AI Usage Declaration (Deklarasi Penggunaan AI)</w:t>
-      </w:r>
-    </w:p>
-    <w:p>
-      <w:pPr>
-        <w:spacing w:after="40" w:line="269" w:lineRule="auto"/>
-        <w:jc w:val="both"/>
-      </w:pPr>
-      <w:r>
-        <w:rPr>
-          <w:rFonts w:ascii="Times New Roman" w:hAnsi="Times New Roman"/>
-          <w:color w:val="18181B"/>
-        </w:rPr>
-        <w:t>Sesuai ketentuan integritas kompetisi pada Bab 5.3 &amp; Bab 5.6 Guidebook SIFest Digital Innovation Challenge 2026, tim mendeklarasikan pemanfaatan AI secara jujur dan transparan:</w:t>
-      </w:r>
-    </w:p>
-    <w:tbl>
-      <w:tblPr>
-        <w:tblW w:w="0" w:type="auto"/>
-        <w:jc w:val="center"/>
-        <w:tblBorders>
-          <w:top w:val="single" w:sz="4" w:space="0" w:color="000000"/>
-          <w:left w:val="single" w:sz="4" w:space="0" w:color="000000"/>
-          <w:bottom w:val="single" w:sz="4" w:space="0" w:color="000000"/>
-          <w:right w:val="single" w:sz="4" w:space="0" w:color="000000"/>
-          <w:insideH w:val="single" w:sz="4" w:space="0" w:color="000000"/>
-          <w:insideV w:val="single" w:sz="4" w:space="0" w:color="000000"/>
-        </w:tblBorders>
-        <w:tblLook w:val="04A0" w:firstRow="1" w:lastRow="0" w:firstColumn="1" w:lastColumn="0" w:noHBand="0" w:noVBand="1"/>
-      </w:tblPr>
-      <w:tblGrid>
-        <w:gridCol w:w="1366"/>
-        <w:gridCol w:w="1397"/>
-      </w:tblGrid>
-      <w:tr>
-        <w:trPr>
-          <w:tblHeader/>
-          <w:jc w:val="center"/>
-        </w:trPr>
-        <w:tc>
-          <w:tcPr>
-            <w:tcW w:w="5" w:type="dxa"/>
-            <w:shd w:val="clear" w:color="auto" w:fill="E4E4E7"/>
-            <w:tcMar>
-              <w:top w:w="35" w:type="dxa"/>
-              <w:left w:w="60" w:type="dxa"/>
-              <w:bottom w:w="35" w:type="dxa"/>
-              <w:right w:w="60" w:type="dxa"/>
-            </w:tcMar>
-          </w:tcPr>
-          <w:p>
-            <w:pPr>
-              <w:spacing w:after="0" w:line="240" w:lineRule="auto"/>
-              <w:jc w:val="center"/>
-            </w:pPr>
-            <w:r>
-              <w:rPr>
-                <w:rFonts w:ascii="Times New Roman" w:hAnsi="Times New Roman"/>
-                <w:b/>
-                <w:color w:val="000000"/>
-                <w:sz w:val="19"/>
-              </w:rPr>
-              <w:t>Aspek Pemanfaatan</w:t>
-            </w:r>
-          </w:p>
-        </w:tc>
-        <w:tc>
-          <w:tcPr>
-            <w:tcW w:w="9" w:type="dxa"/>
-            <w:shd w:val="clear" w:color="auto" w:fill="E4E4E7"/>
-            <w:tcMar>
-              <w:top w:w="35" w:type="dxa"/>
-              <w:left w:w="60" w:type="dxa"/>
-              <w:bottom w:w="35" w:type="dxa"/>
-              <w:right w:w="60" w:type="dxa"/>
-            </w:tcMar>
-          </w:tcPr>
-          <w:p>
-            <w:pPr>
-              <w:spacing w:after="0" w:line="240" w:lineRule="auto"/>
-              <w:jc w:val="center"/>
-            </w:pPr>
-            <w:r>
-              <w:rPr>
-                <w:rFonts w:ascii="Times New Roman" w:hAnsi="Times New Roman"/>
-                <w:b/>
-                <w:color w:val="000000"/>
-                <w:sz w:val="19"/>
-              </w:rPr>
-              <w:t>Rincian Pemanfaatan AI</w:t>
-            </w:r>
-          </w:p>
-        </w:tc>
-      </w:tr>
-      <w:tr>
-        <w:trPr>
-          <w:cantSplit/>
-          <w:jc w:val="center"/>
-        </w:trPr>
-        <w:tc>
-          <w:tcPr>
-            <w:tcW w:w="5" w:type="dxa"/>
+            <w:tcW w:w="5927" w:type="dxa"/>
             <w:tcMar>
               <w:top w:w="30" w:type="dxa"/>
               <w:left w:w="60" w:type="dxa"/>
@@ -2138,18 +2583,34 @@
             </w:pPr>
             <w:r>
               <w:rPr>
-                <w:rFonts w:ascii="Times New Roman" w:hAnsi="Times New Roman"/>
-                <w:b/>
-                <w:color w:val="000000"/>
                 <w:sz w:val="19"/>
               </w:rPr>
-              <w:t>Fitur Runtime Produk</w:t>
+              <w:t xml:space="preserve">Penguraian tugas selesai dalam </w:t>
+            </w:r>
+            <w:r>
+              <w:rPr>
+                <w:b/>
+                <w:sz w:val="19"/>
+              </w:rPr>
+              <w:t>&lt;3 detik</w:t>
+            </w:r>
+            <w:r>
+              <w:rPr>
+                <w:sz w:val="19"/>
+              </w:rPr>
+              <w:t xml:space="preserve"> via model inferensi lokal.</w:t>
             </w:r>
           </w:p>
         </w:tc>
+      </w:tr>
+      <w:tr>
+        <w:trPr>
+          <w:cantSplit/>
+          <w:jc w:val="center"/>
+        </w:trPr>
         <w:tc>
           <w:tcPr>
-            <w:tcW w:w="9" w:type="dxa"/>
+            <w:tcW w:w="3030" w:type="dxa"/>
             <w:tcMar>
               <w:top w:w="30" w:type="dxa"/>
               <w:left w:w="60" w:type="dxa"/>
@@ -2163,23 +2624,16 @@
             </w:pPr>
             <w:r>
               <w:rPr>
-                <w:rFonts w:ascii="Times New Roman" w:hAnsi="Times New Roman"/>
-                <w:color w:val="000000"/>
+                <w:b/>
                 <w:sz w:val="19"/>
               </w:rPr>
-              <w:t>9Router (ag/gemini-3.7-flash-medium) mentransformasi teks instruksi tugas menjadi array sub-tugas terstruktur.</w:t>
+              <w:t>System Reliability &amp; Availability</w:t>
             </w:r>
           </w:p>
         </w:tc>
-      </w:tr>
-      <w:tr>
-        <w:trPr>
-          <w:cantSplit/>
-          <w:jc w:val="center"/>
-        </w:trPr>
         <w:tc>
           <w:tcPr>
-            <w:tcW w:w="5" w:type="dxa"/>
+            <w:tcW w:w="5927" w:type="dxa"/>
             <w:tcMar>
               <w:top w:w="30" w:type="dxa"/>
               <w:left w:w="60" w:type="dxa"/>
@@ -2193,18 +2647,28 @@
             </w:pPr>
             <w:r>
               <w:rPr>
-                <w:rFonts w:ascii="Times New Roman" w:hAnsi="Times New Roman"/>
                 <w:b/>
-                <w:color w:val="000000"/>
                 <w:sz w:val="19"/>
               </w:rPr>
-              <w:t>Bantuan Pengembangan Kode</w:t>
+              <w:t>100% uptime ketersediaan fitur</w:t>
+            </w:r>
+            <w:r>
+              <w:rPr>
+                <w:sz w:val="19"/>
+              </w:rPr>
+              <w:t xml:space="preserve"> berkat dual-engine (AI + Fallback Template).</w:t>
             </w:r>
           </w:p>
         </w:tc>
+      </w:tr>
+      <w:tr>
+        <w:trPr>
+          <w:cantSplit/>
+          <w:jc w:val="center"/>
+        </w:trPr>
         <w:tc>
           <w:tcPr>
-            <w:tcW w:w="9" w:type="dxa"/>
+            <w:tcW w:w="3030" w:type="dxa"/>
             <w:tcMar>
               <w:top w:w="30" w:type="dxa"/>
               <w:left w:w="60" w:type="dxa"/>
@@ -2218,23 +2682,16 @@
             </w:pPr>
             <w:r>
               <w:rPr>
-                <w:rFonts w:ascii="Times New Roman" w:hAnsi="Times New Roman"/>
-                <w:color w:val="000000"/>
+                <w:b/>
                 <w:sz w:val="19"/>
               </w:rPr>
-              <w:t>Autocomplete sintaksis boilerplates, pengecekan tipe skema Pydantic, dan validasi ekspresi regex.</w:t>
+              <w:t>Usability / User Satisfaction</w:t>
             </w:r>
           </w:p>
         </w:tc>
-      </w:tr>
-      <w:tr>
-        <w:trPr>
-          <w:cantSplit/>
-          <w:jc w:val="center"/>
-        </w:trPr>
         <w:tc>
           <w:tcPr>
-            <w:tcW w:w="5" w:type="dxa"/>
+            <w:tcW w:w="5927" w:type="dxa"/>
             <w:tcMar>
               <w:top w:w="30" w:type="dxa"/>
               <w:left w:w="60" w:type="dxa"/>
@@ -2248,22 +2705,111 @@
             </w:pPr>
             <w:r>
               <w:rPr>
-                <w:rFonts w:ascii="Times New Roman" w:hAnsi="Times New Roman"/>
-                <w:b/>
-                <w:color w:val="000000"/>
                 <w:sz w:val="19"/>
               </w:rPr>
-              <w:t>Perancangan Antarmuka</w:t>
+              <w:t>Skor SUS (</w:t>
+            </w:r>
+            <w:r>
+              <w:rPr>
+                <w:i/>
+                <w:sz w:val="19"/>
+              </w:rPr>
+              <w:t>System Usability Scale</w:t>
+            </w:r>
+            <w:r>
+              <w:rPr>
+                <w:sz w:val="19"/>
+              </w:rPr>
+              <w:t xml:space="preserve">) </w:t>
+            </w:r>
+            <w:r>
+              <w:rPr>
+                <w:b/>
+                <w:sz w:val="19"/>
+              </w:rPr>
+              <w:t>&gt;80 (Kategori Excellent)</w:t>
+            </w:r>
+            <w:r>
+              <w:rPr>
+                <w:sz w:val="19"/>
+              </w:rPr>
+              <w:t>.</w:t>
             </w:r>
           </w:p>
         </w:tc>
+      </w:tr>
+    </w:tbl>
+    <w:p>
+      <w:pPr>
+        <w:spacing w:after="60" w:line="240" w:lineRule="auto"/>
+      </w:pPr>
+    </w:p>
+    <w:p>
+      <w:pPr>
+        <w:keepNext/>
+        <w:spacing w:before="120" w:after="30"/>
+      </w:pPr>
+      <w:r>
+        <w:rPr>
+          <w:b/>
+          <w:sz w:val="23"/>
+        </w:rPr>
+        <w:t>6. Teknologi yang Digunakan</w:t>
+      </w:r>
+    </w:p>
+    <w:p>
+      <w:pPr>
+        <w:spacing w:after="40"/>
+        <w:jc w:val="both"/>
+      </w:pPr>
+      <w:r>
+        <w:t>Arsitektur KilasTugas mengadopsi prinsip efisiensi komputasi, keandalan data (</w:t>
+      </w:r>
+      <w:r>
+        <w:rPr>
+          <w:i/>
+        </w:rPr>
+        <w:t>high availability</w:t>
+      </w:r>
+      <w:r>
+        <w:t>), dan kesiapan operasional daring penuh.</w:t>
+      </w:r>
+    </w:p>
+    <w:p>
+      <w:pPr>
+        <w:spacing w:after="40" w:line="240" w:lineRule="auto"/>
+      </w:pPr>
+    </w:p>
+    <w:tbl>
+      <w:tblPr>
+        <w:tblW w:w="0" w:type="auto"/>
+        <w:jc w:val="center"/>
+        <w:tblBorders>
+          <w:top w:val="single" w:sz="4" w:space="0" w:color="CCCCCC"/>
+          <w:left w:val="single" w:sz="4" w:space="0" w:color="CCCCCC"/>
+          <w:bottom w:val="single" w:sz="4" w:space="0" w:color="CCCCCC"/>
+          <w:right w:val="single" w:sz="4" w:space="0" w:color="CCCCCC"/>
+          <w:insideH w:val="single" w:sz="4" w:space="0" w:color="CCCCCC"/>
+          <w:insideV w:val="single" w:sz="4" w:space="0" w:color="CCCCCC"/>
+        </w:tblBorders>
+        <w:tblLayout w:type="fixed"/>
+        <w:tblLook w:val="04A0" w:firstRow="1" w:lastRow="0" w:firstColumn="1" w:lastColumn="0" w:noHBand="0" w:noVBand="1"/>
+      </w:tblPr>
+      <w:tblGrid>
+        <w:gridCol w:w="8957"/>
+      </w:tblGrid>
+      <w:tr>
+        <w:trPr>
+          <w:jc w:val="center"/>
+        </w:trPr>
         <w:tc>
           <w:tcPr>
-            <w:tcW w:w="9" w:type="dxa"/>
+            <w:tcW w:w="8957" w:type="dxa"/>
+            <w:shd w:val="clear" w:color="auto" w:fill="FAFAFA"/>
             <w:tcMar>
-              <w:top w:w="30" w:type="dxa"/>
+              <w:top w:w="40" w:type="dxa"/>
               <w:left w:w="60" w:type="dxa"/>
-              <w:bottom w:w="30" w:type="dxa"/>
+              <w:bottom w:w="40" w:type="dxa"/>
               <w:right w:w="60" w:type="dxa"/>
             </w:tcMar>
           </w:tcPr>
@@ -2273,27 +2819,625 @@
             </w:pPr>
             <w:r>
               <w:rPr>
-                <w:rFonts w:ascii="Times New Roman" w:hAnsi="Times New Roman"/>
-                <w:color w:val="000000"/>
-                <w:sz w:val="19"/>
+                <w:rFonts w:ascii="Consolas" w:hAnsi="Consolas"/>
+                <w:color w:val="18181B"/>
+                <w:sz w:val="16"/>
               </w:rPr>
-              <w:t>Inspirasi sistem desain editorial minimalis dan palet warna light mode netral.</w:t>
+              <w:t>┌────────────────────────────────────────────────────────┐</w:t>
+            </w:r>
+            <w:r>
+              <w:rPr>
+                <w:rFonts w:ascii="Consolas" w:hAnsi="Consolas"/>
+                <w:color w:val="18181B"/>
+                <w:sz w:val="16"/>
+              </w:rPr>
+              <w:br/>
+              <w:t>│                   CLIENT LAYER (SPA)                   │</w:t>
+            </w:r>
+            <w:r>
+              <w:rPr>
+                <w:rFonts w:ascii="Consolas" w:hAnsi="Consolas"/>
+                <w:color w:val="18181B"/>
+                <w:sz w:val="16"/>
+              </w:rPr>
+              <w:br/>
+              <w:t>│      React 18 + Vite + Tailwind CSS + Lucide React     │</w:t>
+            </w:r>
+            <w:r>
+              <w:rPr>
+                <w:rFonts w:ascii="Consolas" w:hAnsi="Consolas"/>
+                <w:color w:val="18181B"/>
+                <w:sz w:val="16"/>
+              </w:rPr>
+              <w:br/>
+              <w:t>│      Hosted on Vercel Edge Global Content Delivery     │</w:t>
+            </w:r>
+            <w:r>
+              <w:rPr>
+                <w:rFonts w:ascii="Consolas" w:hAnsi="Consolas"/>
+                <w:color w:val="18181B"/>
+                <w:sz w:val="16"/>
+              </w:rPr>
+              <w:br/>
+              <w:t>└───────────────────────────┬────────────────────────────┘</w:t>
+            </w:r>
+            <w:r>
+              <w:rPr>
+                <w:rFonts w:ascii="Consolas" w:hAnsi="Consolas"/>
+                <w:color w:val="18181B"/>
+                <w:sz w:val="16"/>
+              </w:rPr>
+              <w:br/>
+              <w:t xml:space="preserve">                            │ HTTPS REST API</w:t>
+            </w:r>
+            <w:r>
+              <w:rPr>
+                <w:rFonts w:ascii="Consolas" w:hAnsi="Consolas"/>
+                <w:color w:val="18181B"/>
+                <w:sz w:val="16"/>
+              </w:rPr>
+              <w:br/>
+              <w:t xml:space="preserve">                            ▼</w:t>
+            </w:r>
+            <w:r>
+              <w:rPr>
+                <w:rFonts w:ascii="Consolas" w:hAnsi="Consolas"/>
+                <w:color w:val="18181B"/>
+                <w:sz w:val="16"/>
+              </w:rPr>
+              <w:br/>
+              <w:t>┌────────────────────────────────────────────────────────┐</w:t>
+            </w:r>
+            <w:r>
+              <w:rPr>
+                <w:rFonts w:ascii="Consolas" w:hAnsi="Consolas"/>
+                <w:color w:val="18181B"/>
+                <w:sz w:val="16"/>
+              </w:rPr>
+              <w:br/>
+            </w:r>
+            <w:r>
+              <w:rPr>
+                <w:rFonts w:ascii="Consolas" w:hAnsi="Consolas"/>
+                <w:color w:val="18181B"/>
+                <w:sz w:val="16"/>
+              </w:rPr>
+              <w:t>│                  BACKEND ENGINE LAYER                  │</w:t>
+            </w:r>
+            <w:r>
+              <w:rPr>
+                <w:rFonts w:ascii="Consolas" w:hAnsi="Consolas"/>
+                <w:color w:val="18181B"/>
+                <w:sz w:val="16"/>
+              </w:rPr>
+              <w:br/>
+              <w:t>│       Python 3.12 + FastAPI Async Web Framework        │</w:t>
+            </w:r>
+            <w:r>
+              <w:rPr>
+                <w:rFonts w:ascii="Consolas" w:hAnsi="Consolas"/>
+                <w:color w:val="18181B"/>
+                <w:sz w:val="16"/>
+              </w:rPr>
+              <w:br/>
+              <w:t>│    Deployed on Ubuntu VPS via Nginx + Let's Encrypt    │</w:t>
+            </w:r>
+            <w:r>
+              <w:rPr>
+                <w:rFonts w:ascii="Consolas" w:hAnsi="Consolas"/>
+                <w:color w:val="18181B"/>
+                <w:sz w:val="16"/>
+              </w:rPr>
+              <w:br/>
+              <w:t>└─────────────┬────────────────────────────┬─────────────┘</w:t>
+            </w:r>
+            <w:r>
+              <w:rPr>
+                <w:rFonts w:ascii="Consolas" w:hAnsi="Consolas"/>
+                <w:color w:val="18181B"/>
+                <w:sz w:val="16"/>
+              </w:rPr>
+              <w:br/>
+              <w:t xml:space="preserve">              │                            │</w:t>
+            </w:r>
+            <w:r>
+              <w:rPr>
+                <w:rFonts w:ascii="Consolas" w:hAnsi="Consolas"/>
+                <w:color w:val="18181B"/>
+                <w:sz w:val="16"/>
+              </w:rPr>
+              <w:br/>
+              <w:t xml:space="preserve">              ▼                            ▼</w:t>
+            </w:r>
+            <w:r>
+              <w:rPr>
+                <w:rFonts w:ascii="Consolas" w:hAnsi="Consolas"/>
+                <w:color w:val="18181B"/>
+                <w:sz w:val="16"/>
+              </w:rPr>
+              <w:br/>
+              <w:t>┌──────────────────────────┐  ┌──────────────────────────┐</w:t>
+            </w:r>
+            <w:r>
+              <w:rPr>
+                <w:rFonts w:ascii="Consolas" w:hAnsi="Consolas"/>
+                <w:color w:val="18181B"/>
+                <w:sz w:val="16"/>
+              </w:rPr>
+              <w:br/>
+              <w:t>│   AI INFERENCE ENGINE    │  │     PERSISTENCE DATA     │</w:t>
+            </w:r>
+            <w:r>
+              <w:rPr>
+                <w:rFonts w:ascii="Consolas" w:hAnsi="Consolas"/>
+                <w:color w:val="18181B"/>
+                <w:sz w:val="16"/>
+              </w:rPr>
+              <w:br/>
+              <w:t>│  9Router Proxy (v1 API)  │  │  MariaDB Enterprise RDBMS │</w:t>
+            </w:r>
+            <w:r>
+              <w:rPr>
+                <w:rFonts w:ascii="Consolas" w:hAnsi="Consolas"/>
+                <w:color w:val="18181B"/>
+                <w:sz w:val="16"/>
+              </w:rPr>
+              <w:br/>
+            </w:r>
+            <w:r>
+              <w:rPr>
+                <w:rFonts w:ascii="Consolas" w:hAnsi="Consolas"/>
+                <w:color w:val="18181B"/>
+                <w:sz w:val="16"/>
+              </w:rPr>
+              <w:t>│  ag/gemini-3.7-flash-med │  │  Structured Relational DB│</w:t>
+            </w:r>
+            <w:r>
+              <w:rPr>
+                <w:rFonts w:ascii="Consolas" w:hAnsi="Consolas"/>
+                <w:color w:val="18181B"/>
+                <w:sz w:val="16"/>
+              </w:rPr>
+              <w:br/>
+              <w:t>└──────────────────────────┘  └──────────────────────────┘</w:t>
             </w:r>
           </w:p>
         </w:tc>
       </w:tr>
+    </w:tbl>
+    <w:p>
+      <w:pPr>
+        <w:spacing w:after="40" w:line="240" w:lineRule="auto"/>
+      </w:pPr>
+    </w:p>
+    <w:p>
+      <w:pPr>
+        <w:keepNext/>
+        <w:spacing w:before="80" w:after="30"/>
+      </w:pPr>
+      <w:r>
+        <w:rPr>
+          <w:b/>
+        </w:rPr>
+        <w:t>6.1 Rincian Tech Stack</w:t>
+      </w:r>
+    </w:p>
+    <w:p>
+      <w:pPr>
+        <w:spacing w:after="20"/>
+        <w:ind w:left="360" w:hanging="288"/>
+        <w:jc w:val="both"/>
+      </w:pPr>
+      <w:r>
+        <w:t xml:space="preserve">•  </w:t>
+      </w:r>
+      <w:r>
+        <w:rPr>
+          <w:b/>
+        </w:rPr>
+        <w:t>Frontend Layer:</w:t>
+      </w:r>
+    </w:p>
+    <w:p>
+      <w:pPr>
+        <w:spacing w:after="20"/>
+        <w:ind w:left="360" w:hanging="288"/>
+        <w:jc w:val="both"/>
+      </w:pPr>
+      <w:r>
+        <w:t xml:space="preserve">•  </w:t>
+      </w:r>
+      <w:r>
+        <w:rPr>
+          <w:b/>
+        </w:rPr>
+        <w:t>React 18 + Vite:</w:t>
+      </w:r>
+      <w:r>
+        <w:t xml:space="preserve"> Menghasilkan Single Page Application (SPA) yang sangat ringan (&lt;90KB gzip), responsif di perangkat seluler dengan render instan.</w:t>
+      </w:r>
+    </w:p>
+    <w:p>
+      <w:pPr>
+        <w:spacing w:after="20"/>
+        <w:ind w:left="360" w:hanging="288"/>
+        <w:jc w:val="both"/>
+      </w:pPr>
+      <w:r>
+        <w:t xml:space="preserve">•  </w:t>
+      </w:r>
+      <w:r>
+        <w:rPr>
+          <w:b/>
+        </w:rPr>
+        <w:t>Tailwind CSS &amp; Editorial UI:</w:t>
+      </w:r>
+      <w:r>
+        <w:t xml:space="preserve"> Desain antarmuka modern bernuansa </w:t>
+      </w:r>
+      <w:r>
+        <w:rPr>
+          <w:i/>
+        </w:rPr>
+        <w:t>clean light mode</w:t>
+      </w:r>
+      <w:r>
+        <w:t xml:space="preserve"> editorial (palet warna Stone/Slate/Zinc netral tanpa elemen generik AI-slop), tipografi hierarkis jelas, dan komponen aksesibel.</w:t>
+      </w:r>
+    </w:p>
+    <w:p>
+      <w:pPr>
+        <w:spacing w:after="20"/>
+        <w:ind w:left="360" w:hanging="288"/>
+        <w:jc w:val="both"/>
+      </w:pPr>
+      <w:r>
+        <w:t xml:space="preserve">•  </w:t>
+      </w:r>
+      <w:r>
+        <w:rPr>
+          <w:b/>
+        </w:rPr>
+        <w:t>React State Hooks &amp; Axios:</w:t>
+      </w:r>
+      <w:r>
+        <w:t xml:space="preserve"> Pengelolaan state interaktif efisien dan komunikasi asinkronus ke server backend.</w:t>
+      </w:r>
+    </w:p>
+    <w:p>
+      <w:pPr>
+        <w:spacing w:after="20"/>
+        <w:ind w:left="360" w:hanging="288"/>
+        <w:jc w:val="both"/>
+      </w:pPr>
+      <w:r>
+        <w:t xml:space="preserve">•  </w:t>
+      </w:r>
+      <w:r>
+        <w:rPr>
+          <w:b/>
+        </w:rPr>
+        <w:t>Backend Layer:</w:t>
+      </w:r>
+    </w:p>
+    <w:p>
+      <w:pPr>
+        <w:spacing w:after="20"/>
+        <w:ind w:left="360" w:hanging="288"/>
+        <w:jc w:val="both"/>
+      </w:pPr>
+      <w:r>
+        <w:t xml:space="preserve">•  </w:t>
+      </w:r>
+      <w:r>
+        <w:rPr>
+          <w:b/>
+        </w:rPr>
+        <w:t>FastAPI (Python 3.12):</w:t>
+      </w:r>
+      <w:r>
+        <w:t xml:space="preserve"> Framework backend asinkronus dengan latensi transmisi rendah, validasi skema otomatis via </w:t>
+      </w:r>
+      <w:r>
+        <w:rPr>
+          <w:i/>
+        </w:rPr>
+        <w:t>Pydantic v2</w:t>
+      </w:r>
+      <w:r>
+        <w:t>, serta dokumentasi interaktif OpenAPI/Swagger.</w:t>
+      </w:r>
+    </w:p>
+    <w:p>
+      <w:pPr>
+        <w:spacing w:after="20"/>
+        <w:ind w:left="360" w:hanging="288"/>
+        <w:jc w:val="both"/>
+      </w:pPr>
+      <w:r>
+        <w:t xml:space="preserve">•  </w:t>
+      </w:r>
+      <w:r>
+        <w:rPr>
+          <w:b/>
+        </w:rPr>
+        <w:t>aiomysql:</w:t>
+      </w:r>
+      <w:r>
+        <w:t xml:space="preserve"> Driver non-blocking asinkron untuk operasi basis data berkecepatan tinggi.</w:t>
+      </w:r>
+    </w:p>
+    <w:p>
+      <w:pPr>
+        <w:spacing w:after="20"/>
+        <w:ind w:left="360" w:hanging="288"/>
+        <w:jc w:val="both"/>
+      </w:pPr>
+      <w:r>
+        <w:t xml:space="preserve">•  </w:t>
+      </w:r>
+      <w:r>
+        <w:rPr>
+          <w:b/>
+        </w:rPr>
+        <w:t>Database &amp; Storage Layer:</w:t>
+      </w:r>
+    </w:p>
+    <w:p>
+      <w:pPr>
+        <w:spacing w:after="20"/>
+        <w:ind w:left="360" w:hanging="288"/>
+        <w:jc w:val="both"/>
+      </w:pPr>
+      <w:r>
+        <w:t xml:space="preserve">•  </w:t>
+      </w:r>
+      <w:r>
+        <w:rPr>
+          <w:b/>
+        </w:rPr>
+        <w:t>MariaDB 10.x:</w:t>
+      </w:r>
+      <w:r>
+        <w:t xml:space="preserve"> Penyimpanan relasional skema terstruktur (</w:t>
+      </w:r>
+      <w:r>
+        <w:rPr>
+          <w:rFonts w:ascii="Consolas" w:hAnsi="Consolas"/>
+          <w:sz w:val="20"/>
+        </w:rPr>
+        <w:t>sessions</w:t>
+      </w:r>
+      <w:r>
+        <w:t xml:space="preserve">, </w:t>
+      </w:r>
+      <w:r>
+        <w:rPr>
+          <w:rFonts w:ascii="Consolas" w:hAnsi="Consolas"/>
+          <w:sz w:val="20"/>
+        </w:rPr>
+        <w:t>tasks</w:t>
+      </w:r>
+      <w:r>
+        <w:t xml:space="preserve">, </w:t>
+      </w:r>
+      <w:r>
+        <w:rPr>
+          <w:rFonts w:ascii="Consolas" w:hAnsi="Consolas"/>
+          <w:sz w:val="20"/>
+        </w:rPr>
+        <w:t>subtasks</w:t>
+      </w:r>
+      <w:r>
+        <w:t xml:space="preserve">, </w:t>
+      </w:r>
+      <w:r>
+        <w:rPr>
+          <w:rFonts w:ascii="Consolas" w:hAnsi="Consolas"/>
+          <w:sz w:val="20"/>
+        </w:rPr>
+        <w:t>pomodoro_sessions</w:t>
+      </w:r>
+      <w:r>
+        <w:t>) yang mendukung integritas data penuh (</w:t>
+      </w:r>
+      <w:r>
+        <w:rPr>
+          <w:i/>
+        </w:rPr>
+        <w:t>ACID compliant</w:t>
+      </w:r>
+      <w:r>
+        <w:t>).</w:t>
+      </w:r>
+    </w:p>
+    <w:p>
+      <w:pPr>
+        <w:spacing w:after="20"/>
+        <w:ind w:left="360" w:hanging="288"/>
+        <w:jc w:val="both"/>
+      </w:pPr>
+      <w:r>
+        <w:t xml:space="preserve">•  </w:t>
+      </w:r>
+      <w:r>
+        <w:rPr>
+          <w:b/>
+        </w:rPr>
+        <w:t>Browser LocalStorage:</w:t>
+      </w:r>
+      <w:r>
+        <w:t xml:space="preserve"> Lapisan persistensi lokal sekunder untuk menjamin data tugas tetap dapat diakses pengguna Guest bahkan saat luring (</w:t>
+      </w:r>
+      <w:r>
+        <w:rPr>
+          <w:i/>
+        </w:rPr>
+        <w:t>offline capability</w:t>
+      </w:r>
+      <w:r>
+        <w:t>).</w:t>
+      </w:r>
+    </w:p>
+    <w:p>
+      <w:pPr>
+        <w:spacing w:after="20"/>
+        <w:ind w:left="360" w:hanging="288"/>
+        <w:jc w:val="both"/>
+      </w:pPr>
+      <w:r>
+        <w:t xml:space="preserve">•  </w:t>
+      </w:r>
+      <w:r>
+        <w:rPr>
+          <w:b/>
+        </w:rPr>
+        <w:t>Infrastruktur &amp; Delivery:</w:t>
+      </w:r>
+    </w:p>
+    <w:p>
+      <w:pPr>
+        <w:spacing w:after="20"/>
+        <w:ind w:left="360" w:hanging="288"/>
+        <w:jc w:val="both"/>
+      </w:pPr>
+      <w:r>
+        <w:t xml:space="preserve">•  </w:t>
+      </w:r>
+      <w:r>
+        <w:rPr>
+          <w:b/>
+        </w:rPr>
+        <w:t>Nginx Reverse Proxy &amp; SSL Let's Encrypt:</w:t>
+      </w:r>
+      <w:r>
+        <w:t xml:space="preserve"> Jalur transmisi aman HTTPS berkecepatan tinggi pada domain </w:t>
+      </w:r>
+      <w:r>
+        <w:rPr>
+          <w:rFonts w:ascii="Consolas" w:hAnsi="Consolas"/>
+          <w:sz w:val="20"/>
+        </w:rPr>
+        <w:t>api-kilastugas.najmifaza.my.id</w:t>
+      </w:r>
+      <w:r>
+        <w:t xml:space="preserve"> dengan manajemen service </w:t>
+      </w:r>
+      <w:r>
+        <w:rPr>
+          <w:rFonts w:ascii="Consolas" w:hAnsi="Consolas"/>
+          <w:sz w:val="20"/>
+        </w:rPr>
+        <w:t>systemd</w:t>
+      </w:r>
+      <w:r>
+        <w:t xml:space="preserve"> terisolasi.</w:t>
+      </w:r>
+    </w:p>
+    <w:p>
+      <w:pPr>
+        <w:spacing w:after="20"/>
+        <w:ind w:left="360" w:hanging="288"/>
+        <w:jc w:val="both"/>
+      </w:pPr>
+      <w:r>
+        <w:t xml:space="preserve">•  </w:t>
+      </w:r>
+      <w:r>
+        <w:rPr>
+          <w:b/>
+        </w:rPr>
+        <w:t>Vercel Global Edge Network:</w:t>
+      </w:r>
+      <w:r>
+        <w:t xml:space="preserve"> Menjamin ketersediaan web aplikasi 99.9% di seluruh jaringan internet Indonesia (</w:t>
+      </w:r>
+      <w:r>
+        <w:rPr>
+          <w:rFonts w:ascii="Consolas" w:hAnsi="Consolas"/>
+          <w:sz w:val="20"/>
+        </w:rPr>
+        <w:t>kilastugas.vercel.app</w:t>
+      </w:r>
+      <w:r>
+        <w:t>).</w:t>
+      </w:r>
+    </w:p>
+    <w:p>
+      <w:pPr>
+        <w:keepNext/>
+        <w:spacing w:before="120" w:after="30"/>
+      </w:pPr>
+      <w:r>
+        <w:rPr>
+          <w:b/>
+          <w:sz w:val="23"/>
+        </w:rPr>
+        <w:t>7. AI Usage Declaration (Deklarasi Penggunaan AI)</w:t>
+      </w:r>
+    </w:p>
+    <w:p>
+      <w:pPr>
+        <w:spacing w:after="40"/>
+        <w:jc w:val="both"/>
+      </w:pPr>
+      <w:r>
+        <w:t xml:space="preserve">Sesuai ketentuan integritas kompetisi pada </w:t>
+      </w:r>
+      <w:r>
+        <w:rPr>
+          <w:b/>
+        </w:rPr>
+        <w:t>Bab 5.3 &amp; Bab 5.6 Guidebook SIFest Digital Innovation Challenge 2026</w:t>
+      </w:r>
+      <w:r>
+        <w:t>, tim mendeklarasikan pemanfaatan kecerdasan buatan (</w:t>
+      </w:r>
+      <w:r>
+        <w:rPr>
+          <w:i/>
+        </w:rPr>
+        <w:t>Artificial Intelligence</w:t>
+      </w:r>
+      <w:r>
+        <w:t>) secara jujur dan transparan:</w:t>
+      </w:r>
+    </w:p>
+    <w:p>
+      <w:pPr>
+        <w:spacing w:after="40" w:line="240" w:lineRule="auto"/>
+      </w:pPr>
+    </w:p>
+    <w:tbl>
+      <w:tblPr>
+        <w:tblW w:w="0" w:type="auto"/>
+        <w:jc w:val="center"/>
+        <w:tblBorders>
+          <w:top w:val="single" w:sz="4" w:space="0" w:color="CCCCCC"/>
+          <w:left w:val="single" w:sz="4" w:space="0" w:color="CCCCCC"/>
+          <w:bottom w:val="single" w:sz="4" w:space="0" w:color="CCCCCC"/>
+          <w:right w:val="single" w:sz="4" w:space="0" w:color="CCCCCC"/>
+          <w:insideH w:val="single" w:sz="4" w:space="0" w:color="CCCCCC"/>
+          <w:insideV w:val="single" w:sz="4" w:space="0" w:color="CCCCCC"/>
+        </w:tblBorders>
+        <w:tblLayout w:type="fixed"/>
+        <w:tblLook w:val="04A0" w:firstRow="1" w:lastRow="0" w:firstColumn="1" w:lastColumn="0" w:noHBand="0" w:noVBand="1"/>
+      </w:tblPr>
+      <w:tblGrid>
+        <w:gridCol w:w="8957"/>
+      </w:tblGrid>
       <w:tr>
         <w:trPr>
-          <w:cantSplit/>
           <w:jc w:val="center"/>
         </w:trPr>
         <w:tc>
           <w:tcPr>
-            <w:tcW w:w="5" w:type="dxa"/>
+            <w:tcW w:w="8957" w:type="dxa"/>
+            <w:shd w:val="clear" w:color="auto" w:fill="FAFAFA"/>
             <w:tcMar>
-              <w:top w:w="30" w:type="dxa"/>
+              <w:top w:w="40" w:type="dxa"/>
               <w:left w:w="60" w:type="dxa"/>
-              <w:bottom w:w="30" w:type="dxa"/>
+              <w:bottom w:w="40" w:type="dxa"/>
               <w:right w:w="60" w:type="dxa"/>
             </w:tcMar>
           </w:tcPr>
@@ -2303,36 +3447,203 @@
             </w:pPr>
             <w:r>
               <w:rPr>
-                <w:rFonts w:ascii="Times New Roman" w:hAnsi="Times New Roman"/>
-                <w:b/>
-                <w:color w:val="000000"/>
-                <w:sz w:val="19"/>
+                <w:rFonts w:ascii="Consolas" w:hAnsi="Consolas"/>
+                <w:color w:val="18181B"/>
+                <w:sz w:val="16"/>
               </w:rPr>
-              <w:t>Batasan Integritas Tim (Karya Asli)</w:t>
+              <w:t>┌──────────────────────────────────────────────────────────────────────────┐</w:t>
             </w:r>
-          </w:p>
-        </w:tc>
-        <w:tc>
-          <w:tcPr>
-            <w:tcW w:w="9" w:type="dxa"/>
-            <w:tcMar>
-              <w:top w:w="30" w:type="dxa"/>
-              <w:left w:w="60" w:type="dxa"/>
-              <w:bottom w:w="30" w:type="dxa"/>
-              <w:right w:w="60" w:type="dxa"/>
-            </w:tcMar>
-          </w:tcPr>
-          <w:p>
-            <w:pPr>
-              <w:spacing w:after="0" w:line="240" w:lineRule="auto"/>
-            </w:pPr>
             <w:r>
               <w:rPr>
-                <w:rFonts w:ascii="Times New Roman" w:hAnsi="Times New Roman"/>
-                <w:color w:val="000000"/>
-                <w:sz w:val="19"/>
+                <w:rFonts w:ascii="Consolas" w:hAnsi="Consolas"/>
+                <w:color w:val="18181B"/>
+                <w:sz w:val="16"/>
               </w:rPr>
-              <w:t>100% ideasi solusi, perancangan arsitektur, penyusunan instrumen riset empiris 28 responden, analisis triangulasi masalah, serta kode controller dibuat dan dipahami penuh oleh seluruh anggota tim.</w:t>
+              <w:br/>
+              <w:t>│                     DEKLARASI PENGGUNAAN AI (RESMI)                      │</w:t>
+            </w:r>
+            <w:r>
+              <w:rPr>
+                <w:rFonts w:ascii="Consolas" w:hAnsi="Consolas"/>
+                <w:color w:val="18181B"/>
+                <w:sz w:val="16"/>
+              </w:rPr>
+              <w:br/>
+              <w:t>├────────────────────────────────┬─────────────────────────────────────────┤</w:t>
+            </w:r>
+            <w:r>
+              <w:rPr>
+                <w:rFonts w:ascii="Consolas" w:hAnsi="Consolas"/>
+                <w:color w:val="18181B"/>
+                <w:sz w:val="16"/>
+              </w:rPr>
+              <w:br/>
+              <w:t>│ Aspek Pemanfaatan              │ Rincian Pemanfaatan AI                  │</w:t>
+            </w:r>
+            <w:r>
+              <w:rPr>
+                <w:rFonts w:ascii="Consolas" w:hAnsi="Consolas"/>
+                <w:color w:val="18181B"/>
+                <w:sz w:val="16"/>
+              </w:rPr>
+              <w:br/>
+              <w:t>├────────────────────────────────┼─────────────────────────────────────────┤</w:t>
+            </w:r>
+            <w:r>
+              <w:rPr>
+                <w:rFonts w:ascii="Consolas" w:hAnsi="Consolas"/>
+                <w:color w:val="18181B"/>
+                <w:sz w:val="16"/>
+              </w:rPr>
+              <w:br/>
+              <w:t>│ Fitur Runtime Produk           │ 9Router (ag/gemini-3.7-flash-medium)    │</w:t>
+            </w:r>
+            <w:r>
+              <w:rPr>
+                <w:rFonts w:ascii="Consolas" w:hAnsi="Consolas"/>
+                <w:color w:val="18181B"/>
+                <w:sz w:val="16"/>
+              </w:rPr>
+              <w:br/>
+            </w:r>
+            <w:r>
+              <w:rPr>
+                <w:rFonts w:ascii="Consolas" w:hAnsi="Consolas"/>
+                <w:color w:val="18181B"/>
+                <w:sz w:val="16"/>
+              </w:rPr>
+              <w:t>│                                │ Digunakan untuk mentransformasi teks    │</w:t>
+            </w:r>
+            <w:r>
+              <w:rPr>
+                <w:rFonts w:ascii="Consolas" w:hAnsi="Consolas"/>
+                <w:color w:val="18181B"/>
+                <w:sz w:val="16"/>
+              </w:rPr>
+              <w:br/>
+              <w:t>│                                │ instruksi tugas menjadi array sub-tugas │</w:t>
+            </w:r>
+            <w:r>
+              <w:rPr>
+                <w:rFonts w:ascii="Consolas" w:hAnsi="Consolas"/>
+                <w:color w:val="18181B"/>
+                <w:sz w:val="16"/>
+              </w:rPr>
+              <w:br/>
+              <w:t>├────────────────────────────────┼─────────────────────────────────────────┤</w:t>
+            </w:r>
+            <w:r>
+              <w:rPr>
+                <w:rFonts w:ascii="Consolas" w:hAnsi="Consolas"/>
+                <w:color w:val="18181B"/>
+                <w:sz w:val="16"/>
+              </w:rPr>
+              <w:br/>
+              <w:t>│ Bantuan Pengembangan Kode      │ Autocomplete sintaksis boilerplates,     │</w:t>
+            </w:r>
+            <w:r>
+              <w:rPr>
+                <w:rFonts w:ascii="Consolas" w:hAnsi="Consolas"/>
+                <w:color w:val="18181B"/>
+                <w:sz w:val="16"/>
+              </w:rPr>
+              <w:br/>
+              <w:t>│                                │ pengecekan tipe data Pydantic, &amp; regex  │</w:t>
+            </w:r>
+            <w:r>
+              <w:rPr>
+                <w:rFonts w:ascii="Consolas" w:hAnsi="Consolas"/>
+                <w:color w:val="18181B"/>
+                <w:sz w:val="16"/>
+              </w:rPr>
+              <w:br/>
+              <w:t>├────────────────────────────────┼─────────────────────────────────────────┤</w:t>
+            </w:r>
+            <w:r>
+              <w:rPr>
+                <w:rFonts w:ascii="Consolas" w:hAnsi="Consolas"/>
+                <w:color w:val="18181B"/>
+                <w:sz w:val="16"/>
+              </w:rPr>
+              <w:br/>
+            </w:r>
+            <w:r>
+              <w:rPr>
+                <w:rFonts w:ascii="Consolas" w:hAnsi="Consolas"/>
+                <w:color w:val="18181B"/>
+                <w:sz w:val="16"/>
+              </w:rPr>
+              <w:t>│ Perancangan Antarmuka          │ Inspirasi palet warna &amp; komponen UI     │</w:t>
+            </w:r>
+            <w:r>
+              <w:rPr>
+                <w:rFonts w:ascii="Consolas" w:hAnsi="Consolas"/>
+                <w:color w:val="18181B"/>
+                <w:sz w:val="16"/>
+              </w:rPr>
+              <w:br/>
+              <w:t>├────────────────────────────────┼─────────────────────────────────────────┤</w:t>
+            </w:r>
+            <w:r>
+              <w:rPr>
+                <w:rFonts w:ascii="Consolas" w:hAnsi="Consolas"/>
+                <w:color w:val="18181B"/>
+                <w:sz w:val="16"/>
+              </w:rPr>
+              <w:br/>
+              <w:t>│ Batasan Integritas Tim         │ 100% ideasi solusi, perancangan         │</w:t>
+            </w:r>
+            <w:r>
+              <w:rPr>
+                <w:rFonts w:ascii="Consolas" w:hAnsi="Consolas"/>
+                <w:color w:val="18181B"/>
+                <w:sz w:val="16"/>
+              </w:rPr>
+              <w:br/>
+              <w:t>│ (Bagian Murni Karya Tim)       │ arsitektur, penyusunan instrumen riset  │</w:t>
+            </w:r>
+            <w:r>
+              <w:rPr>
+                <w:rFonts w:ascii="Consolas" w:hAnsi="Consolas"/>
+                <w:color w:val="18181B"/>
+                <w:sz w:val="16"/>
+              </w:rPr>
+              <w:br/>
+              <w:t>│                                │ survei, sintesis analisis masalah,      │</w:t>
+            </w:r>
+            <w:r>
+              <w:rPr>
+                <w:rFonts w:ascii="Consolas" w:hAnsi="Consolas"/>
+                <w:color w:val="18181B"/>
+                <w:sz w:val="16"/>
+              </w:rPr>
+              <w:br/>
+              <w:t>│                                │ serta kode controller dibuat &amp; dipahami │</w:t>
+            </w:r>
+            <w:r>
+              <w:rPr>
+                <w:rFonts w:ascii="Consolas" w:hAnsi="Consolas"/>
+                <w:color w:val="18181B"/>
+                <w:sz w:val="16"/>
+              </w:rPr>
+              <w:br/>
+            </w:r>
+            <w:r>
+              <w:rPr>
+                <w:rFonts w:ascii="Consolas" w:hAnsi="Consolas"/>
+                <w:color w:val="18181B"/>
+                <w:sz w:val="16"/>
+              </w:rPr>
+              <w:t>│                                │ penuh oleh seluruh anggota tim.         │</w:t>
+            </w:r>
+            <w:r>
+              <w:rPr>
+                <w:rFonts w:ascii="Consolas" w:hAnsi="Consolas"/>
+                <w:color w:val="18181B"/>
+                <w:sz w:val="16"/>
+              </w:rPr>
+              <w:br/>
+              <w:t>└────────────────────────────────┴─────────────────────────────────────────┘</w:t>
             </w:r>
           </w:p>
         </w:tc>
@@ -2340,28 +3651,35 @@
     </w:tbl>
     <w:p>
       <w:pPr>
-        <w:spacing w:after="40" w:line="269" w:lineRule="auto"/>
-        <w:jc w:val="both"/>
-      </w:pPr>
-      <w:r>
-        <w:rPr>
-          <w:rFonts w:ascii="Times New Roman" w:hAnsi="Times New Roman"/>
-          <w:i/>
-          <w:color w:val="18181B"/>
-        </w:rPr>
-        <w:t>Tim menjamin bahwa AI tidak digunakan untuk memalsukan data empiris, tidak digunakan untuk menjawab pertanyaan juri pada sesi Product Defense, dan seluruh luaran aplikasi dapat dipertanggungjawabkan landasan teknologinya secara mandiri.</w:t>
-      </w:r>
+        <w:spacing w:after="40" w:line="240" w:lineRule="auto"/>
+      </w:pPr>
     </w:p>
     <w:p>
       <w:pPr>
+        <w:spacing w:after="40"/>
+        <w:jc w:val="both"/>
+      </w:pPr>
+      <w:r>
+        <w:t xml:space="preserve">Tim menjamin bahwa AI tidak digunakan untuk memalsukan data empiris, tidak digunakan untuk menjawab pertanyaan juri pada sesi </w:t>
+      </w:r>
+      <w:r>
+        <w:rPr>
+          <w:i/>
+        </w:rPr>
+        <w:t>Product Defense</w:t>
+      </w:r>
+      <w:r>
+        <w:t>, dan seluruh luaran aplikasi dapat dijelaskan landasan teknologinya secara mandiri dan bertanggung jawab.</w:t>
+      </w:r>
+    </w:p>
+    <w:p>
+      <w:pPr>
         <w:keepNext/>
-        <w:spacing w:before="120" w:after="40"/>
+        <w:spacing w:before="120" w:after="30"/>
       </w:pPr>
       <w:r>
         <w:rPr>
-          <w:rFonts w:ascii="Times New Roman" w:hAnsi="Times New Roman"/>
           <w:b/>
-          <w:color w:val="000000"/>
           <w:sz w:val="23"/>
         </w:rPr>
         <w:t>8. Rencana Implementasi &amp; Status Pengembangan Saat Ini</w:t>
@@ -2374,115 +3692,152 @@
       </w:pPr>
       <w:r>
         <w:rPr>
-          <w:rFonts w:ascii="Times New Roman" w:hAnsi="Times New Roman"/>
           <w:b/>
-          <w:color w:val="000000"/>
         </w:rPr>
         <w:t>8.1 Status Progres Saat Ini (100% MVP Online Round Ready)</w:t>
       </w:r>
     </w:p>
     <w:p>
       <w:pPr>
-        <w:spacing w:after="40" w:line="269" w:lineRule="auto"/>
+        <w:spacing w:after="20"/>
+        <w:ind w:left="432" w:hanging="432"/>
         <w:jc w:val="both"/>
       </w:pPr>
       <w:r>
+        <w:t>[√]  Repositori GitHub terkonfigurasi dengan struktur monorepo terstandar (</w:t>
+      </w:r>
+      <w:r>
         <w:rPr>
-          <w:rFonts w:ascii="Times New Roman" w:hAnsi="Times New Roman"/>
-          <w:color w:val="18181B"/>
+          <w:rFonts w:ascii="Consolas" w:hAnsi="Consolas"/>
+          <w:sz w:val="20"/>
         </w:rPr>
-        <w:t>• Repositori GitHub publik terkonfigurasi dengan struktur monorepo terstandar (backend/ &amp; frontend/).</w:t>
+        <w:t>backend/</w:t>
+      </w:r>
+      <w:r>
+        <w:t xml:space="preserve"> &amp; </w:t>
+      </w:r>
+      <w:r>
+        <w:rPr>
+          <w:rFonts w:ascii="Consolas" w:hAnsi="Consolas"/>
+          <w:sz w:val="20"/>
+        </w:rPr>
+        <w:t>frontend/</w:t>
+      </w:r>
+      <w:r>
+        <w:t>).</w:t>
       </w:r>
     </w:p>
     <w:p>
       <w:pPr>
-        <w:spacing w:after="40" w:line="269" w:lineRule="auto"/>
+        <w:spacing w:after="20"/>
+        <w:ind w:left="432" w:hanging="432"/>
         <w:jc w:val="both"/>
       </w:pPr>
       <w:r>
-        <w:rPr>
-          <w:rFonts w:ascii="Times New Roman" w:hAnsi="Times New Roman"/>
-          <w:color w:val="18181B"/>
-        </w:rPr>
-        <w:t>• Antarmuka form input tugas terpadu dengan opsi selektor jumlah langkah kerja (Otomatis AI atau 3–8 langkah).</w:t>
+        <w:t>[√]  Antarmuka Form Input Tugas terpadu dengan opsi custom target langkah (3–8 langkah atau AI otomatis).</w:t>
       </w:r>
     </w:p>
     <w:p>
       <w:pPr>
-        <w:spacing w:after="40" w:line="269" w:lineRule="auto"/>
+        <w:spacing w:after="20"/>
+        <w:ind w:left="432" w:hanging="432"/>
         <w:jc w:val="both"/>
       </w:pPr>
       <w:r>
+        <w:t xml:space="preserve">[√]  Endpoint Backend </w:t>
+      </w:r>
+      <w:r>
         <w:rPr>
-          <w:rFonts w:ascii="Times New Roman" w:hAnsi="Times New Roman"/>
-          <w:color w:val="18181B"/>
+          <w:rFonts w:ascii="Consolas" w:hAnsi="Consolas"/>
+          <w:sz w:val="20"/>
         </w:rPr>
-        <w:t>• Endpoint backend /api/breakdown terintegrasi model AI 9Router, fallback template, dan smart caching.</w:t>
+        <w:t>/api/breakdown</w:t>
+      </w:r>
+      <w:r>
+        <w:t xml:space="preserve"> terintegrasi 9Router AI + Fallback Template + Smart Caching.</w:t>
       </w:r>
     </w:p>
     <w:p>
       <w:pPr>
-        <w:spacing w:after="40" w:line="269" w:lineRule="auto"/>
+        <w:spacing w:after="20"/>
+        <w:ind w:left="432" w:hanging="432"/>
         <w:jc w:val="both"/>
       </w:pPr>
       <w:r>
+        <w:t>[√]  Checklist sub-tugas interaktif harian dengan sinkronisasi dual-layer (</w:t>
+      </w:r>
+      <w:r>
         <w:rPr>
-          <w:rFonts w:ascii="Times New Roman" w:hAnsi="Times New Roman"/>
-          <w:color w:val="18181B"/>
+          <w:rFonts w:ascii="Consolas" w:hAnsi="Consolas"/>
+          <w:sz w:val="20"/>
         </w:rPr>
-        <w:t>• Checklist sub-tugas interaktif harian dengan sinkronisasi dual-layer (localStorage &amp; MariaDB).</w:t>
+        <w:t>localStorage</w:t>
+      </w:r>
+      <w:r>
+        <w:t xml:space="preserve"> &amp; MariaDB).</w:t>
       </w:r>
     </w:p>
     <w:p>
       <w:pPr>
-        <w:spacing w:after="40" w:line="269" w:lineRule="auto"/>
+        <w:spacing w:after="20"/>
+        <w:ind w:left="432" w:hanging="432"/>
         <w:jc w:val="both"/>
       </w:pPr>
       <w:r>
-        <w:rPr>
-          <w:rFonts w:ascii="Times New Roman" w:hAnsi="Times New Roman"/>
-          <w:color w:val="18181B"/>
-        </w:rPr>
-        <w:t>• Engine Pomodoro Focus Mode terpasang dengan persistent background timer, floating pill, dan audio chime.</w:t>
+        <w:t xml:space="preserve">[√]  </w:t>
+      </w:r>
+      <w:r>
+        <w:t>Engine Pomodoro Focus Mode terpasang dengan persistent background timer, floating pill, dan audio chime.</w:t>
       </w:r>
     </w:p>
     <w:p>
       <w:pPr>
-        <w:spacing w:after="40" w:line="269" w:lineRule="auto"/>
+        <w:spacing w:after="20"/>
+        <w:ind w:left="432" w:hanging="432"/>
         <w:jc w:val="both"/>
       </w:pPr>
       <w:r>
+        <w:t>[√]  Ekspor kalender otomatis via RFC 5545 iCalendar (</w:t>
+      </w:r>
+      <w:r>
         <w:rPr>
-          <w:rFonts w:ascii="Times New Roman" w:hAnsi="Times New Roman"/>
-          <w:color w:val="18181B"/>
+          <w:rFonts w:ascii="Consolas" w:hAnsi="Consolas"/>
+          <w:sz w:val="20"/>
         </w:rPr>
-        <w:t>• Ekspor kalender otomatis via RFC 5545 iCalendar (.ics) dan Google Calendar direct intent.</w:t>
+        <w:t>.ics</w:t>
+      </w:r>
+      <w:r>
+        <w:t>) dan Google Calendar direct intent.</w:t>
       </w:r>
     </w:p>
     <w:p>
       <w:pPr>
-        <w:spacing w:after="40" w:line="269" w:lineRule="auto"/>
+        <w:spacing w:after="20"/>
+        <w:ind w:left="432" w:hanging="432"/>
         <w:jc w:val="both"/>
       </w:pPr>
       <w:r>
+        <w:t>[√]  Fitur viral Task Blueprint Sharing (</w:t>
+      </w:r>
+      <w:r>
         <w:rPr>
-          <w:rFonts w:ascii="Times New Roman" w:hAnsi="Times New Roman"/>
-          <w:color w:val="18181B"/>
+          <w:rFonts w:ascii="Consolas" w:hAnsi="Consolas"/>
+          <w:sz w:val="20"/>
         </w:rPr>
-        <w:t>• Fitur viral Task Blueprint Sharing (/p/:id) dengan impor satu detik.</w:t>
+        <w:t>/p/:id</w:t>
+      </w:r>
+      <w:r>
+        <w:t>) dengan impor satu detik.</w:t>
       </w:r>
     </w:p>
     <w:p>
       <w:pPr>
-        <w:spacing w:after="40" w:line="269" w:lineRule="auto"/>
+        <w:spacing w:after="20"/>
+        <w:ind w:left="432" w:hanging="432"/>
         <w:jc w:val="both"/>
       </w:pPr>
       <w:r>
-        <w:rPr>
-          <w:rFonts w:ascii="Times New Roman" w:hAnsi="Times New Roman"/>
-          <w:color w:val="18181B"/>
-        </w:rPr>
-        <w:t>• Video walkthrough demonstrasi produk siap diakses panitia dan dewan juri.</w:t>
+        <w:t>[√]  Video walkthrough demonstrasi produk siap diakses panitia dan juri.</w:t>
       </w:r>
     </w:p>
     <w:p>
@@ -2492,56 +3847,99 @@
       </w:pPr>
       <w:r>
         <w:rPr>
-          <w:rFonts w:ascii="Times New Roman" w:hAnsi="Times New Roman"/>
           <w:b/>
-          <w:color w:val="000000"/>
         </w:rPr>
         <w:t>8.2 Rencana Pengembangan Sesi Grand Final &amp; Roadmap (11 Oktober 2026)</w:t>
       </w:r>
     </w:p>
     <w:p>
       <w:pPr>
-        <w:spacing w:after="40" w:line="269" w:lineRule="auto"/>
+        <w:spacing w:after="20"/>
+        <w:ind w:left="360" w:hanging="288"/>
         <w:jc w:val="both"/>
       </w:pPr>
       <w:r>
         <w:rPr>
-          <w:rFonts w:ascii="Times New Roman" w:hAnsi="Times New Roman"/>
-          <w:color w:val="18181B"/>
+          <w:b/>
         </w:rPr>
-        <w:t>1. Product Sprint Sesi I (09.00–12.00 WIB): Implementasi AI Syllabus &amp; PDF Reader (ekstraksi instruksi modul tugas PDF/DOCX secara nir-ketik) dan pembagian tugas kelompok cerdas (Collaborative Task Split).</w:t>
+        <w:t>1. Product Sprint Sesi I (09.00–12.00 WIB):</w:t>
       </w:r>
     </w:p>
     <w:p>
       <w:pPr>
-        <w:spacing w:after="40" w:line="269" w:lineRule="auto"/>
+        <w:spacing w:after="40"/>
         <w:jc w:val="both"/>
       </w:pPr>
       <w:r>
+        <w:t xml:space="preserve">Implementasi </w:t>
+      </w:r>
+      <w:r>
         <w:rPr>
-          <w:rFonts w:ascii="Times New Roman" w:hAnsi="Times New Roman"/>
-          <w:color w:val="18181B"/>
+          <w:i/>
         </w:rPr>
-        <w:t>2. Product Sprint Sesi II (13.00–15.00 WIB): Implementasi Always-On Web Push Notification berbasis Service Worker dan kapabilitas Progressive Web App (PWA) Offline-First.</w:t>
+        <w:t>AI Syllabus &amp; PDF Reader</w:t>
+      </w:r>
+      <w:r>
+        <w:t xml:space="preserve"> (ekstraksi instruksi modul tugas PDF/DOCX secara nir-ketik) dan pembagian tugas kelompok cerdas (</w:t>
+      </w:r>
+      <w:r>
+        <w:rPr>
+          <w:i/>
+        </w:rPr>
+        <w:t>Collaborative Task Split</w:t>
+      </w:r>
+      <w:r>
+        <w:t>).</w:t>
       </w:r>
     </w:p>
     <w:p>
       <w:pPr>
-        <w:spacing w:after="40" w:line="269" w:lineRule="auto"/>
+        <w:spacing w:after="20"/>
+        <w:ind w:left="360" w:hanging="288"/>
         <w:jc w:val="both"/>
       </w:pPr>
       <w:r>
         <w:rPr>
-          <w:rFonts w:ascii="Times New Roman" w:hAnsi="Times New Roman"/>
-          <w:color w:val="18181B"/>
+          <w:b/>
         </w:rPr>
-        <w:t>3. Demo Day &amp; Product Defense (15.45–18.00 WIB): Live walkthrough end-to-end pemecahan instruksi tugas nyata, import cetak biru tugas antar-mahasiswa, dan pembuktian dampak micro-pacing di hadapan dewan juri.</w:t>
+        <w:t>2. Product Sprint Sesi II (13.00–15.00 WIB):</w:t>
+      </w:r>
+    </w:p>
+    <w:p>
+      <w:pPr>
+        <w:spacing w:after="40"/>
+        <w:jc w:val="both"/>
+      </w:pPr>
+      <w:r>
+        <w:t>Implementasi Always-On Web Push Notification berbasis Service Worker dan kapabilitas Progressive Web App (PWA) Offline-First.</w:t>
+      </w:r>
+    </w:p>
+    <w:p>
+      <w:pPr>
+        <w:spacing w:after="20"/>
+        <w:ind w:left="360" w:hanging="288"/>
+        <w:jc w:val="both"/>
+      </w:pPr>
+      <w:r>
+        <w:rPr>
+          <w:b/>
+        </w:rPr>
+        <w:t>3. Demo Day &amp; Product Defense (15.45–18.00 WIB):</w:t>
+      </w:r>
+    </w:p>
+    <w:p>
+      <w:pPr>
+        <w:spacing w:after="40"/>
+        <w:jc w:val="both"/>
+      </w:pPr>
+      <w:r>
+        <w:t>Live walkthrough end-to-end pemecahan instruksi tugas nyata, import cetak biru tugas antar-mahasiswa, dan pembuktian dampak micro-pacing di hadapan dewan juri.</w:t>
       </w:r>
     </w:p>
     <w:sectPr>
       <w:footerReference w:type="default" r:id="rId9"/>
-      <w:pgSz w:w="11909" w:h="16834"/>
-      <w:pgMar w:top="1296" w:right="1296" w:bottom="1296" w:left="1512" w:header="720" w:footer="720" w:gutter="0"/>
+      <w:pgSz w:w="11906" w:h="16838"/>
+      <w:pgMar w:top="1361" w:right="1361" w:bottom="1361" w:left="1587" w:header="720" w:footer="720" w:gutter="0"/>
       <w:cols w:space="720"/>
       <w:titlePg/>
       <w:docGrid w:linePitch="360"/>
@@ -2802,31 +4200,31 @@
       </w:rPr>
     </w:lvl>
   </w:abstractNum>
-  <w:num w:numId="1" w16cid:durableId="660432774">
+  <w:num w:numId="1" w16cid:durableId="1876848099">
     <w:abstractNumId w:val="8"/>
   </w:num>
-  <w:num w:numId="2" w16cid:durableId="1304774984">
+  <w:num w:numId="2" w16cid:durableId="279798882">
     <w:abstractNumId w:val="6"/>
   </w:num>
-  <w:num w:numId="3" w16cid:durableId="204954950">
+  <w:num w:numId="3" w16cid:durableId="1721704876">
     <w:abstractNumId w:val="5"/>
   </w:num>
-  <w:num w:numId="4" w16cid:durableId="1802263326">
+  <w:num w:numId="4" w16cid:durableId="434860189">
     <w:abstractNumId w:val="4"/>
   </w:num>
-  <w:num w:numId="5" w16cid:durableId="2027902167">
+  <w:num w:numId="5" w16cid:durableId="455561880">
     <w:abstractNumId w:val="7"/>
   </w:num>
-  <w:num w:numId="6" w16cid:durableId="1525747360">
+  <w:num w:numId="6" w16cid:durableId="562834032">
     <w:abstractNumId w:val="3"/>
   </w:num>
-  <w:num w:numId="7" w16cid:durableId="357852828">
+  <w:num w:numId="7" w16cid:durableId="510338666">
     <w:abstractNumId w:val="2"/>
   </w:num>
-  <w:num w:numId="8" w16cid:durableId="1830055403">
+  <w:num w:numId="8" w16cid:durableId="1948000497">
     <w:abstractNumId w:val="1"/>
   </w:num>
-  <w:num w:numId="9" w16cid:durableId="2057119949">
+  <w:num w:numId="9" w16cid:durableId="948008355">
     <w:abstractNumId w:val="0"/>
   </w:num>
 </w:numbering>
@@ -3222,6 +4620,13 @@
     <w:name w:val="Normal"/>
     <w:qFormat/>
     <w:rsid w:val="00FC693F"/>
+    <w:pPr>
+      <w:spacing w:line="269" w:lineRule="auto"/>
+    </w:pPr>
+    <w:rPr>
+      <w:rFonts w:ascii="Times New Roman" w:hAnsi="Times New Roman"/>
+      <w:color w:val="000000"/>
+    </w:rPr>
   </w:style>
   <w:style w:type="paragraph" w:styleId="Heading1">
     <w:name w:val="heading 1"/>

</xml_diff>

<commit_message>
docs: fully align proposal solution pillars and kpi metrics with live features and regenerate pdf
</commit_message>
<xml_diff>
--- a/docs/TimKilasTugas_KilasTugas_ProposalRingkas.docx
+++ b/docs/TimKilasTugas_KilasTugas_ProposalRingkas.docx
@@ -51,7 +51,7 @@
           <w:noProof/>
         </w:rPr>
         <w:drawing>
-          <wp:inline distT="0" distB="0" distL="0" distR="0" wp14:anchorId="0CAB9B5D" wp14:editId="2E73F077">
+          <wp:inline distT="0" distB="0" distL="0" distR="0" wp14:anchorId="47DB504A" wp14:editId="43A400CC">
             <wp:extent cx="1645920" cy="1645920"/>
             <wp:effectExtent l="0" t="0" r="0" b="0"/>
             <wp:docPr id="1" name="Picture 1"/>
@@ -1529,7 +1529,7 @@
                 <w:color w:val="18181B"/>
                 <w:sz w:val="16"/>
               </w:rPr>
-              <w:t>[ Engine KilasTugas: AI Breakdown + Template Fallback ]</w:t>
+              <w:t>[ Engine KilasTugas: AI Breakdown + Smart Cache + Template Fallback ]</w:t>
             </w:r>
             <w:r>
               <w:rPr>
@@ -1565,7 +1565,7 @@
                 <w:sz w:val="16"/>
               </w:rPr>
               <w:br/>
-              <w:t>│               Tiga Pilar Solusi KilasTugas            │</w:t>
+              <w:t>│               Empat Pilar Solusi KilasTugas           │</w:t>
             </w:r>
             <w:r>
               <w:rPr>
@@ -1583,7 +1583,7 @@
                 <w:sz w:val="16"/>
               </w:rPr>
               <w:br/>
-              <w:t>│ 1. Actionable Chunking │ 4–6 sub-tugas konkret harian  │</w:t>
+              <w:t>│ 1. Actionable Chunking │ 3–8 sub-tugas konkret harian  │</w:t>
             </w:r>
             <w:r>
               <w:rPr>
@@ -1601,7 +1601,7 @@
                 <w:sz w:val="16"/>
               </w:rPr>
               <w:br/>
-              <w:t>│ 3. Deep Focus Mode     │ Pomodoro Timer 25/5 terpadu   │</w:t>
+              <w:t>│ 3. Deep Focus Engine   │ Floating Pomodoro Timer 25/5  │</w:t>
             </w:r>
             <w:r>
               <w:rPr>
@@ -1617,6 +1617,15 @@
                 <w:color w:val="18181B"/>
                 <w:sz w:val="16"/>
               </w:rPr>
+              <w:t>│ 4. Blueprint Sharing   │ 1-Click Import Rencana Tugas  │</w:t>
+            </w:r>
+            <w:r>
+              <w:rPr>
+                <w:rFonts w:ascii="Consolas" w:hAnsi="Consolas"/>
+                <w:color w:val="18181B"/>
+                <w:sz w:val="16"/>
+              </w:rPr>
+              <w:br/>
               <w:t>└────────────────────────┴───────────────────────────────┘</w:t>
             </w:r>
           </w:p>
@@ -1650,7 +1659,7 @@
         <w:rPr>
           <w:b/>
         </w:rPr>
-        <w:t>1. Dekomposisi Tugas Terarah Berbasis AI:</w:t>
+        <w:t>1. Dekomposisi Tugas Terarah Berbasis AI &amp; Kustomisasi Langkah:</w:t>
       </w:r>
     </w:p>
     <w:p>
@@ -1659,7 +1668,7 @@
         <w:jc w:val="both"/>
       </w:pPr>
       <w:r>
-        <w:t>Pengguna cukup memasukkan judul, instruksi dosen, mata kuliah, dan tanggal deadline. Mesin inferensi AI membedah instruksi menjadi 4–6 sub-tugas terstruktur. Tiap langkah memuat:</w:t>
+        <w:t>Pengguna cukup memasukkan judul, instruksi dosen, mata kuliah, tanggal deadline, dan opsi pilihan target langkah kerja (Otomatis AI atau 3, 4, 5, 6, 8 langkah). Mesin inferensi AI membedah instruksi secara terstruktur. Tiap langkah memuat:</w:t>
       </w:r>
     </w:p>
     <w:p>
@@ -1669,7 +1678,10 @@
         <w:jc w:val="both"/>
       </w:pPr>
       <w:r>
-        <w:t>•  Judul aksi spesifik (&lt;60 karakter, kata kerja aktif).</w:t>
+        <w:t xml:space="preserve">•  </w:t>
+      </w:r>
+      <w:r>
+        <w:t>Judul aksi spesifik (&lt;60 karakter, kata kerja aktif).</w:t>
       </w:r>
     </w:p>
     <w:p>
@@ -1699,10 +1711,7 @@
         <w:jc w:val="both"/>
       </w:pPr>
       <w:r>
-        <w:t xml:space="preserve">•  </w:t>
-      </w:r>
-      <w:r>
-        <w:t>Target hari pelaksanaan (</w:t>
+        <w:t>•  Target hari pelaksanaan (</w:t>
       </w:r>
       <w:r>
         <w:rPr>
@@ -1724,7 +1733,7 @@
         <w:rPr>
           <w:b/>
         </w:rPr>
-        <w:t>2. Deterministic Fallback Engine (Zero Single Point of Failure):</w:t>
+        <w:t>2. Smart Caching &amp; Deterministic Fallback Engine (Zero Downtime):</w:t>
       </w:r>
     </w:p>
     <w:p>
@@ -1733,7 +1742,7 @@
         <w:jc w:val="both"/>
       </w:pPr>
       <w:r>
-        <w:t>Jika terjadi gangguan jaringan internet atau latensi API, sistem secara otomatis beralih (</w:t>
+        <w:t>Jika tugas serupa pernah dipecah oleh rekan seangkatan, sistem menyajikan cetak biru instan (&lt;20ms, 0 konsumsi token AI). Jika terjadi gangguan koneksi internet, sistem otomatis beralih (</w:t>
       </w:r>
       <w:r>
         <w:rPr>
@@ -1742,7 +1751,7 @@
         <w:t>graceful fallback</w:t>
       </w:r>
       <w:r>
-        <w:t>) ke template kurasi berbasis kategori tugas (</w:t>
+        <w:t>) ke template kurasi kurikulum kategori tugas (</w:t>
       </w:r>
       <w:r>
         <w:rPr>
@@ -1764,7 +1773,7 @@
         <w:rPr>
           <w:b/>
         </w:rPr>
-        <w:t>3. Visual Micro-Pacing &amp; Pacing Bar:</w:t>
+        <w:t>3. Visual Micro-Pacing &amp; Circular Progress Gauge:</w:t>
       </w:r>
     </w:p>
     <w:p>
@@ -1861,7 +1870,7 @@
         <w:rPr>
           <w:b/>
         </w:rPr>
-        <w:t>4. Distraction-Free Focus Mode (Pomodoro Timer Terpadu):</w:t>
+        <w:t>4. Persistent Focus Engine &amp; Floating Mini-Timer:</w:t>
       </w:r>
     </w:p>
     <w:p>
@@ -1870,16 +1879,58 @@
         <w:jc w:val="both"/>
       </w:pPr>
       <w:r>
-        <w:t xml:space="preserve">Tombol </w:t>
+        <w:t xml:space="preserve">Pomodoro Timer (25 menit fokus mendalam, 5 menit istirahat) berjalan persisten di latar belakang aplikasi dengan floating mini-pill di bawah layar, perhitungan akurasi timestamp </w:t>
+      </w:r>
+      <w:r>
+        <w:rPr>
+          <w:rFonts w:ascii="Consolas" w:hAnsi="Consolas"/>
+          <w:sz w:val="20"/>
+        </w:rPr>
+        <w:t>Date.now()</w:t>
+      </w:r>
+      <w:r>
+        <w:t>, countdown di judul tab browser, audio synthesizer Web Audio API, serta notifikasi desktop saat sesi tuntas.</w:t>
+      </w:r>
+    </w:p>
+    <w:p>
+      <w:pPr>
+        <w:spacing w:after="20"/>
+        <w:ind w:left="360" w:hanging="288"/>
+        <w:jc w:val="both"/>
+      </w:pPr>
+      <w:r>
+        <w:rPr>
+          <w:b/>
+        </w:rPr>
+        <w:t>5. Integrasi Kalender Nyata (Google Calendar &amp; RFC 5545 iCalendar):</w:t>
+      </w:r>
+    </w:p>
+    <w:p>
+      <w:pPr>
+        <w:spacing w:after="40"/>
+        <w:jc w:val="both"/>
+      </w:pPr>
+      <w:r>
+        <w:t>Tombol ekspor berkas standar iCalendar (</w:t>
+      </w:r>
+      <w:r>
+        <w:rPr>
+          <w:rFonts w:ascii="Consolas" w:hAnsi="Consolas"/>
+          <w:sz w:val="20"/>
+        </w:rPr>
+        <w:t>.ics</w:t>
+      </w:r>
+      <w:r>
+        <w:t>) dilengkapi alarm pengingat 15 menit otomatis, serta tautan langsung (</w:t>
       </w:r>
       <w:r>
         <w:rPr>
           <w:i/>
         </w:rPr>
-        <w:t>"Mulai Kerjakan"</w:t>
-      </w:r>
-      <w:r>
-        <w:t xml:space="preserve"> pada sub-tugas langsung membuka antarmuka layar penuh fokus Pomodoro (25 menit kerja mendalam, 5 menit istirahat teratur), meminimalisir distraksi media sosial.</w:t>
+        <w:t>direct intent</w:t>
+      </w:r>
+      <w:r>
+        <w:t>) ke Google Calendar di ponsel pintar tanpa perlu input jadwal manual.</w:t>
       </w:r>
     </w:p>
     <w:p>
@@ -1892,7 +1943,29 @@
         <w:rPr>
           <w:b/>
         </w:rPr>
-        <w:t>5. Zero-Barrier Guest Mode:</w:t>
+        <w:t>6. Task Blueprint Sharing (/p/:id) &amp; 1-Click Import:</w:t>
+      </w:r>
+    </w:p>
+    <w:p>
+      <w:pPr>
+        <w:spacing w:after="40"/>
+        <w:jc w:val="both"/>
+      </w:pPr>
+      <w:r>
+        <w:t>Mahasiswa dapat membagikan rencana aksi tugas ke grup kelas melalui tautan unik. Teman sekelas dapat mengimpor seluruh rantai sub-tugas ke jadwal pribadinya dalam 1 detik.</w:t>
+      </w:r>
+    </w:p>
+    <w:p>
+      <w:pPr>
+        <w:spacing w:after="20"/>
+        <w:ind w:left="360" w:hanging="288"/>
+        <w:jc w:val="both"/>
+      </w:pPr>
+      <w:r>
+        <w:rPr>
+          <w:b/>
+        </w:rPr>
+        <w:t>7. Zero-Barrier Guest Mode:</w:t>
       </w:r>
     </w:p>
     <w:p>
@@ -2364,8 +2437,8 @@
         <w:tblLook w:val="04A0" w:firstRow="1" w:lastRow="0" w:firstColumn="1" w:lastColumn="0" w:noHBand="0" w:noVBand="1"/>
       </w:tblPr>
       <w:tblGrid>
-        <w:gridCol w:w="3030"/>
-        <w:gridCol w:w="5927"/>
+        <w:gridCol w:w="2955"/>
+        <w:gridCol w:w="6002"/>
       </w:tblGrid>
       <w:tr>
         <w:trPr>
@@ -2375,7 +2448,7 @@
         </w:trPr>
         <w:tc>
           <w:tcPr>
-            <w:tcW w:w="3030" w:type="dxa"/>
+            <w:tcW w:w="2955" w:type="dxa"/>
             <w:shd w:val="clear" w:color="auto" w:fill="F4F4F5"/>
             <w:tcMar>
               <w:top w:w="30" w:type="dxa"/>
@@ -2400,7 +2473,7 @@
         </w:tc>
         <w:tc>
           <w:tcPr>
-            <w:tcW w:w="5927" w:type="dxa"/>
+            <w:tcW w:w="6002" w:type="dxa"/>
             <w:shd w:val="clear" w:color="auto" w:fill="F4F4F5"/>
             <w:tcMar>
               <w:top w:w="30" w:type="dxa"/>
@@ -2431,7 +2504,7 @@
         </w:trPr>
         <w:tc>
           <w:tcPr>
-            <w:tcW w:w="3030" w:type="dxa"/>
+            <w:tcW w:w="2955" w:type="dxa"/>
             <w:tcMar>
               <w:top w:w="30" w:type="dxa"/>
               <w:left w:w="60" w:type="dxa"/>
@@ -2454,7 +2527,7 @@
         </w:tc>
         <w:tc>
           <w:tcPr>
-            <w:tcW w:w="5927" w:type="dxa"/>
+            <w:tcW w:w="6002" w:type="dxa"/>
             <w:tcMar>
               <w:top w:w="30" w:type="dxa"/>
               <w:left w:w="60" w:type="dxa"/>
@@ -2482,7 +2555,7 @@
         </w:trPr>
         <w:tc>
           <w:tcPr>
-            <w:tcW w:w="3030" w:type="dxa"/>
+            <w:tcW w:w="2955" w:type="dxa"/>
             <w:tcMar>
               <w:top w:w="30" w:type="dxa"/>
               <w:left w:w="60" w:type="dxa"/>
@@ -2505,7 +2578,7 @@
         </w:tc>
         <w:tc>
           <w:tcPr>
-            <w:tcW w:w="5927" w:type="dxa"/>
+            <w:tcW w:w="6002" w:type="dxa"/>
             <w:tcMar>
               <w:top w:w="30" w:type="dxa"/>
               <w:left w:w="60" w:type="dxa"/>
@@ -2546,7 +2619,7 @@
         </w:trPr>
         <w:tc>
           <w:tcPr>
-            <w:tcW w:w="3030" w:type="dxa"/>
+            <w:tcW w:w="2955" w:type="dxa"/>
             <w:tcMar>
               <w:top w:w="30" w:type="dxa"/>
               <w:left w:w="60" w:type="dxa"/>
@@ -2569,7 +2642,7 @@
         </w:tc>
         <w:tc>
           <w:tcPr>
-            <w:tcW w:w="5927" w:type="dxa"/>
+            <w:tcW w:w="6002" w:type="dxa"/>
             <w:tcMar>
               <w:top w:w="30" w:type="dxa"/>
               <w:left w:w="60" w:type="dxa"/>
@@ -2585,20 +2658,7 @@
               <w:rPr>
                 <w:sz w:val="19"/>
               </w:rPr>
-              <w:t xml:space="preserve">Penguraian tugas selesai dalam </w:t>
-            </w:r>
-            <w:r>
-              <w:rPr>
-                <w:b/>
-                <w:sz w:val="19"/>
-              </w:rPr>
-              <w:t>&lt;3 detik</w:t>
-            </w:r>
-            <w:r>
-              <w:rPr>
-                <w:sz w:val="19"/>
-              </w:rPr>
-              <w:t xml:space="preserve"> via model inferensi lokal.</w:t>
+              <w:t>Penguraian tugas instan (&lt;2 detik via 9Router; &lt;20 milidetik via Smart Cache).</w:t>
             </w:r>
           </w:p>
         </w:tc>
@@ -2610,7 +2670,7 @@
         </w:trPr>
         <w:tc>
           <w:tcPr>
-            <w:tcW w:w="3030" w:type="dxa"/>
+            <w:tcW w:w="2955" w:type="dxa"/>
             <w:tcMar>
               <w:top w:w="30" w:type="dxa"/>
               <w:left w:w="60" w:type="dxa"/>
@@ -2633,7 +2693,7 @@
         </w:tc>
         <w:tc>
           <w:tcPr>
-            <w:tcW w:w="5927" w:type="dxa"/>
+            <w:tcW w:w="6002" w:type="dxa"/>
             <w:tcMar>
               <w:top w:w="30" w:type="dxa"/>
               <w:left w:w="60" w:type="dxa"/>
@@ -2656,7 +2716,7 @@
               <w:rPr>
                 <w:sz w:val="19"/>
               </w:rPr>
-              <w:t xml:space="preserve"> berkat dual-engine (AI + Fallback Template).</w:t>
+              <w:t xml:space="preserve"> berkat tri-engine (AI + Smart Cache + Fallback Template).</w:t>
             </w:r>
           </w:p>
         </w:tc>
@@ -2668,7 +2728,7 @@
         </w:trPr>
         <w:tc>
           <w:tcPr>
-            <w:tcW w:w="3030" w:type="dxa"/>
+            <w:tcW w:w="2955" w:type="dxa"/>
             <w:tcMar>
               <w:top w:w="30" w:type="dxa"/>
               <w:left w:w="60" w:type="dxa"/>
@@ -2691,7 +2751,7 @@
         </w:tc>
         <w:tc>
           <w:tcPr>
-            <w:tcW w:w="5927" w:type="dxa"/>
+            <w:tcW w:w="6002" w:type="dxa"/>
             <w:tcMar>
               <w:top w:w="30" w:type="dxa"/>
               <w:left w:w="60" w:type="dxa"/>
@@ -2841,6 +2901,13 @@
                 <w:sz w:val="16"/>
               </w:rPr>
               <w:br/>
+            </w:r>
+            <w:r>
+              <w:rPr>
+                <w:rFonts w:ascii="Consolas" w:hAnsi="Consolas"/>
+                <w:color w:val="18181B"/>
+                <w:sz w:val="16"/>
+              </w:rPr>
               <w:t>│      React 18 + Vite + Tailwind CSS + Lucide React     │</w:t>
             </w:r>
             <w:r>
@@ -2895,13 +2962,6 @@
                 <w:sz w:val="16"/>
               </w:rPr>
               <w:br/>
-            </w:r>
-            <w:r>
-              <w:rPr>
-                <w:rFonts w:ascii="Consolas" w:hAnsi="Consolas"/>
-                <w:color w:val="18181B"/>
-                <w:sz w:val="16"/>
-              </w:rPr>
               <w:t>│                  BACKEND ENGINE LAYER                  │</w:t>
             </w:r>
             <w:r>
@@ -2929,6 +2989,13 @@
                 <w:sz w:val="16"/>
               </w:rPr>
               <w:br/>
+            </w:r>
+            <w:r>
+              <w:rPr>
+                <w:rFonts w:ascii="Consolas" w:hAnsi="Consolas"/>
+                <w:color w:val="18181B"/>
+                <w:sz w:val="16"/>
+              </w:rPr>
               <w:t>└─────────────┬────────────────────────────┬─────────────┘</w:t>
             </w:r>
             <w:r>
@@ -2983,14 +3050,7 @@
                 <w:sz w:val="16"/>
               </w:rPr>
               <w:br/>
-            </w:r>
-            <w:r>
-              <w:rPr>
-                <w:rFonts w:ascii="Consolas" w:hAnsi="Consolas"/>
-                <w:color w:val="18181B"/>
-                <w:sz w:val="16"/>
-              </w:rPr>
-              <w:t>│  ag/gemini-3.7-flash-med │  │  Structured Relational DB│</w:t>
+              <w:t>│  ag/gemini-3.7-flash-med │  │  (Tasks + Smart Cache)   │</w:t>
             </w:r>
             <w:r>
               <w:rPr>
@@ -3248,7 +3308,16 @@
         <w:t>ACID compliant</w:t>
       </w:r>
       <w:r>
-        <w:t>).</w:t>
+        <w:t xml:space="preserve">), sekaligus menjadi basis data </w:t>
+      </w:r>
+      <w:r>
+        <w:rPr>
+          <w:i/>
+        </w:rPr>
+        <w:t>Smart Caching</w:t>
+      </w:r>
+      <w:r>
+        <w:t xml:space="preserve"> cetak biru tugas antar-mahasiswa.</w:t>
       </w:r>
     </w:p>
     <w:p>
@@ -3478,6 +3547,13 @@
                 <w:sz w:val="16"/>
               </w:rPr>
               <w:br/>
+            </w:r>
+            <w:r>
+              <w:rPr>
+                <w:rFonts w:ascii="Consolas" w:hAnsi="Consolas"/>
+                <w:color w:val="18181B"/>
+                <w:sz w:val="16"/>
+              </w:rPr>
               <w:t>│ Aspek Pemanfaatan              │ Rincian Pemanfaatan AI                  │</w:t>
             </w:r>
             <w:r>
@@ -3505,13 +3581,6 @@
                 <w:sz w:val="16"/>
               </w:rPr>
               <w:br/>
-            </w:r>
-            <w:r>
-              <w:rPr>
-                <w:rFonts w:ascii="Consolas" w:hAnsi="Consolas"/>
-                <w:color w:val="18181B"/>
-                <w:sz w:val="16"/>
-              </w:rPr>
               <w:t>│                                │ Digunakan untuk mentransformasi teks    │</w:t>
             </w:r>
             <w:r>
@@ -3539,6 +3608,13 @@
                 <w:sz w:val="16"/>
               </w:rPr>
               <w:br/>
+            </w:r>
+            <w:r>
+              <w:rPr>
+                <w:rFonts w:ascii="Consolas" w:hAnsi="Consolas"/>
+                <w:color w:val="18181B"/>
+                <w:sz w:val="16"/>
+              </w:rPr>
               <w:t>│ Bantuan Pengembangan Kode      │ Autocomplete sintaksis boilerplates,     │</w:t>
             </w:r>
             <w:r>
@@ -3566,13 +3642,6 @@
                 <w:sz w:val="16"/>
               </w:rPr>
               <w:br/>
-            </w:r>
-            <w:r>
-              <w:rPr>
-                <w:rFonts w:ascii="Consolas" w:hAnsi="Consolas"/>
-                <w:color w:val="18181B"/>
-                <w:sz w:val="16"/>
-              </w:rPr>
               <w:t>│ Perancangan Antarmuka          │ Inspirasi palet warna &amp; komponen UI     │</w:t>
             </w:r>
             <w:r>
@@ -3600,6 +3669,13 @@
                 <w:sz w:val="16"/>
               </w:rPr>
               <w:br/>
+            </w:r>
+            <w:r>
+              <w:rPr>
+                <w:rFonts w:ascii="Consolas" w:hAnsi="Consolas"/>
+                <w:color w:val="18181B"/>
+                <w:sz w:val="16"/>
+              </w:rPr>
               <w:t>│ (Bagian Murni Karya Tim)       │ arsitektur, penyusunan instrumen riset  │</w:t>
             </w:r>
             <w:r>
@@ -3627,13 +3703,6 @@
                 <w:sz w:val="16"/>
               </w:rPr>
               <w:br/>
-            </w:r>
-            <w:r>
-              <w:rPr>
-                <w:rFonts w:ascii="Consolas" w:hAnsi="Consolas"/>
-                <w:color w:val="18181B"/>
-                <w:sz w:val="16"/>
-              </w:rPr>
               <w:t>│                                │ penuh oleh seluruh anggota tim.         │</w:t>
             </w:r>
             <w:r>
@@ -3734,7 +3803,10 @@
         <w:jc w:val="both"/>
       </w:pPr>
       <w:r>
-        <w:t>[√]  Antarmuka Form Input Tugas terpadu dengan opsi custom target langkah (3–8 langkah atau AI otomatis).</w:t>
+        <w:t xml:space="preserve">[√]  </w:t>
+      </w:r>
+      <w:r>
+        <w:t>Antarmuka Form Input Tugas terpadu dengan opsi custom target langkah (3–8 langkah atau AI otomatis).</w:t>
       </w:r>
     </w:p>
     <w:p>
@@ -3784,10 +3856,7 @@
         <w:jc w:val="both"/>
       </w:pPr>
       <w:r>
-        <w:t xml:space="preserve">[√]  </w:t>
-      </w:r>
-      <w:r>
-        <w:t>Engine Pomodoro Focus Mode terpasang dengan persistent background timer, floating pill, dan audio chime.</w:t>
+        <w:t>[√]  Engine Pomodoro Focus Mode terpasang dengan persistent background timer, floating pill, dan audio chime.</w:t>
       </w:r>
     </w:p>
     <w:p>
@@ -3817,7 +3886,10 @@
         <w:jc w:val="both"/>
       </w:pPr>
       <w:r>
-        <w:t>[√]  Fitur viral Task Blueprint Sharing (</w:t>
+        <w:t xml:space="preserve">[√]  </w:t>
+      </w:r>
+      <w:r>
+        <w:t>Fitur viral Task Blueprint Sharing (</w:t>
       </w:r>
       <w:r>
         <w:rPr>
@@ -4200,31 +4272,31 @@
       </w:rPr>
     </w:lvl>
   </w:abstractNum>
-  <w:num w:numId="1" w16cid:durableId="1876848099">
+  <w:num w:numId="1" w16cid:durableId="80495859">
     <w:abstractNumId w:val="8"/>
   </w:num>
-  <w:num w:numId="2" w16cid:durableId="279798882">
+  <w:num w:numId="2" w16cid:durableId="461118410">
     <w:abstractNumId w:val="6"/>
   </w:num>
-  <w:num w:numId="3" w16cid:durableId="1721704876">
+  <w:num w:numId="3" w16cid:durableId="2072579279">
     <w:abstractNumId w:val="5"/>
   </w:num>
-  <w:num w:numId="4" w16cid:durableId="434860189">
+  <w:num w:numId="4" w16cid:durableId="1975258296">
     <w:abstractNumId w:val="4"/>
   </w:num>
-  <w:num w:numId="5" w16cid:durableId="455561880">
+  <w:num w:numId="5" w16cid:durableId="1859388146">
     <w:abstractNumId w:val="7"/>
   </w:num>
-  <w:num w:numId="6" w16cid:durableId="562834032">
+  <w:num w:numId="6" w16cid:durableId="1584217842">
     <w:abstractNumId w:val="3"/>
   </w:num>
-  <w:num w:numId="7" w16cid:durableId="510338666">
+  <w:num w:numId="7" w16cid:durableId="2141485152">
     <w:abstractNumId w:val="2"/>
   </w:num>
-  <w:num w:numId="8" w16cid:durableId="1948000497">
+  <w:num w:numId="8" w16cid:durableId="633875658">
     <w:abstractNumId w:val="1"/>
   </w:num>
-  <w:num w:numId="9" w16cid:durableId="948008355">
+  <w:num w:numId="9" w16cid:durableId="1589194433">
     <w:abstractNumId w:val="0"/>
   </w:num>
 </w:numbering>

</xml_diff>

<commit_message>
docs: adjust progress status to ~50% in proposal reflecting future.md roadmap backlog
</commit_message>
<xml_diff>
--- a/docs/TimKilasTugas_KilasTugas_ProposalRingkas.docx
+++ b/docs/TimKilasTugas_KilasTugas_ProposalRingkas.docx
@@ -51,7 +51,7 @@
           <w:noProof/>
         </w:rPr>
         <w:drawing>
-          <wp:inline distT="0" distB="0" distL="0" distR="0" wp14:anchorId="47DB504A" wp14:editId="43A400CC">
+          <wp:inline distT="0" distB="0" distL="0" distR="0" wp14:anchorId="0429C54B" wp14:editId="5182750F">
             <wp:extent cx="1645920" cy="1645920"/>
             <wp:effectExtent l="0" t="0" r="0" b="0"/>
             <wp:docPr id="1" name="Picture 1"/>
@@ -3763,7 +3763,16 @@
         <w:rPr>
           <w:b/>
         </w:rPr>
-        <w:t>8.1 Status Progres Saat Ini (100% MVP Online Round Ready)</w:t>
+        <w:t>8.1 Status Progres Saat Ini (~50% dari Roadmap Menuju Grand Final)</w:t>
+      </w:r>
+    </w:p>
+    <w:p>
+      <w:pPr>
+        <w:spacing w:after="40"/>
+        <w:jc w:val="both"/>
+      </w:pPr>
+      <w:r>
+        <w:t>Saat ini sistem telah menyelesaikan seluruh fondasi MVP fungsional Online Round (fase 1 dari total roadmap pengembangan):</w:t>
       </w:r>
     </w:p>
     <w:p>
@@ -3773,7 +3782,10 @@
         <w:jc w:val="both"/>
       </w:pPr>
       <w:r>
-        <w:t>[√]  Repositori GitHub terkonfigurasi dengan struktur monorepo terstandar (</w:t>
+        <w:t xml:space="preserve">[√]  </w:t>
+      </w:r>
+      <w:r>
+        <w:t>Repositori GitHub terkonfigurasi dengan struktur monorepo terstandar (</w:t>
       </w:r>
       <w:r>
         <w:rPr>
@@ -3803,10 +3815,7 @@
         <w:jc w:val="both"/>
       </w:pPr>
       <w:r>
-        <w:t xml:space="preserve">[√]  </w:t>
-      </w:r>
-      <w:r>
-        <w:t>Antarmuka Form Input Tugas terpadu dengan opsi custom target langkah (3–8 langkah atau AI otomatis).</w:t>
+        <w:t>[√]  Antarmuka Form Input Tugas terpadu dengan opsi custom target langkah (3–8 langkah atau AI otomatis).</w:t>
       </w:r>
     </w:p>
     <w:p>
@@ -3866,7 +3875,10 @@
         <w:jc w:val="both"/>
       </w:pPr>
       <w:r>
-        <w:t>[√]  Ekspor kalender otomatis via RFC 5545 iCalendar (</w:t>
+        <w:t xml:space="preserve">[√]  </w:t>
+      </w:r>
+      <w:r>
+        <w:t>Ekspor kalender otomatis via RFC 5545 iCalendar (</w:t>
       </w:r>
       <w:r>
         <w:rPr>
@@ -3886,10 +3898,7 @@
         <w:jc w:val="both"/>
       </w:pPr>
       <w:r>
-        <w:t xml:space="preserve">[√]  </w:t>
-      </w:r>
-      <w:r>
-        <w:t>Fitur viral Task Blueprint Sharing (</w:t>
+        <w:t>[√]  Fitur viral Task Blueprint Sharing (</w:t>
       </w:r>
       <w:r>
         <w:rPr>
@@ -3900,6 +3909,26 @@
       </w:r>
       <w:r>
         <w:t>) dengan impor satu detik.</w:t>
+      </w:r>
+    </w:p>
+    <w:p>
+      <w:pPr>
+        <w:spacing w:after="20"/>
+        <w:ind w:left="432" w:hanging="432"/>
+        <w:jc w:val="both"/>
+      </w:pPr>
+      <w:r>
+        <w:t xml:space="preserve">[  ]  Implementasi fitur lanjutan sesuai roadmap </w:t>
+      </w:r>
+      <w:r>
+        <w:rPr>
+          <w:rFonts w:ascii="Consolas" w:hAnsi="Consolas"/>
+          <w:sz w:val="20"/>
+        </w:rPr>
+        <w:t>docs/FUTURE.md</w:t>
+      </w:r>
+      <w:r>
+        <w:t xml:space="preserve"> (AI Syllabus &amp; PDF Reader, Collaborative Group Task Split, PWA Offline-First, dan Web Push Notification) yang dialokasikan pada fase Sprint Grand Final.</w:t>
       </w:r>
     </w:p>
     <w:p>
@@ -4272,31 +4301,31 @@
       </w:rPr>
     </w:lvl>
   </w:abstractNum>
-  <w:num w:numId="1" w16cid:durableId="80495859">
+  <w:num w:numId="1" w16cid:durableId="1370109739">
     <w:abstractNumId w:val="8"/>
   </w:num>
-  <w:num w:numId="2" w16cid:durableId="461118410">
+  <w:num w:numId="2" w16cid:durableId="1081174607">
     <w:abstractNumId w:val="6"/>
   </w:num>
-  <w:num w:numId="3" w16cid:durableId="2072579279">
+  <w:num w:numId="3" w16cid:durableId="988098009">
     <w:abstractNumId w:val="5"/>
   </w:num>
-  <w:num w:numId="4" w16cid:durableId="1975258296">
+  <w:num w:numId="4" w16cid:durableId="2056276731">
     <w:abstractNumId w:val="4"/>
   </w:num>
-  <w:num w:numId="5" w16cid:durableId="1859388146">
+  <w:num w:numId="5" w16cid:durableId="87310004">
     <w:abstractNumId w:val="7"/>
   </w:num>
-  <w:num w:numId="6" w16cid:durableId="1584217842">
+  <w:num w:numId="6" w16cid:durableId="118956179">
     <w:abstractNumId w:val="3"/>
   </w:num>
-  <w:num w:numId="7" w16cid:durableId="2141485152">
+  <w:num w:numId="7" w16cid:durableId="1871532946">
     <w:abstractNumId w:val="2"/>
   </w:num>
-  <w:num w:numId="8" w16cid:durableId="633875658">
+  <w:num w:numId="8" w16cid:durableId="1984770393">
     <w:abstractNumId w:val="1"/>
   </w:num>
-  <w:num w:numId="9" w16cid:durableId="1589194433">
+  <w:num w:numId="9" w16cid:durableId="1635521926">
     <w:abstractNumId w:val="0"/>
   </w:num>
 </w:numbering>

</xml_diff>